<commit_message>
archive form function + changed form submissions view from card to table
</commit_message>
<xml_diff>
--- a/apps/Damage_Claim_User_Guide.docx
+++ b/apps/Damage_Claim_User_Guide.docx
@@ -1,21 +1,21 @@
 
 <file path=word/document.xml><?xml version="1.0" encoding="utf-8"?>
-<w:document xmlns:wpc="http://schemas.microsoft.com/office/word/2010/wordprocessingCanvas" xmlns:mc="http://schemas.openxmlformats.org/markup-compatibility/2006" xmlns:o="urn:schemas-microsoft-com:office:office" xmlns:r="http://schemas.openxmlformats.org/officeDocument/2006/relationships" xmlns:m="http://schemas.openxmlformats.org/officeDocument/2006/math" xmlns:v="urn:schemas-microsoft-com:vml" xmlns:wp14="http://schemas.microsoft.com/office/word/2010/wordprocessingDrawing" xmlns:wp="http://schemas.openxmlformats.org/drawingml/2006/wordprocessingDrawing" xmlns:w10="urn:schemas-microsoft-com:office:word" xmlns:w="http://schemas.openxmlformats.org/wordprocessingml/2006/main" xmlns:w14="http://schemas.microsoft.com/office/word/2010/wordml" xmlns:w15="http://schemas.microsoft.com/office/word/2012/wordml" xmlns:wpg="http://schemas.microsoft.com/office/word/2010/wordprocessingGroup" xmlns:wpi="http://schemas.microsoft.com/office/word/2010/wordprocessingInk" xmlns:wne="http://schemas.microsoft.com/office/word/2006/wordml" xmlns:wps="http://schemas.microsoft.com/office/word/2010/wordprocessingShape" xmlns:cx="http://schemas.microsoft.com/office/drawing/2014/chartex" xmlns:cx1="http://schemas.microsoft.com/office/drawing/2015/9/8/chartex" xmlns:cx2="http://schemas.microsoft.com/office/drawing/2015/10/21/chartex" xmlns:cx3="http://schemas.microsoft.com/office/drawing/2016/5/9/chartex" xmlns:cx4="http://schemas.microsoft.com/office/drawing/2016/5/10/chartex" xmlns:cx5="http://schemas.microsoft.com/office/drawing/2016/5/11/chartex" xmlns:cx6="http://schemas.microsoft.com/office/drawing/2016/5/12/chartex" xmlns:cx7="http://schemas.microsoft.com/office/drawing/2016/5/13/chartex" xmlns:cx8="http://schemas.microsoft.com/office/drawing/2016/5/14/chartex" xmlns:aink="http://schemas.microsoft.com/office/drawing/2016/ink" xmlns:am3d="http://schemas.microsoft.com/office/drawing/2017/model3d" xmlns:w16cex="http://schemas.microsoft.com/office/word/2018/wordml/cex" xmlns:w16cid="http://schemas.microsoft.com/office/word/2016/wordml/cid" xmlns:w16="http://schemas.microsoft.com/office/word/2018/wordml" xmlns:w16sdtdh="http://schemas.microsoft.com/office/word/2020/wordml/sdtdatahash" xmlns:w16se="http://schemas.microsoft.com/office/word/2015/wordml/symex" mc:Ignorable="w14 w15 wp14">
+<w:document xmlns:wpc="http://schemas.microsoft.com/office/word/2010/wordprocessingCanvas" xmlns:cx="http://schemas.microsoft.com/office/drawing/2014/chartex" xmlns:cx1="http://schemas.microsoft.com/office/drawing/2015/9/8/chartex" xmlns:cx2="http://schemas.microsoft.com/office/drawing/2015/10/21/chartex" xmlns:cx3="http://schemas.microsoft.com/office/drawing/2016/5/9/chartex" xmlns:cx4="http://schemas.microsoft.com/office/drawing/2016/5/10/chartex" xmlns:cx5="http://schemas.microsoft.com/office/drawing/2016/5/11/chartex" xmlns:cx6="http://schemas.microsoft.com/office/drawing/2016/5/12/chartex" xmlns:cx7="http://schemas.microsoft.com/office/drawing/2016/5/13/chartex" xmlns:cx8="http://schemas.microsoft.com/office/drawing/2016/5/14/chartex" xmlns:mc="http://schemas.openxmlformats.org/markup-compatibility/2006" xmlns:aink="http://schemas.microsoft.com/office/drawing/2016/ink" xmlns:am3d="http://schemas.microsoft.com/office/drawing/2017/model3d" xmlns:o="urn:schemas-microsoft-com:office:office" xmlns:oel="http://schemas.microsoft.com/office/2019/extlst" xmlns:r="http://schemas.openxmlformats.org/officeDocument/2006/relationships" xmlns:m="http://schemas.openxmlformats.org/officeDocument/2006/math" xmlns:v="urn:schemas-microsoft-com:vml" xmlns:wp14="http://schemas.microsoft.com/office/word/2010/wordprocessingDrawing" xmlns:wp="http://schemas.openxmlformats.org/drawingml/2006/wordprocessingDrawing" xmlns:w10="urn:schemas-microsoft-com:office:word" xmlns:w="http://schemas.openxmlformats.org/wordprocessingml/2006/main" xmlns:w14="http://schemas.microsoft.com/office/word/2010/wordml" xmlns:w15="http://schemas.microsoft.com/office/word/2012/wordml" xmlns:w16cex="http://schemas.microsoft.com/office/word/2018/wordml/cex" xmlns:w16cid="http://schemas.microsoft.com/office/word/2016/wordml/cid" xmlns:w16="http://schemas.microsoft.com/office/word/2018/wordml" xmlns:w16du="http://schemas.microsoft.com/office/word/2023/wordml/word16du" xmlns:w16sdtdh="http://schemas.microsoft.com/office/word/2020/wordml/sdtdatahash" xmlns:w16sdtfl="http://schemas.microsoft.com/office/word/2024/wordml/sdtformatlock" xmlns:w16se="http://schemas.microsoft.com/office/word/2015/wordml/symex" xmlns:wpg="http://schemas.microsoft.com/office/word/2010/wordprocessingGroup" xmlns:wpi="http://schemas.microsoft.com/office/word/2010/wordprocessingInk" xmlns:wne="http://schemas.microsoft.com/office/word/2006/wordml" xmlns:wps="http://schemas.microsoft.com/office/word/2010/wordprocessingShape" mc:Ignorable="w14 w15 w16se w16cid w16 w16cex w16sdtdh w16sdtfl w16du wp14">
   <w:body>
     <w:p>
       <w:pPr>
-        <w:spacing w:after="60" w:before="400"/>
+        <w:spacing w:before="400" w:after="60"/>
         <w:jc w:val="center"/>
       </w:pPr>
       <w:r>
         <w:rPr>
           <w:b/>
           <w:bCs/>
-          <w:color w:val="1e2a6b"/>
+          <w:color w:val="1E2A6B"/>
           <w:sz w:val="44"/>
           <w:szCs w:val="44"/>
         </w:rPr>
-        <w:t xml:space="preserve">Splash Car Wash</w:t>
+        <w:t>Splash Car Wash</w:t>
       </w:r>
     </w:p>
     <w:p>
@@ -27,11 +27,31 @@
         <w:rPr>
           <w:b/>
           <w:bCs/>
-          <w:color w:val="2f6fb0"/>
+          <w:color w:val="2F6FB0"/>
           <w:sz w:val="32"/>
           <w:szCs w:val="32"/>
         </w:rPr>
-        <w:t xml:space="preserve">Damage Claim Process</w:t>
+        <w:t xml:space="preserve">Damage Claim </w:t>
+      </w:r>
+      <w:r>
+        <w:rPr>
+          <w:b/>
+          <w:bCs/>
+          <w:color w:val="2F6FB0"/>
+          <w:sz w:val="32"/>
+          <w:szCs w:val="32"/>
+        </w:rPr>
+        <w:t xml:space="preserve">Setup and </w:t>
+      </w:r>
+      <w:r>
+        <w:rPr>
+          <w:b/>
+          <w:bCs/>
+          <w:color w:val="2F6FB0"/>
+          <w:sz w:val="32"/>
+          <w:szCs w:val="32"/>
+        </w:rPr>
+        <w:t>Process</w:t>
       </w:r>
     </w:p>
     <w:p>
@@ -45,23 +65,23 @@
           <w:sz w:val="26"/>
           <w:szCs w:val="26"/>
         </w:rPr>
-        <w:t xml:space="preserve">User Guide</w:t>
+        <w:t>User Guide</w:t>
       </w:r>
     </w:p>
     <w:p>
       <w:pPr>
         <w:pStyle w:val="Heading1"/>
-        <w:spacing w:after="140" w:before="320"/>
+        <w:spacing w:before="320" w:after="140"/>
       </w:pPr>
       <w:r>
         <w:rPr>
           <w:b/>
           <w:bCs/>
-          <w:color w:val="1e2a6b"/>
+          <w:color w:val="1E2A6B"/>
           <w:sz w:val="30"/>
           <w:szCs w:val="30"/>
         </w:rPr>
-        <w:t xml:space="preserve">Section 1 — Claim Form Links by Site</w:t>
+        <w:t>Section 1 — Claim Form Links by Site</w:t>
       </w:r>
     </w:p>
     <w:p>
@@ -69,448 +89,487 @@
         <w:spacing w:after="100"/>
       </w:pPr>
       <w:r>
-        <w:rPr>
-          <w:sz w:val="22"/>
-          <w:szCs w:val="22"/>
-        </w:rPr>
-        <w:t xml:space="preserve">Each Splash location has its own claim form. Use the link for your site.</w:t>
+        <w:t>Each location has its own claim form. Use the link for your site.</w:t>
       </w:r>
     </w:p>
     <w:tbl>
       <w:tblPr>
-        <w:tblW w:type="dxa" w:w="9360"/>
+        <w:tblW w:w="9360" w:type="dxa"/>
         <w:tblBorders>
-          <w:top w:val="single" w:color="auto" w:sz="4"/>
-          <w:left w:val="single" w:color="auto" w:sz="4"/>
-          <w:bottom w:val="single" w:color="auto" w:sz="4"/>
-          <w:right w:val="single" w:color="auto" w:sz="4"/>
-          <w:insideH w:val="single" w:color="auto" w:sz="4"/>
-          <w:insideV w:val="single" w:color="auto" w:sz="4"/>
+          <w:top w:val="single" w:sz="4" w:space="0" w:color="auto"/>
+          <w:left w:val="single" w:sz="4" w:space="0" w:color="auto"/>
+          <w:bottom w:val="single" w:sz="4" w:space="0" w:color="auto"/>
+          <w:right w:val="single" w:sz="4" w:space="0" w:color="auto"/>
+          <w:insideH w:val="single" w:sz="4" w:space="0" w:color="auto"/>
+          <w:insideV w:val="single" w:sz="4" w:space="0" w:color="auto"/>
         </w:tblBorders>
+        <w:tblCellMar>
+          <w:left w:w="10" w:type="dxa"/>
+          <w:right w:w="10" w:type="dxa"/>
+        </w:tblCellMar>
+        <w:tblLook w:val="0000" w:firstRow="0" w:lastRow="0" w:firstColumn="0" w:lastColumn="0" w:noHBand="0" w:noVBand="0"/>
       </w:tblPr>
       <w:tblGrid>
         <w:gridCol w:w="2600"/>
         <w:gridCol w:w="6760"/>
       </w:tblGrid>
       <w:tr>
+        <w:tblPrEx>
+          <w:tblCellMar>
+            <w:top w:w="0" w:type="dxa"/>
+            <w:bottom w:w="0" w:type="dxa"/>
+          </w:tblCellMar>
+        </w:tblPrEx>
         <w:trPr>
           <w:tblHeader/>
         </w:trPr>
         <w:tc>
           <w:tcPr>
-            <w:tcW w:type="dxa" w:w="2600"/>
-            <w:shd w:fill="1e2a6b" w:color="auto" w:val="clear"/>
+            <w:tcW w:w="2600" w:type="dxa"/>
+            <w:shd w:val="clear" w:color="auto" w:fill="1E2A6B"/>
           </w:tcPr>
           <w:p>
             <w:pPr>
-              <w:spacing w:after="40" w:before="40"/>
+              <w:spacing w:before="40" w:after="40"/>
             </w:pPr>
             <w:r>
               <w:rPr>
                 <w:b/>
                 <w:bCs/>
                 <w:color w:val="FFFFFF"/>
-                <w:sz w:val="22"/>
-                <w:szCs w:val="22"/>
               </w:rPr>
-              <w:t xml:space="preserve">Site</w:t>
+              <w:t>Site</w:t>
             </w:r>
           </w:p>
         </w:tc>
         <w:tc>
           <w:tcPr>
-            <w:tcW w:type="dxa" w:w="6760"/>
-            <w:shd w:fill="1e2a6b" w:color="auto" w:val="clear"/>
+            <w:tcW w:w="6760" w:type="dxa"/>
+            <w:shd w:val="clear" w:color="auto" w:fill="1E2A6B"/>
           </w:tcPr>
           <w:p>
             <w:pPr>
-              <w:spacing w:after="40" w:before="40"/>
+              <w:spacing w:before="40" w:after="40"/>
             </w:pPr>
             <w:r>
               <w:rPr>
                 <w:b/>
                 <w:bCs/>
                 <w:color w:val="FFFFFF"/>
-                <w:sz w:val="22"/>
-                <w:szCs w:val="22"/>
               </w:rPr>
-              <w:t xml:space="preserve">Claim Form URL</w:t>
+              <w:t>Claim Form URL</w:t>
             </w:r>
           </w:p>
         </w:tc>
       </w:tr>
       <w:tr>
+        <w:tblPrEx>
+          <w:tblCellMar>
+            <w:top w:w="0" w:type="dxa"/>
+            <w:bottom w:w="0" w:type="dxa"/>
+          </w:tblCellMar>
+        </w:tblPrEx>
         <w:tc>
           <w:tcPr>
-            <w:tcW w:type="dxa" w:w="2600"/>
+            <w:tcW w:w="2600" w:type="dxa"/>
           </w:tcPr>
           <w:p>
             <w:pPr>
-              <w:spacing w:after="40" w:before="40"/>
+              <w:spacing w:before="40" w:after="40"/>
             </w:pPr>
             <w:r>
               <w:rPr>
                 <w:b/>
                 <w:bCs/>
-                <w:sz w:val="22"/>
-                <w:szCs w:val="22"/>
               </w:rPr>
-              <w:t xml:space="preserve">Binghamton</w:t>
+              <w:t>Binghamton</w:t>
             </w:r>
           </w:p>
         </w:tc>
         <w:tc>
           <w:tcPr>
-            <w:tcW w:type="dxa" w:w="6760"/>
+            <w:tcW w:w="6760" w:type="dxa"/>
           </w:tcPr>
           <w:p>
             <w:pPr>
-              <w:spacing w:after="40" w:before="40"/>
+              <w:spacing w:before="40" w:after="40"/>
             </w:pPr>
-            <w:hyperlink w:history="1" r:id="rId19vb2pv-o6dccoquprdjw">
+            <w:hyperlink r:id="rId5" w:history="1">
               <w:r>
                 <w:rPr>
                   <w:rStyle w:val="Hyperlink"/>
                   <w:sz w:val="20"/>
                   <w:szCs w:val="20"/>
                 </w:rPr>
-                <w:t xml:space="preserve">https://splashcarwashes.info/claims/binghamton</w:t>
+                <w:t>https://splashcarwashes.info/claims/binghamton</w:t>
               </w:r>
             </w:hyperlink>
           </w:p>
         </w:tc>
       </w:tr>
       <w:tr>
+        <w:tblPrEx>
+          <w:tblCellMar>
+            <w:top w:w="0" w:type="dxa"/>
+            <w:bottom w:w="0" w:type="dxa"/>
+          </w:tblCellMar>
+        </w:tblPrEx>
         <w:tc>
           <w:tcPr>
-            <w:tcW w:type="dxa" w:w="2600"/>
-            <w:shd w:fill="eef2fb" w:color="auto" w:val="clear"/>
+            <w:tcW w:w="2600" w:type="dxa"/>
+            <w:shd w:val="clear" w:color="auto" w:fill="EEF2FB"/>
           </w:tcPr>
           <w:p>
             <w:pPr>
-              <w:spacing w:after="40" w:before="40"/>
+              <w:spacing w:before="40" w:after="40"/>
             </w:pPr>
             <w:r>
               <w:rPr>
                 <w:b/>
                 <w:bCs/>
-                <w:sz w:val="22"/>
-                <w:szCs w:val="22"/>
               </w:rPr>
-              <w:t xml:space="preserve">Cicero</w:t>
+              <w:t>Cicero</w:t>
             </w:r>
           </w:p>
         </w:tc>
         <w:tc>
           <w:tcPr>
-            <w:tcW w:type="dxa" w:w="6760"/>
-            <w:shd w:fill="eef2fb" w:color="auto" w:val="clear"/>
+            <w:tcW w:w="6760" w:type="dxa"/>
+            <w:shd w:val="clear" w:color="auto" w:fill="EEF2FB"/>
           </w:tcPr>
           <w:p>
             <w:pPr>
-              <w:spacing w:after="40" w:before="40"/>
+              <w:spacing w:before="40" w:after="40"/>
             </w:pPr>
-            <w:hyperlink w:history="1" r:id="rIdb5bio5ze7kevrk1ctfh-p">
+            <w:hyperlink r:id="rId6" w:history="1">
               <w:r>
                 <w:rPr>
                   <w:rStyle w:val="Hyperlink"/>
                   <w:sz w:val="20"/>
                   <w:szCs w:val="20"/>
                 </w:rPr>
-                <w:t xml:space="preserve">https://splashcarwashes.info/claims/cicero</w:t>
+                <w:t>https://splashcarwashes.info/claims/cicero</w:t>
               </w:r>
             </w:hyperlink>
           </w:p>
         </w:tc>
       </w:tr>
       <w:tr>
+        <w:tblPrEx>
+          <w:tblCellMar>
+            <w:top w:w="0" w:type="dxa"/>
+            <w:bottom w:w="0" w:type="dxa"/>
+          </w:tblCellMar>
+        </w:tblPrEx>
         <w:tc>
           <w:tcPr>
-            <w:tcW w:type="dxa" w:w="2600"/>
+            <w:tcW w:w="2600" w:type="dxa"/>
           </w:tcPr>
           <w:p>
             <w:pPr>
-              <w:spacing w:after="40" w:before="40"/>
+              <w:spacing w:before="40" w:after="40"/>
             </w:pPr>
             <w:r>
               <w:rPr>
                 <w:b/>
                 <w:bCs/>
-                <w:sz w:val="22"/>
-                <w:szCs w:val="22"/>
               </w:rPr>
-              <w:t xml:space="preserve">Cortland</w:t>
+              <w:t>Cortland</w:t>
             </w:r>
           </w:p>
         </w:tc>
         <w:tc>
           <w:tcPr>
-            <w:tcW w:type="dxa" w:w="6760"/>
+            <w:tcW w:w="6760" w:type="dxa"/>
           </w:tcPr>
           <w:p>
             <w:pPr>
-              <w:spacing w:after="40" w:before="40"/>
+              <w:spacing w:before="40" w:after="40"/>
             </w:pPr>
-            <w:hyperlink w:history="1" r:id="rIdweu9bpgit-7rs8x7iddef">
+            <w:hyperlink r:id="rId7" w:history="1">
               <w:r>
                 <w:rPr>
                   <w:rStyle w:val="Hyperlink"/>
                   <w:sz w:val="20"/>
                   <w:szCs w:val="20"/>
                 </w:rPr>
-                <w:t xml:space="preserve">https://splashcarwashes.info/claims/cortland</w:t>
+                <w:t>https://splashcarwashes.info/claims/cortland</w:t>
               </w:r>
             </w:hyperlink>
           </w:p>
         </w:tc>
       </w:tr>
       <w:tr>
+        <w:tblPrEx>
+          <w:tblCellMar>
+            <w:top w:w="0" w:type="dxa"/>
+            <w:bottom w:w="0" w:type="dxa"/>
+          </w:tblCellMar>
+        </w:tblPrEx>
         <w:tc>
           <w:tcPr>
-            <w:tcW w:type="dxa" w:w="2600"/>
-            <w:shd w:fill="eef2fb" w:color="auto" w:val="clear"/>
+            <w:tcW w:w="2600" w:type="dxa"/>
+            <w:shd w:val="clear" w:color="auto" w:fill="EEF2FB"/>
           </w:tcPr>
           <w:p>
             <w:pPr>
-              <w:spacing w:after="40" w:before="40"/>
+              <w:spacing w:before="40" w:after="40"/>
             </w:pPr>
             <w:r>
               <w:rPr>
                 <w:b/>
                 <w:bCs/>
-                <w:sz w:val="22"/>
-                <w:szCs w:val="22"/>
               </w:rPr>
-              <w:t xml:space="preserve">Elmira Heights</w:t>
+              <w:t>Elmira Heights</w:t>
             </w:r>
           </w:p>
         </w:tc>
         <w:tc>
           <w:tcPr>
-            <w:tcW w:type="dxa" w:w="6760"/>
-            <w:shd w:fill="eef2fb" w:color="auto" w:val="clear"/>
+            <w:tcW w:w="6760" w:type="dxa"/>
+            <w:shd w:val="clear" w:color="auto" w:fill="EEF2FB"/>
           </w:tcPr>
           <w:p>
             <w:pPr>
-              <w:spacing w:after="40" w:before="40"/>
+              <w:spacing w:before="40" w:after="40"/>
             </w:pPr>
-            <w:hyperlink w:history="1" r:id="rIdj9jsshr-67tqbtgbm-bpk">
+            <w:hyperlink r:id="rId8" w:history="1">
               <w:r>
                 <w:rPr>
                   <w:rStyle w:val="Hyperlink"/>
                   <w:sz w:val="20"/>
                   <w:szCs w:val="20"/>
                 </w:rPr>
-                <w:t xml:space="preserve">https://splashcarwashes.info/claims/elmira_heights</w:t>
+                <w:t>https://splashcarwashes.info/claims/elmira_heights</w:t>
               </w:r>
             </w:hyperlink>
           </w:p>
         </w:tc>
       </w:tr>
       <w:tr>
+        <w:tblPrEx>
+          <w:tblCellMar>
+            <w:top w:w="0" w:type="dxa"/>
+            <w:bottom w:w="0" w:type="dxa"/>
+          </w:tblCellMar>
+        </w:tblPrEx>
         <w:tc>
           <w:tcPr>
-            <w:tcW w:type="dxa" w:w="2600"/>
+            <w:tcW w:w="2600" w:type="dxa"/>
           </w:tcPr>
           <w:p>
             <w:pPr>
-              <w:spacing w:after="40" w:before="40"/>
+              <w:spacing w:before="40" w:after="40"/>
             </w:pPr>
             <w:r>
               <w:rPr>
                 <w:b/>
                 <w:bCs/>
-                <w:sz w:val="22"/>
-                <w:szCs w:val="22"/>
               </w:rPr>
-              <w:t xml:space="preserve">Johnson City</w:t>
+              <w:t>Johnson City</w:t>
             </w:r>
           </w:p>
         </w:tc>
         <w:tc>
           <w:tcPr>
-            <w:tcW w:type="dxa" w:w="6760"/>
+            <w:tcW w:w="6760" w:type="dxa"/>
           </w:tcPr>
           <w:p>
             <w:pPr>
-              <w:spacing w:after="40" w:before="40"/>
+              <w:spacing w:before="40" w:after="40"/>
             </w:pPr>
-            <w:hyperlink w:history="1" r:id="rId59k4p_22md92enofhixor">
+            <w:hyperlink r:id="rId9" w:history="1">
               <w:r>
                 <w:rPr>
                   <w:rStyle w:val="Hyperlink"/>
                   <w:sz w:val="20"/>
                   <w:szCs w:val="20"/>
                 </w:rPr>
-                <w:t xml:space="preserve">https://splashcarwashes.info/claims/johnson_city</w:t>
+                <w:t>https://splashcarwashes.info/claims/johnson_city</w:t>
               </w:r>
             </w:hyperlink>
           </w:p>
         </w:tc>
       </w:tr>
       <w:tr>
+        <w:tblPrEx>
+          <w:tblCellMar>
+            <w:top w:w="0" w:type="dxa"/>
+            <w:bottom w:w="0" w:type="dxa"/>
+          </w:tblCellMar>
+        </w:tblPrEx>
         <w:tc>
           <w:tcPr>
-            <w:tcW w:type="dxa" w:w="2600"/>
-            <w:shd w:fill="eef2fb" w:color="auto" w:val="clear"/>
+            <w:tcW w:w="2600" w:type="dxa"/>
+            <w:shd w:val="clear" w:color="auto" w:fill="EEF2FB"/>
           </w:tcPr>
           <w:p>
             <w:pPr>
-              <w:spacing w:after="40" w:before="40"/>
+              <w:spacing w:before="40" w:after="40"/>
             </w:pPr>
             <w:r>
               <w:rPr>
                 <w:b/>
                 <w:bCs/>
-                <w:sz w:val="22"/>
-                <w:szCs w:val="22"/>
               </w:rPr>
-              <w:t xml:space="preserve">Leray</w:t>
+              <w:t>Leray</w:t>
             </w:r>
           </w:p>
         </w:tc>
         <w:tc>
           <w:tcPr>
-            <w:tcW w:type="dxa" w:w="6760"/>
-            <w:shd w:fill="eef2fb" w:color="auto" w:val="clear"/>
+            <w:tcW w:w="6760" w:type="dxa"/>
+            <w:shd w:val="clear" w:color="auto" w:fill="EEF2FB"/>
           </w:tcPr>
           <w:p>
             <w:pPr>
-              <w:spacing w:after="40" w:before="40"/>
+              <w:spacing w:before="40" w:after="40"/>
             </w:pPr>
-            <w:hyperlink w:history="1" r:id="rIddfh1ekdann-ezgcf4rblb">
+            <w:hyperlink r:id="rId10" w:history="1">
               <w:r>
                 <w:rPr>
                   <w:rStyle w:val="Hyperlink"/>
                   <w:sz w:val="20"/>
                   <w:szCs w:val="20"/>
                 </w:rPr>
-                <w:t xml:space="preserve">https://splashcarwashes.info/claims/leray</w:t>
+                <w:t>https://splashcarwashes.info/claims/leray</w:t>
               </w:r>
             </w:hyperlink>
           </w:p>
         </w:tc>
       </w:tr>
       <w:tr>
+        <w:tblPrEx>
+          <w:tblCellMar>
+            <w:top w:w="0" w:type="dxa"/>
+            <w:bottom w:w="0" w:type="dxa"/>
+          </w:tblCellMar>
+        </w:tblPrEx>
         <w:tc>
           <w:tcPr>
-            <w:tcW w:type="dxa" w:w="2600"/>
+            <w:tcW w:w="2600" w:type="dxa"/>
           </w:tcPr>
           <w:p>
             <w:pPr>
-              <w:spacing w:after="40" w:before="40"/>
+              <w:spacing w:before="40" w:after="40"/>
             </w:pPr>
             <w:r>
               <w:rPr>
                 <w:b/>
                 <w:bCs/>
-                <w:sz w:val="22"/>
-                <w:szCs w:val="22"/>
               </w:rPr>
-              <w:t xml:space="preserve">Oswego</w:t>
+              <w:t>Oswego</w:t>
             </w:r>
           </w:p>
         </w:tc>
         <w:tc>
           <w:tcPr>
-            <w:tcW w:type="dxa" w:w="6760"/>
+            <w:tcW w:w="6760" w:type="dxa"/>
           </w:tcPr>
           <w:p>
             <w:pPr>
-              <w:spacing w:after="40" w:before="40"/>
+              <w:spacing w:before="40" w:after="40"/>
             </w:pPr>
-            <w:hyperlink w:history="1" r:id="rIdpaypc5mqkjbuskvv5btm0">
+            <w:hyperlink r:id="rId11" w:history="1">
               <w:r>
                 <w:rPr>
                   <w:rStyle w:val="Hyperlink"/>
                   <w:sz w:val="20"/>
                   <w:szCs w:val="20"/>
                 </w:rPr>
-                <w:t xml:space="preserve">https://splashcarwashes.info/claims/oswego</w:t>
+                <w:t>https://splashcarwashes.info/claims/oswego</w:t>
               </w:r>
             </w:hyperlink>
           </w:p>
         </w:tc>
       </w:tr>
       <w:tr>
+        <w:tblPrEx>
+          <w:tblCellMar>
+            <w:top w:w="0" w:type="dxa"/>
+            <w:bottom w:w="0" w:type="dxa"/>
+          </w:tblCellMar>
+        </w:tblPrEx>
         <w:tc>
           <w:tcPr>
-            <w:tcW w:type="dxa" w:w="2600"/>
-            <w:shd w:fill="eef2fb" w:color="auto" w:val="clear"/>
+            <w:tcW w:w="2600" w:type="dxa"/>
+            <w:shd w:val="clear" w:color="auto" w:fill="EEF2FB"/>
           </w:tcPr>
           <w:p>
             <w:pPr>
-              <w:spacing w:after="40" w:before="40"/>
+              <w:spacing w:before="40" w:after="40"/>
             </w:pPr>
             <w:r>
               <w:rPr>
                 <w:b/>
                 <w:bCs/>
-                <w:sz w:val="22"/>
-                <w:szCs w:val="22"/>
               </w:rPr>
-              <w:t xml:space="preserve">Vestal</w:t>
+              <w:t>Vestal</w:t>
             </w:r>
           </w:p>
         </w:tc>
         <w:tc>
           <w:tcPr>
-            <w:tcW w:type="dxa" w:w="6760"/>
-            <w:shd w:fill="eef2fb" w:color="auto" w:val="clear"/>
+            <w:tcW w:w="6760" w:type="dxa"/>
+            <w:shd w:val="clear" w:color="auto" w:fill="EEF2FB"/>
           </w:tcPr>
           <w:p>
             <w:pPr>
-              <w:spacing w:after="40" w:before="40"/>
+              <w:spacing w:before="40" w:after="40"/>
             </w:pPr>
-            <w:hyperlink w:history="1" r:id="rIdjnpwc603voq6cqb1q-ozf">
+            <w:hyperlink r:id="rId12" w:history="1">
               <w:r>
                 <w:rPr>
                   <w:rStyle w:val="Hyperlink"/>
                   <w:sz w:val="20"/>
                   <w:szCs w:val="20"/>
                 </w:rPr>
-                <w:t xml:space="preserve">https://splashcarwashes.info/claims/vestal</w:t>
+                <w:t>https://splashcarwashes.info/claims/vestal</w:t>
               </w:r>
             </w:hyperlink>
           </w:p>
         </w:tc>
       </w:tr>
       <w:tr>
+        <w:tblPrEx>
+          <w:tblCellMar>
+            <w:top w:w="0" w:type="dxa"/>
+            <w:bottom w:w="0" w:type="dxa"/>
+          </w:tblCellMar>
+        </w:tblPrEx>
         <w:tc>
           <w:tcPr>
-            <w:tcW w:type="dxa" w:w="2600"/>
+            <w:tcW w:w="2600" w:type="dxa"/>
           </w:tcPr>
           <w:p>
             <w:pPr>
-              <w:spacing w:after="40" w:before="40"/>
+              <w:spacing w:before="40" w:after="40"/>
             </w:pPr>
             <w:r>
               <w:rPr>
                 <w:b/>
                 <w:bCs/>
-                <w:sz w:val="22"/>
-                <w:szCs w:val="22"/>
               </w:rPr>
-              <w:t xml:space="preserve">Watertown</w:t>
+              <w:t>Watertown</w:t>
             </w:r>
           </w:p>
         </w:tc>
         <w:tc>
           <w:tcPr>
-            <w:tcW w:type="dxa" w:w="6760"/>
+            <w:tcW w:w="6760" w:type="dxa"/>
           </w:tcPr>
           <w:p>
             <w:pPr>
-              <w:spacing w:after="40" w:before="40"/>
+              <w:spacing w:before="40" w:after="40"/>
             </w:pPr>
-            <w:hyperlink w:history="1" r:id="rIdvhtri-n-r5vqmzlh7iucw">
+            <w:hyperlink r:id="rId13" w:history="1">
               <w:r>
                 <w:rPr>
                   <w:rStyle w:val="Hyperlink"/>
                   <w:sz w:val="20"/>
                   <w:szCs w:val="20"/>
                 </w:rPr>
-                <w:t xml:space="preserve">https://splashcarwashes.info/claims/watertown</w:t>
+                <w:t>https://splashcarwashes.info/claims/watertown</w:t>
               </w:r>
             </w:hyperlink>
           </w:p>
@@ -525,17 +584,18 @@
     <w:p>
       <w:pPr>
         <w:pStyle w:val="Heading1"/>
-        <w:spacing w:after="140" w:before="320"/>
+        <w:spacing w:before="320" w:after="140"/>
       </w:pPr>
       <w:r>
         <w:rPr>
           <w:b/>
           <w:bCs/>
-          <w:color w:val="1e2a6b"/>
+          <w:color w:val="1E2A6B"/>
           <w:sz w:val="30"/>
           <w:szCs w:val="30"/>
         </w:rPr>
-        <w:t xml:space="preserve">Section 2 — Opening the Claim Form in Chrome (Samsung Tablet)</w:t>
+        <w:lastRenderedPageBreak/>
+        <w:t>Section 2 — Opening the Claim Form in Chrome (Samsung Tablet)</w:t>
       </w:r>
     </w:p>
     <w:p>
@@ -548,11 +608,7 @@
         <w:spacing w:after="80"/>
       </w:pPr>
       <w:r>
-        <w:rPr>
-          <w:sz w:val="22"/>
-          <w:szCs w:val="22"/>
-        </w:rPr>
-        <w:t xml:space="preserve">Unlock the tablet and tap the Chrome icon to open it.</w:t>
+        <w:t>Unlock the tablet and tap the Chrome icon to open it.</w:t>
       </w:r>
     </w:p>
     <w:p>
@@ -565,11 +621,7 @@
         <w:spacing w:after="80"/>
       </w:pPr>
       <w:r>
-        <w:rPr>
-          <w:sz w:val="22"/>
-          <w:szCs w:val="22"/>
-        </w:rPr>
-        <w:t xml:space="preserve">Tap the address bar at the top of the screen.</w:t>
+        <w:t>Tap the address bar at the top of the screen.</w:t>
       </w:r>
     </w:p>
     <w:p>
@@ -582,12 +634,13 @@
         <w:spacing w:after="80"/>
       </w:pPr>
       <w:r>
-        <w:rPr>
-          <w:sz w:val="22"/>
-          <w:szCs w:val="22"/>
-        </w:rPr>
-        <w:t xml:space="preserve">Type your location's claim form address from Section 1 — for example: splashcarwashes.info/claims/johnson_city</w:t>
-      </w:r>
+        <w:t>Type your location's claim form address from Section 1 — for example: splashcarwashes.info/claims/</w:t>
+      </w:r>
+      <w:proofErr w:type="spellStart"/>
+      <w:r>
+        <w:t>johnson_city</w:t>
+      </w:r>
+      <w:proofErr w:type="spellEnd"/>
     </w:p>
     <w:p>
       <w:pPr>
@@ -599,11 +652,7 @@
         <w:spacing w:after="80"/>
       </w:pPr>
       <w:r>
-        <w:rPr>
-          <w:sz w:val="22"/>
-          <w:szCs w:val="22"/>
-        </w:rPr>
-        <w:t xml:space="preserve">Tap Go (or the enter/arrow key) on the keyboard.</w:t>
+        <w:t>Tap Go (or the enter/arrow key) on the keyboard.</w:t>
       </w:r>
     </w:p>
     <w:p>
@@ -616,53 +665,43 @@
         <w:spacing w:after="80"/>
       </w:pPr>
       <w:r>
-        <w:rPr>
-          <w:sz w:val="22"/>
-          <w:szCs w:val="22"/>
-        </w:rPr>
-        <w:t xml:space="preserve">The claim form loads with your site's name in the blue header. You're ready to start a claim.</w:t>
+        <w:t>The claim form loads with your site's name in the blue header. You're ready to start a claim.</w:t>
       </w:r>
     </w:p>
     <w:p>
       <w:pPr>
         <w:pBdr>
-          <w:left w:val="single" w:color="2f6fb0" w:sz="18" w:space="8"/>
+          <w:left w:val="single" w:sz="18" w:space="8" w:color="2F6FB0"/>
         </w:pBdr>
-        <w:shd w:fill="eef2fb" w:color="auto" w:val="clear"/>
-        <w:spacing w:after="160" w:before="60"/>
+        <w:shd w:val="clear" w:color="auto" w:fill="EEF2FB"/>
+        <w:spacing w:before="60" w:after="160"/>
       </w:pPr>
       <w:r>
         <w:rPr>
           <w:b/>
           <w:bCs/>
-          <w:color w:val="2f6fb0"/>
-          <w:sz w:val="22"/>
-          <w:szCs w:val="22"/>
+          <w:color w:val="2F6FB0"/>
         </w:rPr>
         <w:t xml:space="preserve">Tip: </w:t>
       </w:r>
       <w:r>
-        <w:rPr>
-          <w:sz w:val="22"/>
-          <w:szCs w:val="22"/>
-        </w:rPr>
-        <w:t xml:space="preserve">Type the address carefully. The part after /claims/ is your site's slug (see Section 1) and must match exactly.</w:t>
+        <w:t>Type the address carefully. The part after /claims/ is your site's slug (see Section 1) and must match exactly.</w:t>
       </w:r>
     </w:p>
     <w:p>
       <w:pPr>
         <w:pStyle w:val="Heading1"/>
-        <w:spacing w:after="140" w:before="320"/>
+        <w:spacing w:before="320" w:after="140"/>
       </w:pPr>
       <w:r>
         <w:rPr>
           <w:b/>
           <w:bCs/>
-          <w:color w:val="1e2a6b"/>
+          <w:color w:val="1E2A6B"/>
           <w:sz w:val="30"/>
           <w:szCs w:val="30"/>
         </w:rPr>
-        <w:t xml:space="preserve">Section 3 — Saving the Shortcut to the Home Screen</w:t>
+        <w:t>Section 3 — Saving the Shortcut to the Home Screen</w:t>
       </w:r>
     </w:p>
     <w:p>
@@ -670,11 +709,7 @@
         <w:spacing w:after="100"/>
       </w:pPr>
       <w:r>
-        <w:rPr>
-          <w:sz w:val="22"/>
-          <w:szCs w:val="22"/>
-        </w:rPr>
-        <w:t xml:space="preserve">Do this once so staff can open the form with a single tap in the future.</w:t>
+        <w:t>Do this once so staff can open the form with a single tap in the future.</w:t>
       </w:r>
     </w:p>
     <w:p>
@@ -687,11 +722,7 @@
         <w:spacing w:after="80"/>
       </w:pPr>
       <w:r>
-        <w:rPr>
-          <w:sz w:val="22"/>
-          <w:szCs w:val="22"/>
-        </w:rPr>
-        <w:t xml:space="preserve">Open Chrome on the tablet.</w:t>
+        <w:t>Open Chrome on the tablet.</w:t>
       </w:r>
     </w:p>
     <w:p>
@@ -704,11 +735,7 @@
         <w:spacing w:after="80"/>
       </w:pPr>
       <w:r>
-        <w:rPr>
-          <w:sz w:val="22"/>
-          <w:szCs w:val="22"/>
-        </w:rPr>
-        <w:t xml:space="preserve">Go to your location's claim form (the website from Section 2).</w:t>
+        <w:t>Go to your location's claim form (the website from Section 2).</w:t>
       </w:r>
     </w:p>
     <w:p>
@@ -721,11 +748,7 @@
         <w:spacing w:after="80"/>
       </w:pPr>
       <w:r>
-        <w:rPr>
-          <w:sz w:val="22"/>
-          <w:szCs w:val="22"/>
-        </w:rPr>
-        <w:t xml:space="preserve">To the right of the address bar, tap More ( ⋮ ) &gt; Add to home screen &gt; Create shortcut.</w:t>
+        <w:t>To the right of the address bar, tap More ( ⋮ ) &gt; Add to home screen &gt; Create shortcut.</w:t>
       </w:r>
     </w:p>
     <w:p>
@@ -738,11 +761,7 @@
         <w:spacing w:after="80"/>
       </w:pPr>
       <w:r>
-        <w:rPr>
-          <w:sz w:val="22"/>
-          <w:szCs w:val="22"/>
-        </w:rPr>
-        <w:t xml:space="preserve">In the dialog that appears, keep the default name or rename it to something clear like "Damage Claim - [Site]".</w:t>
+        <w:t>In the dialog that appears, keep the default name or rename it to something clear like "Damage Claim - [Site]".</w:t>
       </w:r>
     </w:p>
     <w:p>
@@ -755,53 +774,43 @@
         <w:spacing w:after="80"/>
       </w:pPr>
       <w:r>
-        <w:rPr>
-          <w:sz w:val="22"/>
-          <w:szCs w:val="22"/>
-        </w:rPr>
-        <w:t xml:space="preserve">Tap Add. The shortcut now appears on the home screen.</w:t>
+        <w:t>Tap Add. The shortcut now appears on the home screen.</w:t>
       </w:r>
     </w:p>
     <w:p>
       <w:pPr>
         <w:pBdr>
-          <w:left w:val="single" w:color="2f6fb0" w:sz="18" w:space="8"/>
+          <w:left w:val="single" w:sz="18" w:space="8" w:color="2F6FB0"/>
         </w:pBdr>
-        <w:shd w:fill="eef2fb" w:color="auto" w:val="clear"/>
-        <w:spacing w:after="160" w:before="60"/>
+        <w:shd w:val="clear" w:color="auto" w:fill="EEF2FB"/>
+        <w:spacing w:before="60" w:after="160"/>
       </w:pPr>
       <w:r>
         <w:rPr>
           <w:b/>
           <w:bCs/>
-          <w:color w:val="2f6fb0"/>
-          <w:sz w:val="22"/>
-          <w:szCs w:val="22"/>
+          <w:color w:val="2F6FB0"/>
         </w:rPr>
         <w:t xml:space="preserve">Tip: </w:t>
       </w:r>
       <w:r>
-        <w:rPr>
-          <w:sz w:val="22"/>
-          <w:szCs w:val="22"/>
-        </w:rPr>
-        <w:t xml:space="preserve">Shortcuts with the Chrome logo will open in Chrome.</w:t>
+        <w:t>Shortcuts with the Chrome logo will open in Chrome.</w:t>
       </w:r>
     </w:p>
     <w:p>
       <w:pPr>
         <w:pStyle w:val="Heading1"/>
-        <w:spacing w:after="140" w:before="320"/>
+        <w:spacing w:before="320" w:after="140"/>
       </w:pPr>
       <w:r>
         <w:rPr>
           <w:b/>
           <w:bCs/>
-          <w:color w:val="1e2a6b"/>
+          <w:color w:val="1E2A6B"/>
           <w:sz w:val="30"/>
           <w:szCs w:val="30"/>
         </w:rPr>
-        <w:t xml:space="preserve">Section 4 — Deleting the Old Damage Claims Shortcut</w:t>
+        <w:t>Section 4 — Deleting the Old Damage Claims Shortcut</w:t>
       </w:r>
     </w:p>
     <w:p>
@@ -809,11 +818,7 @@
         <w:spacing w:after="100"/>
       </w:pPr>
       <w:r>
-        <w:rPr>
-          <w:sz w:val="22"/>
-          <w:szCs w:val="22"/>
-        </w:rPr>
-        <w:t xml:space="preserve">Remove the outdated shortcut so staff don't use the wrong link.</w:t>
+        <w:t>Remove the outdated shortcut so staff don't use the wrong link.</w:t>
       </w:r>
     </w:p>
     <w:p>
@@ -826,11 +831,7 @@
         <w:spacing w:after="80"/>
       </w:pPr>
       <w:r>
-        <w:rPr>
-          <w:sz w:val="22"/>
-          <w:szCs w:val="22"/>
-        </w:rPr>
-        <w:t xml:space="preserve">Go to the home screen where the old damage claims shortcut sits.</w:t>
+        <w:t>Go to the home screen where the old damage claims shortcut sits.</w:t>
       </w:r>
     </w:p>
     <w:p>
@@ -843,11 +844,7 @@
         <w:spacing w:after="80"/>
       </w:pPr>
       <w:r>
-        <w:rPr>
-          <w:sz w:val="22"/>
-          <w:szCs w:val="22"/>
-        </w:rPr>
-        <w:t xml:space="preserve">Press and hold the old icon until a menu or the Remove option appears.</w:t>
+        <w:t>Press and hold the old icon until a menu or the Remove option appears.</w:t>
       </w:r>
     </w:p>
     <w:p>
@@ -860,11 +857,7 @@
         <w:spacing w:after="80"/>
       </w:pPr>
       <w:r>
-        <w:rPr>
-          <w:sz w:val="22"/>
-          <w:szCs w:val="22"/>
-        </w:rPr>
-        <w:t xml:space="preserve">Tap Remove (or drag the icon up to Remove at the top of the screen) and confirm if asked.</w:t>
+        <w:t>Tap Remove (or drag the icon up to Remove at the top of the screen) and confirm if asked.</w:t>
       </w:r>
     </w:p>
     <w:p>
@@ -877,11 +870,7 @@
         <w:spacing w:after="80"/>
       </w:pPr>
       <w:r>
-        <w:rPr>
-          <w:sz w:val="22"/>
-          <w:szCs w:val="22"/>
-        </w:rPr>
-        <w:t xml:space="preserve">This only deletes the shortcut — it does not delete Chrome or any app or data.</w:t>
+        <w:t>This only deletes the shortcut — it does not delete Chrome or any app or data.</w:t>
       </w:r>
     </w:p>
     <w:p>
@@ -892,17 +881,18 @@
     <w:p>
       <w:pPr>
         <w:pStyle w:val="Heading1"/>
-        <w:spacing w:after="140" w:before="320"/>
+        <w:spacing w:before="320" w:after="140"/>
       </w:pPr>
       <w:r>
         <w:rPr>
           <w:b/>
           <w:bCs/>
-          <w:color w:val="1e2a6b"/>
+          <w:color w:val="1E2A6B"/>
           <w:sz w:val="30"/>
           <w:szCs w:val="30"/>
         </w:rPr>
-        <w:t xml:space="preserve">Section 5 — Filling Out the Claim Form</w:t>
+        <w:lastRenderedPageBreak/>
+        <w:t>Section 5 — Filling Out the Claim Form</w:t>
       </w:r>
     </w:p>
     <w:p>
@@ -910,27 +900,23 @@
         <w:spacing w:after="100"/>
       </w:pPr>
       <w:r>
-        <w:rPr>
-          <w:sz w:val="22"/>
-          <w:szCs w:val="22"/>
-        </w:rPr>
-        <w:t xml:space="preserve">The form has two parts on one page: Customer Information (filled by the customer) and Staff Assessment (filled by staff, behind a PIN).</w:t>
+        <w:t>The form has two parts: Customer Information (filled by the customer) and Staff Assessment (filled by staff, behind a PIN).</w:t>
       </w:r>
     </w:p>
     <w:p>
       <w:pPr>
         <w:pStyle w:val="Heading2"/>
-        <w:spacing w:after="100" w:before="220"/>
+        <w:spacing w:before="220" w:after="100"/>
       </w:pPr>
       <w:r>
         <w:rPr>
           <w:b/>
           <w:bCs/>
-          <w:color w:val="2f6fb0"/>
+          <w:color w:val="2F6FB0"/>
           <w:sz w:val="24"/>
           <w:szCs w:val="24"/>
         </w:rPr>
-        <w:t xml:space="preserve">Page 1: Customer Information — completed by the customer</w:t>
+        <w:t>Page 1: Customer Information — completed by the customer</w:t>
       </w:r>
     </w:p>
     <w:p>
@@ -938,11 +924,7 @@
         <w:spacing w:after="100"/>
       </w:pPr>
       <w:r>
-        <w:rPr>
-          <w:sz w:val="22"/>
-          <w:szCs w:val="22"/>
-        </w:rPr>
-        <w:t xml:space="preserve">The header shows the site name and "Vehicle Issue Report." Required fields are marked with an asterisk (*):</w:t>
+        <w:t>The header shows the site name and "Vehicle Issue Report." Required fields are marked with an asterisk (*):</w:t>
       </w:r>
     </w:p>
     <w:p>
@@ -950,11 +932,7 @@
         <w:spacing w:after="100"/>
       </w:pPr>
       <w:r>
-        <w:rPr>
-          <w:sz w:val="22"/>
-          <w:szCs w:val="22"/>
-        </w:rPr>
-        <w:t xml:space="preserve">Your Name*, Phone Number*, Email Address* (a copy of the claim is emailed here), Mailing Address*, License Plate*, Vehicle Year*, Vehicle Make*, Vehicle Model*, Vehicle Color*, Description of Issue*.</w:t>
+        <w:t>Your Name*, Phone Number*, Email Address* (a copy of the claim is emailed here), Mailing Address*, License Plate*, Vehicle Year*, Vehicle Make*, Vehicle Model*, Vehicle Color*, Description of Issue*.</w:t>
       </w:r>
     </w:p>
     <w:p>
@@ -962,23 +940,22 @@
         <w:spacing w:after="100"/>
       </w:pPr>
       <w:r>
-        <w:rPr>
-          <w:sz w:val="22"/>
-          <w:szCs w:val="22"/>
-        </w:rPr>
-        <w:t xml:space="preserve">Tap Continue to staff assessment →.</w:t>
-      </w:r>
-    </w:p>
-    <w:p>
-      <w:pPr>
-        <w:spacing w:after="40" w:before="120"/>
-        <w:jc w:val="center"/>
-      </w:pPr>
-      <w:r>
+        <w:t>Tap Continue to staff assessment →.</w:t>
+      </w:r>
+    </w:p>
+    <w:p>
+      <w:pPr>
+        <w:spacing w:before="120" w:after="40"/>
+        <w:jc w:val="center"/>
+      </w:pPr>
+      <w:r>
+        <w:rPr>
+          <w:noProof/>
+        </w:rPr>
         <w:drawing>
-          <wp:inline distT="0" distB="0" distL="0" distR="0">
-            <wp:extent cx="3238500" cy="4724400"/>
-            <wp:effectExtent t="0" r="0" b="0" l="0"/>
+          <wp:inline distT="0" distB="0" distL="0" distR="0" wp14:anchorId="0CEC3195" wp14:editId="387E4AF8">
+            <wp:extent cx="2505075" cy="3654462"/>
+            <wp:effectExtent l="0" t="0" r="0" b="3175"/>
             <wp:docPr id="1" name="1customer.png" descr="1customer.png" title="1customer.png"/>
             <wp:cNvGraphicFramePr>
               <a:graphicFrameLocks xmlns:a="http://schemas.openxmlformats.org/drawingml/2006/main" noChangeAspect="1"/>
@@ -987,13 +964,13 @@
               <a:graphicData uri="http://schemas.openxmlformats.org/drawingml/2006/picture">
                 <pic:pic xmlns:pic="http://schemas.openxmlformats.org/drawingml/2006/picture">
                   <pic:nvPicPr>
-                    <pic:cNvPr id="0" name="" descr=""/>
+                    <pic:cNvPr id="0" name=""/>
                     <pic:cNvPicPr>
                       <a:picLocks noChangeAspect="1" noChangeArrowheads="1"/>
                     </pic:cNvPicPr>
                   </pic:nvPicPr>
                   <pic:blipFill>
-                    <a:blip r:embed="rId7" cstate="none"/>
+                    <a:blip r:embed="rId14"/>
                     <a:srcRect/>
                     <a:stretch>
                       <a:fillRect/>
@@ -1002,7 +979,7 @@
                   <pic:spPr bwMode="auto">
                     <a:xfrm>
                       <a:off x="0" y="0"/>
-                      <a:ext cx="3238500" cy="4724400"/>
+                      <a:ext cx="2514157" cy="3667711"/>
                     </a:xfrm>
                     <a:prstGeom prst="rect">
                       <a:avLst/>
@@ -1028,23 +1005,23 @@
           <w:sz w:val="18"/>
           <w:szCs w:val="18"/>
         </w:rPr>
-        <w:t xml:space="preserve">Customer Information page</w:t>
+        <w:t>Customer Information page</w:t>
       </w:r>
     </w:p>
     <w:p>
       <w:pPr>
         <w:pStyle w:val="Heading2"/>
-        <w:spacing w:after="100" w:before="220"/>
+        <w:spacing w:before="220" w:after="100"/>
       </w:pPr>
       <w:r>
         <w:rPr>
           <w:b/>
           <w:bCs/>
-          <w:color w:val="2f6fb0"/>
+          <w:color w:val="2F6FB0"/>
           <w:sz w:val="24"/>
           <w:szCs w:val="24"/>
         </w:rPr>
-        <w:t xml:space="preserve">Staff PIN gate</w:t>
+        <w:t>Staff PIN gate</w:t>
       </w:r>
     </w:p>
     <w:p>
@@ -1052,24 +1029,202 @@
         <w:spacing w:after="100"/>
       </w:pPr>
       <w:r>
-        <w:rPr>
-          <w:sz w:val="22"/>
-          <w:szCs w:val="22"/>
-        </w:rPr>
-        <w:t xml:space="preserve">A "Staff PIN required" box appears: "Enter the staff PIN to continue with the assessment portion of this claim." Enter the staff PIN and tap Continue. (A wrong PIN shows "Incorrect PIN. Please try again.")</w:t>
-      </w:r>
-    </w:p>
-    <w:p>
-      <w:pPr>
-        <w:spacing w:after="40" w:before="120"/>
-        <w:jc w:val="center"/>
-      </w:pPr>
-      <w:r>
+        <w:t>A "Staff PIN required" box appears: "Enter the staff PIN to continue with the assessment portion of this claim." Enter the staff PIN and tap Continue. (A wrong PIN shows "Incorrect PIN. Please try again.")</w:t>
+      </w:r>
+    </w:p>
+    <w:p>
+      <w:pPr>
+        <w:spacing w:before="120" w:after="40"/>
+        <w:jc w:val="center"/>
+      </w:pPr>
+    </w:p>
+    <w:p>
+      <w:pPr>
+        <w:pStyle w:val="Heading2"/>
+        <w:spacing w:before="220" w:after="100"/>
+        <w:rPr>
+          <w:b/>
+          <w:bCs/>
+          <w:color w:val="2F6FB0"/>
+          <w:sz w:val="24"/>
+          <w:szCs w:val="24"/>
+        </w:rPr>
+      </w:pPr>
+    </w:p>
+    <w:p>
+      <w:pPr>
+        <w:pStyle w:val="Heading2"/>
+        <w:spacing w:before="220" w:after="100"/>
+        <w:rPr>
+          <w:b/>
+          <w:bCs/>
+          <w:color w:val="2F6FB0"/>
+          <w:sz w:val="24"/>
+          <w:szCs w:val="24"/>
+        </w:rPr>
+      </w:pPr>
+    </w:p>
+    <w:p>
+      <w:pPr>
+        <w:pStyle w:val="Heading2"/>
+        <w:spacing w:before="220" w:after="100"/>
+        <w:rPr>
+          <w:b/>
+          <w:bCs/>
+          <w:color w:val="2F6FB0"/>
+          <w:sz w:val="24"/>
+          <w:szCs w:val="24"/>
+        </w:rPr>
+      </w:pPr>
+    </w:p>
+    <w:p>
+      <w:pPr>
+        <w:pStyle w:val="Heading2"/>
+        <w:spacing w:before="220" w:after="100"/>
+        <w:rPr>
+          <w:b/>
+          <w:bCs/>
+          <w:color w:val="2F6FB0"/>
+          <w:sz w:val="24"/>
+          <w:szCs w:val="24"/>
+        </w:rPr>
+      </w:pPr>
+    </w:p>
+    <w:p>
+      <w:pPr>
+        <w:pStyle w:val="Heading2"/>
+        <w:spacing w:before="220" w:after="100"/>
+      </w:pPr>
+      <w:r>
+        <w:rPr>
+          <w:b/>
+          <w:bCs/>
+          <w:color w:val="2F6FB0"/>
+          <w:sz w:val="24"/>
+          <w:szCs w:val="24"/>
+        </w:rPr>
+        <w:lastRenderedPageBreak/>
+        <w:t>Page 2: Staff Assessment — completed by staff</w:t>
+      </w:r>
+    </w:p>
+    <w:p>
+      <w:pPr>
+        <w:pStyle w:val="ListParagraph"/>
+        <w:numPr>
+          <w:ilvl w:val="0"/>
+          <w:numId w:val="3"/>
+        </w:numPr>
+        <w:spacing w:after="60"/>
+      </w:pPr>
+      <w:r>
+        <w:t>Employee Name* and Membership / Barcode (optional).</w:t>
+      </w:r>
+    </w:p>
+    <w:p>
+      <w:pPr>
+        <w:pStyle w:val="ListParagraph"/>
+        <w:numPr>
+          <w:ilvl w:val="0"/>
+          <w:numId w:val="3"/>
+        </w:numPr>
+        <w:spacing w:after="60"/>
+      </w:pPr>
+      <w:r>
+        <w:t>Photo sets, each added with + Add photo: Four-Corner / Full-Vehicle Photos*, VIN Photo*, Damage Photos*, License Plate Photo*.</w:t>
+      </w:r>
+    </w:p>
+    <w:p>
+      <w:pPr>
+        <w:pStyle w:val="ListParagraph"/>
+        <w:numPr>
+          <w:ilvl w:val="0"/>
+          <w:numId w:val="3"/>
+        </w:numPr>
+        <w:spacing w:after="60"/>
+      </w:pPr>
+      <w:r>
+        <w:t>Pre-Existing Damage Noted (optional) — e.g. "Scratch on rear bumper, dent on driver door."</w:t>
+      </w:r>
+    </w:p>
+    <w:p>
+      <w:pPr>
+        <w:pStyle w:val="ListParagraph"/>
+        <w:numPr>
+          <w:ilvl w:val="0"/>
+          <w:numId w:val="3"/>
+        </w:numPr>
+        <w:spacing w:after="60"/>
+      </w:pPr>
+      <w:r>
+        <w:t>Damage Type* dropdown: License Plate, Wiper, Collision, Roof Rack/Roof Accessory, PS Mirror, DS Mirror, Window, Paint Damage, Rims, Tires, Other. Choosing Other reveals a "Description of other*" box.</w:t>
+      </w:r>
+    </w:p>
+    <w:p>
+      <w:pPr>
+        <w:pStyle w:val="ListParagraph"/>
+        <w:numPr>
+          <w:ilvl w:val="0"/>
+          <w:numId w:val="3"/>
+        </w:numPr>
+        <w:spacing w:after="60"/>
+      </w:pPr>
+      <w:r>
+        <w:t>Was the damage equipment related? No/Yes toggle (defaults to No). Selecting Yes reveals Equipment Involved*: Top Brush, Side Wraps, Conveyor, Dryer, Wheel Blaster, Other.</w:t>
+      </w:r>
+    </w:p>
+    <w:p>
+      <w:pPr>
+        <w:pStyle w:val="ListParagraph"/>
+        <w:numPr>
+          <w:ilvl w:val="0"/>
+          <w:numId w:val="3"/>
+        </w:numPr>
+        <w:spacing w:after="60"/>
+      </w:pPr>
+      <w:r>
+        <w:t>Determination* (choose one): No Responsibility — damage is pre-existing or not caused by the wash; Requires GM Review — needs General Manager evaluation; Requested Customer Get Quote(s) — customer will obtain repair estimates.</w:t>
+      </w:r>
+    </w:p>
+    <w:p>
+      <w:pPr>
+        <w:pStyle w:val="ListParagraph"/>
+        <w:numPr>
+          <w:ilvl w:val="0"/>
+          <w:numId w:val="3"/>
+        </w:numPr>
+        <w:spacing w:after="60"/>
+      </w:pPr>
+      <w:r>
+        <w:t>What Was the Customer Told? (optional) and Customer Interaction &amp; Demeanor (optional).</w:t>
+      </w:r>
+    </w:p>
+    <w:p>
+      <w:pPr>
+        <w:pStyle w:val="ListParagraph"/>
+        <w:numPr>
+          <w:ilvl w:val="0"/>
+          <w:numId w:val="3"/>
+        </w:numPr>
+        <w:spacing w:after="60"/>
+      </w:pPr>
+      <w:r>
+        <w:t>Tap Submit claim.</w:t>
+      </w:r>
+    </w:p>
+    <w:p>
+      <w:pPr>
+        <w:spacing w:before="120" w:after="40"/>
+        <w:jc w:val="center"/>
+      </w:pPr>
+      <w:r>
+        <w:rPr>
+          <w:noProof/>
+        </w:rPr>
         <w:drawing>
-          <wp:inline distT="0" distB="0" distL="0" distR="0">
-            <wp:extent cx="3238500" cy="4714875"/>
-            <wp:effectExtent t="0" r="0" b="0" l="0"/>
-            <wp:docPr id="1" name="2pin.png" descr="2pin.png" title="2pin.png"/>
+          <wp:inline distT="0" distB="0" distL="0" distR="0" wp14:anchorId="187BC193" wp14:editId="5EBDEAD5">
+            <wp:extent cx="3238500" cy="4495800"/>
+            <wp:effectExtent l="0" t="0" r="0" b="0"/>
+            <wp:docPr id="1741397518" name="3staff1.png" descr="3staff1.png" title="3staff1.png"/>
             <wp:cNvGraphicFramePr>
               <a:graphicFrameLocks xmlns:a="http://schemas.openxmlformats.org/drawingml/2006/main" noChangeAspect="1"/>
             </wp:cNvGraphicFramePr>
@@ -1077,227 +1232,13 @@
               <a:graphicData uri="http://schemas.openxmlformats.org/drawingml/2006/picture">
                 <pic:pic xmlns:pic="http://schemas.openxmlformats.org/drawingml/2006/picture">
                   <pic:nvPicPr>
-                    <pic:cNvPr id="0" name="" descr=""/>
+                    <pic:cNvPr id="0" name=""/>
                     <pic:cNvPicPr>
                       <a:picLocks noChangeAspect="1" noChangeArrowheads="1"/>
                     </pic:cNvPicPr>
                   </pic:nvPicPr>
                   <pic:blipFill>
-                    <a:blip r:embed="rId8" cstate="none"/>
-                    <a:srcRect/>
-                    <a:stretch>
-                      <a:fillRect/>
-                    </a:stretch>
-                  </pic:blipFill>
-                  <pic:spPr bwMode="auto">
-                    <a:xfrm>
-                      <a:off x="0" y="0"/>
-                      <a:ext cx="3238500" cy="4714875"/>
-                    </a:xfrm>
-                    <a:prstGeom prst="rect">
-                      <a:avLst/>
-                    </a:prstGeom>
-                  </pic:spPr>
-                </pic:pic>
-              </a:graphicData>
-            </a:graphic>
-          </wp:inline>
-        </w:drawing>
-      </w:r>
-    </w:p>
-    <w:p>
-      <w:pPr>
-        <w:spacing w:after="200"/>
-        <w:jc w:val="center"/>
-      </w:pPr>
-      <w:r>
-        <w:rPr>
-          <w:i/>
-          <w:iCs/>
-          <w:color w:val="555555"/>
-          <w:sz w:val="18"/>
-          <w:szCs w:val="18"/>
-        </w:rPr>
-        <w:t xml:space="preserve">Staff PIN gate</w:t>
-      </w:r>
-    </w:p>
-    <w:p>
-      <w:pPr>
-        <w:pStyle w:val="Heading2"/>
-        <w:spacing w:after="100" w:before="220"/>
-      </w:pPr>
-      <w:r>
-        <w:rPr>
-          <w:b/>
-          <w:bCs/>
-          <w:color w:val="2f6fb0"/>
-          <w:sz w:val="24"/>
-          <w:szCs w:val="24"/>
-        </w:rPr>
-        <w:t xml:space="preserve">Page 2: Staff Assessment — completed by staff</w:t>
-      </w:r>
-    </w:p>
-    <w:p>
-      <w:pPr>
-        <w:pStyle w:val="ListParagraph"/>
-        <w:numPr>
-          <w:ilvl w:val="0"/>
-          <w:numId w:val="3"/>
-        </w:numPr>
-        <w:spacing w:after="60"/>
-      </w:pPr>
-      <w:r>
-        <w:rPr>
-          <w:sz w:val="22"/>
-          <w:szCs w:val="22"/>
-        </w:rPr>
-        <w:t xml:space="preserve">Employee Name* and Membership / Barcode (optional).</w:t>
-      </w:r>
-    </w:p>
-    <w:p>
-      <w:pPr>
-        <w:pStyle w:val="ListParagraph"/>
-        <w:numPr>
-          <w:ilvl w:val="0"/>
-          <w:numId w:val="3"/>
-        </w:numPr>
-        <w:spacing w:after="60"/>
-      </w:pPr>
-      <w:r>
-        <w:rPr>
-          <w:sz w:val="22"/>
-          <w:szCs w:val="22"/>
-        </w:rPr>
-        <w:t xml:space="preserve">Photo sets, each added with + Add photo: Four-Corner / Full-Vehicle Photos*, VIN Photo*, Damage Photos*, License Plate Photo*.</w:t>
-      </w:r>
-    </w:p>
-    <w:p>
-      <w:pPr>
-        <w:pStyle w:val="ListParagraph"/>
-        <w:numPr>
-          <w:ilvl w:val="0"/>
-          <w:numId w:val="3"/>
-        </w:numPr>
-        <w:spacing w:after="60"/>
-      </w:pPr>
-      <w:r>
-        <w:rPr>
-          <w:sz w:val="22"/>
-          <w:szCs w:val="22"/>
-        </w:rPr>
-        <w:t xml:space="preserve">Pre-Existing Damage Noted (optional) — e.g. "Scratch on rear bumper, dent on driver door."</w:t>
-      </w:r>
-    </w:p>
-    <w:p>
-      <w:pPr>
-        <w:pStyle w:val="ListParagraph"/>
-        <w:numPr>
-          <w:ilvl w:val="0"/>
-          <w:numId w:val="3"/>
-        </w:numPr>
-        <w:spacing w:after="60"/>
-      </w:pPr>
-      <w:r>
-        <w:rPr>
-          <w:sz w:val="22"/>
-          <w:szCs w:val="22"/>
-        </w:rPr>
-        <w:t xml:space="preserve">Damage Type* dropdown: License Plate, Wiper, Collision, Roof Rack/Roof Accessory, PS Mirror, DS Mirror, Window, Paint Damage, Rims, Tires, Other. Choosing Other reveals a "Description of other*" box.</w:t>
-      </w:r>
-    </w:p>
-    <w:p>
-      <w:pPr>
-        <w:pStyle w:val="ListParagraph"/>
-        <w:numPr>
-          <w:ilvl w:val="0"/>
-          <w:numId w:val="3"/>
-        </w:numPr>
-        <w:spacing w:after="60"/>
-      </w:pPr>
-      <w:r>
-        <w:rPr>
-          <w:sz w:val="22"/>
-          <w:szCs w:val="22"/>
-        </w:rPr>
-        <w:t xml:space="preserve">Was the damage equipment related? No/Yes toggle (defaults to No). Selecting Yes reveals Equipment Involved*: Top Brush, Side Wraps, Conveyor, Dryer, Wheel Blaster, Other.</w:t>
-      </w:r>
-    </w:p>
-    <w:p>
-      <w:pPr>
-        <w:pStyle w:val="ListParagraph"/>
-        <w:numPr>
-          <w:ilvl w:val="0"/>
-          <w:numId w:val="3"/>
-        </w:numPr>
-        <w:spacing w:after="60"/>
-      </w:pPr>
-      <w:r>
-        <w:rPr>
-          <w:sz w:val="22"/>
-          <w:szCs w:val="22"/>
-        </w:rPr>
-        <w:t xml:space="preserve">Determination* (choose one): No Responsibility — damage is pre-existing or not caused by the wash; Requires GM Review — needs General Manager evaluation; Requested Customer Get Quote(s) — customer will obtain repair estimates.</w:t>
-      </w:r>
-    </w:p>
-    <w:p>
-      <w:pPr>
-        <w:pStyle w:val="ListParagraph"/>
-        <w:numPr>
-          <w:ilvl w:val="0"/>
-          <w:numId w:val="3"/>
-        </w:numPr>
-        <w:spacing w:after="60"/>
-      </w:pPr>
-      <w:r>
-        <w:rPr>
-          <w:sz w:val="22"/>
-          <w:szCs w:val="22"/>
-        </w:rPr>
-        <w:t xml:space="preserve">What Was the Customer Told? (optional) and Customer Interaction &amp; Demeanor (optional).</w:t>
-      </w:r>
-    </w:p>
-    <w:p>
-      <w:pPr>
-        <w:pStyle w:val="ListParagraph"/>
-        <w:numPr>
-          <w:ilvl w:val="0"/>
-          <w:numId w:val="3"/>
-        </w:numPr>
-        <w:spacing w:after="60"/>
-      </w:pPr>
-      <w:r>
-        <w:rPr>
-          <w:sz w:val="22"/>
-          <w:szCs w:val="22"/>
-        </w:rPr>
-        <w:t xml:space="preserve">Tap Submit claim.</w:t>
-      </w:r>
-    </w:p>
-    <w:p>
-      <w:pPr>
-        <w:spacing w:after="40" w:before="120"/>
-        <w:jc w:val="center"/>
-      </w:pPr>
-      <w:r>
-        <w:drawing>
-          <wp:inline distT="0" distB="0" distL="0" distR="0">
-            <wp:extent cx="3238500" cy="4495800"/>
-            <wp:effectExtent t="0" r="0" b="0" l="0"/>
-            <wp:docPr id="1" name="3staff1.png" descr="3staff1.png" title="3staff1.png"/>
-            <wp:cNvGraphicFramePr>
-              <a:graphicFrameLocks xmlns:a="http://schemas.openxmlformats.org/drawingml/2006/main" noChangeAspect="1"/>
-            </wp:cNvGraphicFramePr>
-            <a:graphic xmlns:a="http://schemas.openxmlformats.org/drawingml/2006/main">
-              <a:graphicData uri="http://schemas.openxmlformats.org/drawingml/2006/picture">
-                <pic:pic xmlns:pic="http://schemas.openxmlformats.org/drawingml/2006/picture">
-                  <pic:nvPicPr>
-                    <pic:cNvPr id="0" name="" descr=""/>
-                    <pic:cNvPicPr>
-                      <a:picLocks noChangeAspect="1" noChangeArrowheads="1"/>
-                    </pic:cNvPicPr>
-                  </pic:nvPicPr>
-                  <pic:blipFill>
-                    <a:blip r:embed="rId9" cstate="none"/>
+                    <a:blip r:embed="rId15"/>
                     <a:srcRect/>
                     <a:stretch>
                       <a:fillRect/>
@@ -1332,20 +1273,24 @@
           <w:sz w:val="18"/>
           <w:szCs w:val="18"/>
         </w:rPr>
-        <w:t xml:space="preserve">Staff Assessment — top</w:t>
-      </w:r>
-    </w:p>
-    <w:p>
-      <w:pPr>
-        <w:spacing w:after="40" w:before="120"/>
-        <w:jc w:val="center"/>
-      </w:pPr>
-      <w:r>
+        <w:t>Staff Assessment — top</w:t>
+      </w:r>
+    </w:p>
+    <w:p>
+      <w:pPr>
+        <w:spacing w:before="120" w:after="40"/>
+        <w:jc w:val="center"/>
+      </w:pPr>
+      <w:r>
+        <w:rPr>
+          <w:noProof/>
+        </w:rPr>
+        <w:lastRenderedPageBreak/>
         <w:drawing>
-          <wp:inline distT="0" distB="0" distL="0" distR="0">
+          <wp:inline distT="0" distB="0" distL="0" distR="0" wp14:anchorId="36E6E3B1" wp14:editId="52B9CFDF">
             <wp:extent cx="3238500" cy="3848100"/>
-            <wp:effectExtent t="0" r="0" b="0" l="0"/>
-            <wp:docPr id="1" name="4staff2.png" descr="4staff2.png" title="4staff2.png"/>
+            <wp:effectExtent l="0" t="0" r="0" b="0"/>
+            <wp:docPr id="1287041934" name="4staff2.png" descr="4staff2.png" title="4staff2.png"/>
             <wp:cNvGraphicFramePr>
               <a:graphicFrameLocks xmlns:a="http://schemas.openxmlformats.org/drawingml/2006/main" noChangeAspect="1"/>
             </wp:cNvGraphicFramePr>
@@ -1353,13 +1298,13 @@
               <a:graphicData uri="http://schemas.openxmlformats.org/drawingml/2006/picture">
                 <pic:pic xmlns:pic="http://schemas.openxmlformats.org/drawingml/2006/picture">
                   <pic:nvPicPr>
-                    <pic:cNvPr id="0" name="" descr=""/>
+                    <pic:cNvPr id="0" name=""/>
                     <pic:cNvPicPr>
                       <a:picLocks noChangeAspect="1" noChangeArrowheads="1"/>
                     </pic:cNvPicPr>
                   </pic:nvPicPr>
                   <pic:blipFill>
-                    <a:blip r:embed="rId10" cstate="none"/>
+                    <a:blip r:embed="rId16"/>
                     <a:srcRect/>
                     <a:stretch>
                       <a:fillRect/>
@@ -1394,23 +1339,23 @@
           <w:sz w:val="18"/>
           <w:szCs w:val="18"/>
         </w:rPr>
-        <w:t xml:space="preserve">Staff Assessment — determination</w:t>
+        <w:t>Staff Assessment — determination</w:t>
       </w:r>
     </w:p>
     <w:p>
       <w:pPr>
         <w:pStyle w:val="Heading2"/>
-        <w:spacing w:after="100" w:before="220"/>
+        <w:spacing w:before="220" w:after="100"/>
       </w:pPr>
       <w:r>
         <w:rPr>
           <w:b/>
           <w:bCs/>
-          <w:color w:val="2f6fb0"/>
+          <w:color w:val="2F6FB0"/>
           <w:sz w:val="24"/>
           <w:szCs w:val="24"/>
         </w:rPr>
-        <w:t xml:space="preserve">Confirmation</w:t>
+        <w:t>Confirmation</w:t>
       </w:r>
     </w:p>
     <w:p>
@@ -1418,24 +1363,23 @@
         <w:spacing w:after="100"/>
       </w:pPr>
       <w:r>
-        <w:rPr>
-          <w:sz w:val="22"/>
-          <w:szCs w:val="22"/>
-        </w:rPr>
-        <w:t xml:space="preserve">"Claim submitted — Your claim for {Site} has been recorded." The screen shows the Claim ID. Buttons: Download a copy (PDF) and Submit another claim. Give the customer a copy or photo of the Claim ID; a manager will review and may follow up.</w:t>
-      </w:r>
-    </w:p>
-    <w:p>
-      <w:pPr>
-        <w:spacing w:after="40" w:before="120"/>
-        <w:jc w:val="center"/>
-      </w:pPr>
-      <w:r>
+        <w:t>"Claim submitted — Your claim for {Site} has been recorded." The screen shows the Claim ID. Buttons: Download a copy (PDF) and Submit another claim. Give the customer a copy or photo of the Claim ID; a manager will review and may follow up.</w:t>
+      </w:r>
+    </w:p>
+    <w:p>
+      <w:pPr>
+        <w:spacing w:before="120" w:after="40"/>
+        <w:jc w:val="center"/>
+      </w:pPr>
+      <w:r>
+        <w:rPr>
+          <w:noProof/>
+        </w:rPr>
         <w:drawing>
-          <wp:inline distT="0" distB="0" distL="0" distR="0">
+          <wp:inline distT="0" distB="0" distL="0" distR="0" wp14:anchorId="3D687E4C" wp14:editId="6CC1ECBE">
             <wp:extent cx="4000500" cy="2505075"/>
-            <wp:effectExtent t="0" r="0" b="0" l="0"/>
-            <wp:docPr id="1" name="5submitted.png" descr="5submitted.png" title="5submitted.png"/>
+            <wp:effectExtent l="0" t="0" r="0" b="0"/>
+            <wp:docPr id="553206619" name="5submitted.png" descr="5submitted.png" title="5submitted.png"/>
             <wp:cNvGraphicFramePr>
               <a:graphicFrameLocks xmlns:a="http://schemas.openxmlformats.org/drawingml/2006/main" noChangeAspect="1"/>
             </wp:cNvGraphicFramePr>
@@ -1443,13 +1387,13 @@
               <a:graphicData uri="http://schemas.openxmlformats.org/drawingml/2006/picture">
                 <pic:pic xmlns:pic="http://schemas.openxmlformats.org/drawingml/2006/picture">
                   <pic:nvPicPr>
-                    <pic:cNvPr id="0" name="" descr=""/>
+                    <pic:cNvPr id="0" name=""/>
                     <pic:cNvPicPr>
                       <a:picLocks noChangeAspect="1" noChangeArrowheads="1"/>
                     </pic:cNvPicPr>
                   </pic:nvPicPr>
                   <pic:blipFill>
-                    <a:blip r:embed="rId11" cstate="none"/>
+                    <a:blip r:embed="rId17"/>
                     <a:srcRect/>
                     <a:stretch>
                       <a:fillRect/>
@@ -1484,7 +1428,7 @@
           <w:sz w:val="18"/>
           <w:szCs w:val="18"/>
         </w:rPr>
-        <w:t xml:space="preserve">Submission confirmation with Claim ID</w:t>
+        <w:t>Submission confirmation with Claim ID</w:t>
       </w:r>
     </w:p>
     <w:p>
@@ -1495,45 +1439,74 @@
     <w:p>
       <w:pPr>
         <w:pStyle w:val="Heading1"/>
-        <w:spacing w:after="140" w:before="320"/>
+        <w:spacing w:before="320" w:after="140"/>
       </w:pPr>
       <w:r>
         <w:rPr>
           <w:b/>
           <w:bCs/>
-          <w:color w:val="1e2a6b"/>
+          <w:color w:val="1E2A6B"/>
           <w:sz w:val="30"/>
           <w:szCs w:val="30"/>
         </w:rPr>
-        <w:t xml:space="preserve">Section 6 — Reviewing and Resolving a Claim (GM / Manager)</w:t>
-      </w:r>
-    </w:p>
-    <w:p>
-      <w:pPr>
-        <w:spacing w:after="100"/>
-      </w:pPr>
-      <w:r>
-        <w:rPr>
-          <w:sz w:val="22"/>
-          <w:szCs w:val="22"/>
-        </w:rPr>
-        <w:t xml:space="preserve">Once a claim is submitted, a manager reviews it in the internal tools backend, sets the cause, uploads any quotes or receipts, and moves it toward a resolution (including submitting a check request when a payout is approved).</w:t>
-      </w:r>
-    </w:p>
-    <w:p>
-      <w:pPr>
-        <w:pStyle w:val="Heading2"/>
-        <w:spacing w:after="100" w:before="220"/>
-      </w:pPr>
+        <w:lastRenderedPageBreak/>
+        <w:t>Section 6 — Reviewing and Resolving a Claim (</w:t>
+      </w:r>
       <w:r>
         <w:rPr>
           <w:b/>
           <w:bCs/>
-          <w:color w:val="2f6fb0"/>
+          <w:color w:val="1E2A6B"/>
+          <w:sz w:val="30"/>
+          <w:szCs w:val="30"/>
+        </w:rPr>
+        <w:t>Manager</w:t>
+      </w:r>
+      <w:r>
+        <w:rPr>
+          <w:b/>
+          <w:bCs/>
+          <w:color w:val="1E2A6B"/>
+          <w:sz w:val="30"/>
+          <w:szCs w:val="30"/>
+        </w:rPr>
+        <w:t>)</w:t>
+      </w:r>
+    </w:p>
+    <w:p>
+      <w:pPr>
+        <w:spacing w:after="100"/>
+      </w:pPr>
+      <w:r>
+        <w:t>Once a claim is submitted, a manager reviews it in the internal tools backend, sets the cause,</w:t>
+      </w:r>
+      <w:r>
+        <w:t xml:space="preserve"> finalizes a determination,</w:t>
+      </w:r>
+      <w:r>
+        <w:t xml:space="preserve"> uploads any quotes or receipts</w:t>
+      </w:r>
+      <w:r>
+        <w:t xml:space="preserve"> if needed</w:t>
+      </w:r>
+      <w:r>
+        <w:t>, and moves it toward a resolution (including submitting a check request when a payout is approved).</w:t>
+      </w:r>
+    </w:p>
+    <w:p>
+      <w:pPr>
+        <w:pStyle w:val="Heading2"/>
+        <w:spacing w:before="220" w:after="100"/>
+      </w:pPr>
+      <w:r>
+        <w:rPr>
+          <w:b/>
+          <w:bCs/>
+          <w:color w:val="2F6FB0"/>
           <w:sz w:val="24"/>
           <w:szCs w:val="24"/>
         </w:rPr>
-        <w:t xml:space="preserve">Step 1: Sign in</w:t>
+        <w:t>Step 1: Sign in</w:t>
       </w:r>
     </w:p>
     <w:p>
@@ -1541,24 +1514,23 @@
         <w:spacing w:after="100"/>
       </w:pPr>
       <w:r>
-        <w:rPr>
-          <w:sz w:val="22"/>
-          <w:szCs w:val="22"/>
-        </w:rPr>
-        <w:t xml:space="preserve">Open the internal tools site and sign in with your Splash account email and password. Tap Sign In.</w:t>
-      </w:r>
-    </w:p>
-    <w:p>
-      <w:pPr>
-        <w:spacing w:after="40" w:before="120"/>
-        <w:jc w:val="center"/>
-      </w:pPr>
-      <w:r>
+        <w:t>Open the internal tools site and sign in with your Splash account email and password. Tap Sign In.</w:t>
+      </w:r>
+    </w:p>
+    <w:p>
+      <w:pPr>
+        <w:spacing w:before="120" w:after="40"/>
+        <w:jc w:val="center"/>
+      </w:pPr>
+      <w:r>
+        <w:rPr>
+          <w:noProof/>
+        </w:rPr>
         <w:drawing>
-          <wp:inline distT="0" distB="0" distL="0" distR="0">
-            <wp:extent cx="5905500" cy="1790700"/>
-            <wp:effectExtent t="0" r="0" b="0" l="0"/>
-            <wp:docPr id="1" name="6login.png" descr="6login.png" title="6login.png"/>
+          <wp:inline distT="0" distB="0" distL="0" distR="0" wp14:anchorId="66A42BA2" wp14:editId="286BA7BF">
+            <wp:extent cx="4267200" cy="1293925"/>
+            <wp:effectExtent l="0" t="0" r="0" b="1905"/>
+            <wp:docPr id="887824238" name="6login.png" descr="6login.png" title="6login.png"/>
             <wp:cNvGraphicFramePr>
               <a:graphicFrameLocks xmlns:a="http://schemas.openxmlformats.org/drawingml/2006/main" noChangeAspect="1"/>
             </wp:cNvGraphicFramePr>
@@ -1566,13 +1538,13 @@
               <a:graphicData uri="http://schemas.openxmlformats.org/drawingml/2006/picture">
                 <pic:pic xmlns:pic="http://schemas.openxmlformats.org/drawingml/2006/picture">
                   <pic:nvPicPr>
-                    <pic:cNvPr id="0" name="" descr=""/>
+                    <pic:cNvPr id="0" name=""/>
                     <pic:cNvPicPr>
                       <a:picLocks noChangeAspect="1" noChangeArrowheads="1"/>
                     </pic:cNvPicPr>
                   </pic:nvPicPr>
                   <pic:blipFill>
-                    <a:blip r:embed="rId12" cstate="none"/>
+                    <a:blip r:embed="rId18"/>
                     <a:srcRect/>
                     <a:stretch>
                       <a:fillRect/>
@@ -1581,7 +1553,7 @@
                   <pic:spPr bwMode="auto">
                     <a:xfrm>
                       <a:off x="0" y="0"/>
-                      <a:ext cx="5905500" cy="1790700"/>
+                      <a:ext cx="4309453" cy="1306737"/>
                     </a:xfrm>
                     <a:prstGeom prst="rect">
                       <a:avLst/>
@@ -1607,23 +1579,23 @@
           <w:sz w:val="18"/>
           <w:szCs w:val="18"/>
         </w:rPr>
-        <w:t xml:space="preserve">Sign-in screen</w:t>
+        <w:t>Sign-in screen</w:t>
       </w:r>
     </w:p>
     <w:p>
       <w:pPr>
         <w:pStyle w:val="Heading2"/>
-        <w:spacing w:after="100" w:before="220"/>
+        <w:spacing w:before="220" w:after="100"/>
       </w:pPr>
       <w:r>
         <w:rPr>
           <w:b/>
           <w:bCs/>
-          <w:color w:val="2f6fb0"/>
+          <w:color w:val="2F6FB0"/>
           <w:sz w:val="24"/>
           <w:szCs w:val="24"/>
         </w:rPr>
-        <w:t xml:space="preserve">Step 2: Open Operations</w:t>
+        <w:t>Step 2: Open Operations</w:t>
       </w:r>
     </w:p>
     <w:p>
@@ -1631,24 +1603,23 @@
         <w:spacing w:after="100"/>
       </w:pPr>
       <w:r>
-        <w:rPr>
-          <w:sz w:val="22"/>
-          <w:szCs w:val="22"/>
-        </w:rPr>
-        <w:t xml:space="preserve">On the Dashboard, find the three sections: Submissions, Operations, and Admin. Under Operations ("Damage claims, work orders, and performance tracking"), tap Open →.</w:t>
-      </w:r>
-    </w:p>
-    <w:p>
-      <w:pPr>
-        <w:spacing w:after="40" w:before="120"/>
-        <w:jc w:val="center"/>
-      </w:pPr>
-      <w:r>
+        <w:t>On the Dashboard, find the three sections: Submissions, Operations, and Admin. Under Operations ("Damage claims, work orders, and performance tracking"), tap Open →.</w:t>
+      </w:r>
+    </w:p>
+    <w:p>
+      <w:pPr>
+        <w:spacing w:before="120" w:after="40"/>
+        <w:jc w:val="center"/>
+      </w:pPr>
+      <w:r>
+        <w:rPr>
+          <w:noProof/>
+        </w:rPr>
         <w:drawing>
-          <wp:inline distT="0" distB="0" distL="0" distR="0">
+          <wp:inline distT="0" distB="0" distL="0" distR="0" wp14:anchorId="5D221747" wp14:editId="7FE3E5AA">
             <wp:extent cx="5905500" cy="1219200"/>
-            <wp:effectExtent t="0" r="0" b="0" l="0"/>
-            <wp:docPr id="1" name="7ops.png" descr="7ops.png" title="7ops.png"/>
+            <wp:effectExtent l="0" t="0" r="0" b="0"/>
+            <wp:docPr id="334106199" name="7ops.png" descr="7ops.png" title="7ops.png"/>
             <wp:cNvGraphicFramePr>
               <a:graphicFrameLocks xmlns:a="http://schemas.openxmlformats.org/drawingml/2006/main" noChangeAspect="1"/>
             </wp:cNvGraphicFramePr>
@@ -1656,13 +1627,13 @@
               <a:graphicData uri="http://schemas.openxmlformats.org/drawingml/2006/picture">
                 <pic:pic xmlns:pic="http://schemas.openxmlformats.org/drawingml/2006/picture">
                   <pic:nvPicPr>
-                    <pic:cNvPr id="0" name="" descr=""/>
+                    <pic:cNvPr id="0" name=""/>
                     <pic:cNvPicPr>
                       <a:picLocks noChangeAspect="1" noChangeArrowheads="1"/>
                     </pic:cNvPicPr>
                   </pic:nvPicPr>
                   <pic:blipFill>
-                    <a:blip r:embed="rId13" cstate="none"/>
+                    <a:blip r:embed="rId19"/>
                     <a:srcRect/>
                     <a:stretch>
                       <a:fillRect/>
@@ -1697,23 +1668,23 @@
           <w:sz w:val="18"/>
           <w:szCs w:val="18"/>
         </w:rPr>
-        <w:t xml:space="preserve">Dashboard — Operations section</w:t>
+        <w:t>Dashboard — Operations section</w:t>
       </w:r>
     </w:p>
     <w:p>
       <w:pPr>
         <w:pStyle w:val="Heading2"/>
-        <w:spacing w:after="100" w:before="220"/>
+        <w:spacing w:before="220" w:after="100"/>
       </w:pPr>
       <w:r>
         <w:rPr>
           <w:b/>
           <w:bCs/>
-          <w:color w:val="2f6fb0"/>
+          <w:color w:val="2F6FB0"/>
           <w:sz w:val="24"/>
           <w:szCs w:val="24"/>
         </w:rPr>
-        <w:t xml:space="preserve">Step 3: Open Damage Claims</w:t>
+        <w:t>Step 3: Open Damage Claims</w:t>
       </w:r>
     </w:p>
     <w:p>
@@ -1721,24 +1692,23 @@
         <w:spacing w:after="100"/>
       </w:pPr>
       <w:r>
-        <w:rPr>
-          <w:sz w:val="22"/>
-          <w:szCs w:val="22"/>
-        </w:rPr>
-        <w:t xml:space="preserve">In the Operations menu, tap Damage Claims ("Review and manage vehicle damage claims and resolutions") &gt; Open →.</w:t>
-      </w:r>
-    </w:p>
-    <w:p>
-      <w:pPr>
-        <w:spacing w:after="40" w:before="120"/>
-        <w:jc w:val="center"/>
-      </w:pPr>
-      <w:r>
+        <w:t>In the Operations menu, tap Damage Claims ("Review and manage vehicle damage claims and resolutions") &gt; Open →.</w:t>
+      </w:r>
+    </w:p>
+    <w:p>
+      <w:pPr>
+        <w:spacing w:before="120" w:after="40"/>
+        <w:jc w:val="center"/>
+      </w:pPr>
+      <w:r>
+        <w:rPr>
+          <w:noProof/>
+        </w:rPr>
         <w:drawing>
-          <wp:inline distT="0" distB="0" distL="0" distR="0">
-            <wp:extent cx="5905500" cy="2105025"/>
-            <wp:effectExtent t="0" r="0" b="0" l="0"/>
-            <wp:docPr id="1" name="8claims.png" descr="8claims.png" title="8claims.png"/>
+          <wp:inline distT="0" distB="0" distL="0" distR="0" wp14:anchorId="64EEBA05" wp14:editId="38500510">
+            <wp:extent cx="6199439" cy="2209800"/>
+            <wp:effectExtent l="0" t="0" r="0" b="0"/>
+            <wp:docPr id="105136461" name="8claims.png" descr="8claims.png" title="8claims.png"/>
             <wp:cNvGraphicFramePr>
               <a:graphicFrameLocks xmlns:a="http://schemas.openxmlformats.org/drawingml/2006/main" noChangeAspect="1"/>
             </wp:cNvGraphicFramePr>
@@ -1746,13 +1716,13 @@
               <a:graphicData uri="http://schemas.openxmlformats.org/drawingml/2006/picture">
                 <pic:pic xmlns:pic="http://schemas.openxmlformats.org/drawingml/2006/picture">
                   <pic:nvPicPr>
-                    <pic:cNvPr id="0" name="" descr=""/>
+                    <pic:cNvPr id="0" name=""/>
                     <pic:cNvPicPr>
                       <a:picLocks noChangeAspect="1" noChangeArrowheads="1"/>
                     </pic:cNvPicPr>
                   </pic:nvPicPr>
                   <pic:blipFill>
-                    <a:blip r:embed="rId14" cstate="none"/>
+                    <a:blip r:embed="rId20"/>
                     <a:srcRect/>
                     <a:stretch>
                       <a:fillRect/>
@@ -1761,7 +1731,7 @@
                   <pic:spPr bwMode="auto">
                     <a:xfrm>
                       <a:off x="0" y="0"/>
-                      <a:ext cx="5905500" cy="2105025"/>
+                      <a:ext cx="6252795" cy="2228819"/>
                     </a:xfrm>
                     <a:prstGeom prst="rect">
                       <a:avLst/>
@@ -1787,23 +1757,24 @@
           <w:sz w:val="18"/>
           <w:szCs w:val="18"/>
         </w:rPr>
-        <w:t xml:space="preserve">Operations — Damage Claims</w:t>
+        <w:lastRenderedPageBreak/>
+        <w:t>Operations — Damage Claims</w:t>
       </w:r>
     </w:p>
     <w:p>
       <w:pPr>
         <w:pStyle w:val="Heading2"/>
-        <w:spacing w:after="100" w:before="220"/>
+        <w:spacing w:before="220" w:after="100"/>
       </w:pPr>
       <w:r>
         <w:rPr>
           <w:b/>
           <w:bCs/>
-          <w:color w:val="2f6fb0"/>
+          <w:color w:val="2F6FB0"/>
           <w:sz w:val="24"/>
           <w:szCs w:val="24"/>
         </w:rPr>
-        <w:t xml:space="preserve">Step 4: Find the claim</w:t>
+        <w:t>Step 4: Find the claim</w:t>
       </w:r>
     </w:p>
     <w:p>
@@ -1811,24 +1782,23 @@
         <w:spacing w:after="100"/>
       </w:pPr>
       <w:r>
-        <w:rPr>
-          <w:sz w:val="22"/>
-          <w:szCs w:val="22"/>
-        </w:rPr>
-        <w:t xml:space="preserve">The Damage Claims list has filters across the top: Search (customer name), Location, Status, Lifecycle, Regional Director, Regional Manager, and a Submitted date range. Set any filters and tap Apply filters (or Reset to clear). Tap a claim row to open it. Export CSV downloads the current list.</w:t>
-      </w:r>
-    </w:p>
-    <w:p>
-      <w:pPr>
-        <w:spacing w:after="40" w:before="120"/>
-        <w:jc w:val="center"/>
-      </w:pPr>
-      <w:r>
+        <w:t>The Damage Claims list has filters across the top: Search (customer name), Location, Status, Lifecycle, Regional Director, Regional Manager, and a Submitted date range. Set any filters and tap Apply filters (or Reset to clear). Tap a claim row to open it. Export CSV downloads the current list.</w:t>
+      </w:r>
+    </w:p>
+    <w:p>
+      <w:pPr>
+        <w:spacing w:before="120" w:after="40"/>
+        <w:jc w:val="center"/>
+      </w:pPr>
+      <w:r>
+        <w:rPr>
+          <w:noProof/>
+        </w:rPr>
         <w:drawing>
-          <wp:inline distT="0" distB="0" distL="0" distR="0">
+          <wp:inline distT="0" distB="0" distL="0" distR="0" wp14:anchorId="3A438A0C" wp14:editId="4C13BB29">
             <wp:extent cx="5905500" cy="2886075"/>
-            <wp:effectExtent t="0" r="0" b="0" l="0"/>
-            <wp:docPr id="1" name="9filtersandclaims.png" descr="9filtersandclaims.png" title="9filtersandclaims.png"/>
+            <wp:effectExtent l="0" t="0" r="0" b="0"/>
+            <wp:docPr id="1429146188" name="9filtersandclaims.png" descr="9filtersandclaims.png" title="9filtersandclaims.png"/>
             <wp:cNvGraphicFramePr>
               <a:graphicFrameLocks xmlns:a="http://schemas.openxmlformats.org/drawingml/2006/main" noChangeAspect="1"/>
             </wp:cNvGraphicFramePr>
@@ -1836,13 +1806,13 @@
               <a:graphicData uri="http://schemas.openxmlformats.org/drawingml/2006/picture">
                 <pic:pic xmlns:pic="http://schemas.openxmlformats.org/drawingml/2006/picture">
                   <pic:nvPicPr>
-                    <pic:cNvPr id="0" name="" descr=""/>
+                    <pic:cNvPr id="0" name=""/>
                     <pic:cNvPicPr>
                       <a:picLocks noChangeAspect="1" noChangeArrowheads="1"/>
                     </pic:cNvPicPr>
                   </pic:nvPicPr>
                   <pic:blipFill>
-                    <a:blip r:embed="rId15" cstate="none"/>
+                    <a:blip r:embed="rId21"/>
                     <a:srcRect/>
                     <a:stretch>
                       <a:fillRect/>
@@ -1877,23 +1847,23 @@
           <w:sz w:val="18"/>
           <w:szCs w:val="18"/>
         </w:rPr>
-        <w:t xml:space="preserve">Damage Claims list with filters</w:t>
+        <w:t>Damage Claims list with filters</w:t>
       </w:r>
     </w:p>
     <w:p>
       <w:pPr>
         <w:pStyle w:val="Heading2"/>
-        <w:spacing w:after="100" w:before="220"/>
+        <w:spacing w:before="220" w:after="100"/>
       </w:pPr>
       <w:r>
         <w:rPr>
           <w:b/>
           <w:bCs/>
-          <w:color w:val="2f6fb0"/>
+          <w:color w:val="2F6FB0"/>
           <w:sz w:val="24"/>
           <w:szCs w:val="24"/>
         </w:rPr>
-        <w:t xml:space="preserve">Step 5: Review the claim details</w:t>
+        <w:t>Step 5: Review the claim details</w:t>
       </w:r>
     </w:p>
     <w:p>
@@ -1901,24 +1871,24 @@
         <w:spacing w:after="100"/>
       </w:pPr>
       <w:r>
-        <w:rPr>
-          <w:sz w:val="22"/>
-          <w:szCs w:val="22"/>
-        </w:rPr>
-        <w:t xml:space="preserve">The claim page shows everything the customer and staff submitted: customer contact info, vehicle, location, who submitted it, the staff Determination and Damage Type, plus Preexisting Damage and Staff Notes (what the customer was told and their demeanor). Use Add note to record follow-up, and Add document to attach a quote or receipt (see Step 8).</w:t>
-      </w:r>
-    </w:p>
-    <w:p>
-      <w:pPr>
-        <w:spacing w:after="40" w:before="120"/>
-        <w:jc w:val="center"/>
-      </w:pPr>
-      <w:r>
+        <w:t>The claim page shows everything the customer and staff submitted: customer contact info, vehicle, location, who submitted it, the staff Determination and Damage Type, plus Preexisting Damage and Staff Notes (what the customer was told and their demeanor). Use Add note to record follow-up, and Add document to attach a quote or receipt (see Step 8).</w:t>
+      </w:r>
+    </w:p>
+    <w:p>
+      <w:pPr>
+        <w:spacing w:before="120" w:after="40"/>
+        <w:jc w:val="center"/>
+      </w:pPr>
+      <w:r>
+        <w:rPr>
+          <w:noProof/>
+        </w:rPr>
+        <w:lastRenderedPageBreak/>
         <w:drawing>
-          <wp:inline distT="0" distB="0" distL="0" distR="0">
+          <wp:inline distT="0" distB="0" distL="0" distR="0" wp14:anchorId="2BFFF4B4" wp14:editId="155B6AF2">
             <wp:extent cx="5905500" cy="4581525"/>
-            <wp:effectExtent t="0" r="0" b="0" l="0"/>
-            <wp:docPr id="1" name="10overview.png" descr="10overview.png" title="10overview.png"/>
+            <wp:effectExtent l="0" t="0" r="0" b="0"/>
+            <wp:docPr id="1649674134" name="10overview.png" descr="10overview.png" title="10overview.png"/>
             <wp:cNvGraphicFramePr>
               <a:graphicFrameLocks xmlns:a="http://schemas.openxmlformats.org/drawingml/2006/main" noChangeAspect="1"/>
             </wp:cNvGraphicFramePr>
@@ -1926,13 +1896,13 @@
               <a:graphicData uri="http://schemas.openxmlformats.org/drawingml/2006/picture">
                 <pic:pic xmlns:pic="http://schemas.openxmlformats.org/drawingml/2006/picture">
                   <pic:nvPicPr>
-                    <pic:cNvPr id="0" name="" descr=""/>
+                    <pic:cNvPr id="0" name=""/>
                     <pic:cNvPicPr>
                       <a:picLocks noChangeAspect="1" noChangeArrowheads="1"/>
                     </pic:cNvPicPr>
                   </pic:nvPicPr>
                   <pic:blipFill>
-                    <a:blip r:embed="rId16" cstate="none"/>
+                    <a:blip r:embed="rId22"/>
                     <a:srcRect/>
                     <a:stretch>
                       <a:fillRect/>
@@ -1967,23 +1937,23 @@
           <w:sz w:val="18"/>
           <w:szCs w:val="18"/>
         </w:rPr>
-        <w:t xml:space="preserve">Claim overview</w:t>
+        <w:t>Claim overview</w:t>
       </w:r>
     </w:p>
     <w:p>
       <w:pPr>
         <w:pStyle w:val="Heading2"/>
-        <w:spacing w:after="100" w:before="220"/>
+        <w:spacing w:before="220" w:after="100"/>
       </w:pPr>
       <w:r>
         <w:rPr>
           <w:b/>
           <w:bCs/>
-          <w:color w:val="2f6fb0"/>
+          <w:color w:val="2F6FB0"/>
           <w:sz w:val="24"/>
           <w:szCs w:val="24"/>
         </w:rPr>
-        <w:t xml:space="preserve">Step 6: Set the Cause (fault)</w:t>
+        <w:t xml:space="preserve">Step 6: Set the Cause </w:t>
       </w:r>
     </w:p>
     <w:p>
@@ -1991,11 +1961,13 @@
         <w:spacing w:after="100"/>
       </w:pPr>
       <w:r>
-        <w:rPr>
-          <w:sz w:val="22"/>
-          <w:szCs w:val="22"/>
-        </w:rPr>
-        <w:t xml:space="preserve">Scroll to the Cause section. Every claim defaults to Undetermined. Choose the cause from the dropdown, then tap Save cause:</w:t>
+        <w:t xml:space="preserve">Scroll to the Cause section. Every claim defaults to </w:t>
+      </w:r>
+      <w:r>
+        <w:t>“Choose a cause”</w:t>
+      </w:r>
+      <w:r>
+        <w:t>. Choose the cause from the dropdown, then tap Save cause:</w:t>
       </w:r>
     </w:p>
     <w:p>
@@ -2008,11 +1980,10 @@
         <w:spacing w:after="60"/>
       </w:pPr>
       <w:r>
-        <w:rPr>
-          <w:sz w:val="22"/>
-          <w:szCs w:val="22"/>
-        </w:rPr>
-        <w:t xml:space="preserve">Undetermined — not sure yet</w:t>
+        <w:t>No Fault</w:t>
+      </w:r>
+      <w:r>
+        <w:t xml:space="preserve"> </w:t>
       </w:r>
     </w:p>
     <w:p>
@@ -2025,11 +1996,7 @@
         <w:spacing w:after="60"/>
       </w:pPr>
       <w:r>
-        <w:rPr>
-          <w:sz w:val="22"/>
-          <w:szCs w:val="22"/>
-        </w:rPr>
-        <w:t xml:space="preserve">Employee Error</w:t>
+        <w:t>Employee Error</w:t>
       </w:r>
     </w:p>
     <w:p>
@@ -2042,11 +2009,7 @@
         <w:spacing w:after="60"/>
       </w:pPr>
       <w:r>
-        <w:rPr>
-          <w:sz w:val="22"/>
-          <w:szCs w:val="22"/>
-        </w:rPr>
-        <w:t xml:space="preserve">Equipment Malfunction</w:t>
+        <w:t>Equipment Malfunction</w:t>
       </w:r>
     </w:p>
     <w:p>
@@ -2059,24 +2022,23 @@
         <w:spacing w:after="60"/>
       </w:pPr>
       <w:r>
-        <w:rPr>
-          <w:sz w:val="22"/>
-          <w:szCs w:val="22"/>
-        </w:rPr>
-        <w:t xml:space="preserve">Not Employee/Equipment</w:t>
-      </w:r>
-    </w:p>
-    <w:p>
-      <w:pPr>
-        <w:spacing w:after="40" w:before="120"/>
-        <w:jc w:val="center"/>
-      </w:pPr>
-      <w:r>
+        <w:t>Not Employee/Equipment</w:t>
+      </w:r>
+    </w:p>
+    <w:p>
+      <w:pPr>
+        <w:spacing w:before="120" w:after="40"/>
+        <w:jc w:val="center"/>
+      </w:pPr>
+      <w:r>
+        <w:rPr>
+          <w:noProof/>
+        </w:rPr>
         <w:drawing>
-          <wp:inline distT="0" distB="0" distL="0" distR="0">
-            <wp:extent cx="5905500" cy="1524000"/>
-            <wp:effectExtent t="0" r="0" b="0" l="0"/>
-            <wp:docPr id="1" name="11cause.png" descr="11cause.png" title="11cause.png"/>
+          <wp:inline distT="0" distB="0" distL="0" distR="0" wp14:anchorId="7379EA5C" wp14:editId="4CA4F96C">
+            <wp:extent cx="5943600" cy="1581150"/>
+            <wp:effectExtent l="0" t="0" r="0" b="0"/>
+            <wp:docPr id="1085733306" name="Picture 1"/>
             <wp:cNvGraphicFramePr>
               <a:graphicFrameLocks xmlns:a="http://schemas.openxmlformats.org/drawingml/2006/main" noChangeAspect="1"/>
             </wp:cNvGraphicFramePr>
@@ -2084,22 +2046,19 @@
               <a:graphicData uri="http://schemas.openxmlformats.org/drawingml/2006/picture">
                 <pic:pic xmlns:pic="http://schemas.openxmlformats.org/drawingml/2006/picture">
                   <pic:nvPicPr>
-                    <pic:cNvPr id="0" name="" descr=""/>
-                    <pic:cNvPicPr>
-                      <a:picLocks noChangeAspect="1" noChangeArrowheads="1"/>
-                    </pic:cNvPicPr>
+                    <pic:cNvPr id="1085733306" name=""/>
+                    <pic:cNvPicPr/>
                   </pic:nvPicPr>
                   <pic:blipFill>
-                    <a:blip r:embed="rId17" cstate="none"/>
-                    <a:srcRect/>
+                    <a:blip r:embed="rId23"/>
                     <a:stretch>
                       <a:fillRect/>
                     </a:stretch>
                   </pic:blipFill>
-                  <pic:spPr bwMode="auto">
+                  <pic:spPr>
                     <a:xfrm>
                       <a:off x="0" y="0"/>
-                      <a:ext cx="5905500" cy="1524000"/>
+                      <a:ext cx="5943600" cy="1581150"/>
                     </a:xfrm>
                     <a:prstGeom prst="rect">
                       <a:avLst/>
@@ -2125,23 +2084,24 @@
           <w:sz w:val="18"/>
           <w:szCs w:val="18"/>
         </w:rPr>
-        <w:t xml:space="preserve">Cause selector</w:t>
+        <w:t>Cause selector</w:t>
       </w:r>
     </w:p>
     <w:p>
       <w:pPr>
         <w:pStyle w:val="Heading2"/>
-        <w:spacing w:after="100" w:before="220"/>
+        <w:spacing w:before="220" w:after="100"/>
       </w:pPr>
       <w:r>
         <w:rPr>
           <w:b/>
           <w:bCs/>
-          <w:color w:val="2f6fb0"/>
+          <w:color w:val="2F6FB0"/>
           <w:sz w:val="24"/>
           <w:szCs w:val="24"/>
         </w:rPr>
-        <w:t xml:space="preserve">Step 7: Choose how to move forward</w:t>
+        <w:lastRenderedPageBreak/>
+        <w:t>Step 7: Choose how to move forward</w:t>
       </w:r>
     </w:p>
     <w:p>
@@ -2149,11 +2109,7 @@
         <w:spacing w:after="100"/>
       </w:pPr>
       <w:r>
-        <w:rPr>
-          <w:sz w:val="22"/>
-          <w:szCs w:val="22"/>
-        </w:rPr>
-        <w:t xml:space="preserve">The Move forward section lists the resolution actions. Pick the one that fits:</w:t>
+        <w:t>The Move forward section lists the resolution actions. Pick the one that fits:</w:t>
       </w:r>
     </w:p>
     <w:p>
@@ -2166,11 +2122,7 @@
         <w:spacing w:after="60"/>
       </w:pPr>
       <w:r>
-        <w:rPr>
-          <w:sz w:val="22"/>
-          <w:szCs w:val="22"/>
-        </w:rPr>
-        <w:t xml:space="preserve">Approve - Pending Quotes — approve the claim; it now waits on quotes/estimates.</w:t>
+        <w:t>Approve - Pending Quotes — approve the claim; it now waits on quotes/estimates.</w:t>
       </w:r>
     </w:p>
     <w:p>
@@ -2183,11 +2135,21 @@
         <w:spacing w:after="60"/>
       </w:pPr>
       <w:r>
-        <w:rPr>
-          <w:sz w:val="22"/>
-          <w:szCs w:val="22"/>
-        </w:rPr>
-        <w:t xml:space="preserve">Approve - In House (Parts Ordered) — handle the repair in house. Optional Parts and Vendor fields.</w:t>
+        <w:t>Approve - In House (Parts Ordered) — handle the repair in house. Optional Parts and Vendor fields.</w:t>
+      </w:r>
+      <w:r>
+        <w:t xml:space="preserve"> </w:t>
+      </w:r>
+      <w:r>
+        <w:rPr>
+          <w:b/>
+          <w:bCs/>
+          <w:color w:val="2F6FB0"/>
+        </w:rPr>
+        <w:t>Note</w:t>
+      </w:r>
+      <w:r>
+        <w:t xml:space="preserve">: Receipt(s) must be added to “Add Document” for in house repairs.  </w:t>
       </w:r>
     </w:p>
     <w:p>
@@ -2200,11 +2162,7 @@
         <w:spacing w:after="60"/>
       </w:pPr>
       <w:r>
-        <w:rPr>
-          <w:sz w:val="22"/>
-          <w:szCs w:val="22"/>
-        </w:rPr>
-        <w:t xml:space="preserve">Send to RM Review — escalate to the Regional Manager.</w:t>
+        <w:t>Send to RM Review — escalate to the Regional Manager.</w:t>
       </w:r>
     </w:p>
     <w:p>
@@ -2217,24 +2175,72 @@
         <w:spacing w:after="60"/>
       </w:pPr>
       <w:r>
-        <w:rPr>
-          <w:sz w:val="22"/>
-          <w:szCs w:val="22"/>
-        </w:rPr>
-        <w:t xml:space="preserve">Deny — close the claim as denied.</w:t>
-      </w:r>
-    </w:p>
-    <w:p>
-      <w:pPr>
-        <w:spacing w:after="40" w:before="120"/>
-        <w:jc w:val="center"/>
-      </w:pPr>
-      <w:r>
+        <w:t>Deny — close the claim as denied.</w:t>
+      </w:r>
+    </w:p>
+    <w:p>
+      <w:pPr>
+        <w:pStyle w:val="ListParagraph"/>
+        <w:numPr>
+          <w:ilvl w:val="0"/>
+          <w:numId w:val="3"/>
+        </w:numPr>
+        <w:pBdr>
+          <w:left w:val="single" w:sz="18" w:space="8" w:color="2F6FB0"/>
+        </w:pBdr>
+        <w:shd w:val="clear" w:color="auto" w:fill="EEF2FB"/>
+        <w:spacing w:before="60" w:after="160"/>
+      </w:pPr>
+      <w:r>
+        <w:rPr>
+          <w:b/>
+          <w:bCs/>
+          <w:color w:val="2F6FB0"/>
+        </w:rPr>
+        <w:t>Note</w:t>
+      </w:r>
+      <w:r>
+        <w:rPr>
+          <w:b/>
+          <w:bCs/>
+          <w:color w:val="2F6FB0"/>
+        </w:rPr>
+        <w:t xml:space="preserve">: </w:t>
+      </w:r>
+      <w:r>
+        <w:t>Claims that were denied a</w:t>
+      </w:r>
+      <w:r>
+        <w:t>t</w:t>
+      </w:r>
+      <w:r>
+        <w:t xml:space="preserve"> the time the form was submitted still need to be denied in the admin view in order to CLOSE the claim. </w:t>
+      </w:r>
+    </w:p>
+    <w:p>
+      <w:pPr>
+        <w:spacing w:after="60"/>
+      </w:pPr>
+    </w:p>
+    <w:p>
+      <w:pPr>
+        <w:spacing w:after="60"/>
+      </w:pPr>
+    </w:p>
+    <w:p>
+      <w:pPr>
+        <w:spacing w:before="120" w:after="40"/>
+        <w:jc w:val="center"/>
+      </w:pPr>
+      <w:r>
+        <w:rPr>
+          <w:noProof/>
+        </w:rPr>
         <w:drawing>
-          <wp:inline distT="0" distB="0" distL="0" distR="0">
+          <wp:inline distT="0" distB="0" distL="0" distR="0" wp14:anchorId="22DA4693" wp14:editId="2AD24A39">
             <wp:extent cx="5905500" cy="2895600"/>
-            <wp:effectExtent t="0" r="0" b="0" l="0"/>
-            <wp:docPr id="1" name="12moveforward.png" descr="12moveforward.png" title="12moveforward.png"/>
+            <wp:effectExtent l="0" t="0" r="0" b="0"/>
+            <wp:docPr id="761264291" name="12moveforward.png" descr="12moveforward.png" title="12moveforward.png"/>
             <wp:cNvGraphicFramePr>
               <a:graphicFrameLocks xmlns:a="http://schemas.openxmlformats.org/drawingml/2006/main" noChangeAspect="1"/>
             </wp:cNvGraphicFramePr>
@@ -2242,13 +2248,13 @@
               <a:graphicData uri="http://schemas.openxmlformats.org/drawingml/2006/picture">
                 <pic:pic xmlns:pic="http://schemas.openxmlformats.org/drawingml/2006/picture">
                   <pic:nvPicPr>
-                    <pic:cNvPr id="0" name="" descr=""/>
+                    <pic:cNvPr id="0" name=""/>
                     <pic:cNvPicPr>
                       <a:picLocks noChangeAspect="1" noChangeArrowheads="1"/>
                     </pic:cNvPicPr>
                   </pic:nvPicPr>
                   <pic:blipFill>
-                    <a:blip r:embed="rId18" cstate="none"/>
+                    <a:blip r:embed="rId24"/>
                     <a:srcRect/>
                     <a:stretch>
                       <a:fillRect/>
@@ -2274,8 +2280,6 @@
       <w:pPr>
         <w:spacing w:after="200"/>
         <w:jc w:val="center"/>
-      </w:pPr>
-      <w:r>
         <w:rPr>
           <w:i/>
           <w:iCs/>
@@ -2283,46 +2287,238 @@
           <w:sz w:val="18"/>
           <w:szCs w:val="18"/>
         </w:rPr>
-        <w:t xml:space="preserve">Move forward — resolution actions</w:t>
-      </w:r>
+      </w:pPr>
+      <w:r>
+        <w:rPr>
+          <w:i/>
+          <w:iCs/>
+          <w:color w:val="555555"/>
+          <w:sz w:val="18"/>
+          <w:szCs w:val="18"/>
+        </w:rPr>
+        <w:t>Move forward — resolution actions</w:t>
+      </w:r>
+    </w:p>
+    <w:p>
+      <w:pPr>
+        <w:spacing w:after="200"/>
+        <w:jc w:val="center"/>
+        <w:rPr>
+          <w:i/>
+          <w:iCs/>
+          <w:color w:val="555555"/>
+          <w:sz w:val="18"/>
+          <w:szCs w:val="18"/>
+        </w:rPr>
+      </w:pPr>
+    </w:p>
+    <w:p>
+      <w:pPr>
+        <w:spacing w:after="200"/>
+        <w:jc w:val="center"/>
+        <w:rPr>
+          <w:i/>
+          <w:iCs/>
+          <w:color w:val="555555"/>
+          <w:sz w:val="18"/>
+          <w:szCs w:val="18"/>
+        </w:rPr>
+      </w:pPr>
+    </w:p>
+    <w:p>
+      <w:pPr>
+        <w:spacing w:after="200"/>
+        <w:jc w:val="center"/>
+        <w:rPr>
+          <w:i/>
+          <w:iCs/>
+          <w:color w:val="555555"/>
+          <w:sz w:val="18"/>
+          <w:szCs w:val="18"/>
+        </w:rPr>
+      </w:pPr>
+    </w:p>
+    <w:p>
+      <w:pPr>
+        <w:spacing w:after="200"/>
+        <w:jc w:val="center"/>
+        <w:rPr>
+          <w:i/>
+          <w:iCs/>
+          <w:color w:val="555555"/>
+          <w:sz w:val="18"/>
+          <w:szCs w:val="18"/>
+        </w:rPr>
+      </w:pPr>
+    </w:p>
+    <w:p>
+      <w:pPr>
+        <w:spacing w:after="200"/>
+        <w:jc w:val="center"/>
+        <w:rPr>
+          <w:i/>
+          <w:iCs/>
+          <w:color w:val="555555"/>
+          <w:sz w:val="18"/>
+          <w:szCs w:val="18"/>
+        </w:rPr>
+      </w:pPr>
+    </w:p>
+    <w:p>
+      <w:pPr>
+        <w:spacing w:after="200"/>
+        <w:rPr>
+          <w:i/>
+          <w:iCs/>
+          <w:color w:val="555555"/>
+          <w:sz w:val="18"/>
+          <w:szCs w:val="18"/>
+        </w:rPr>
+      </w:pPr>
+    </w:p>
+    <w:p>
+      <w:pPr>
+        <w:spacing w:after="200"/>
+      </w:pPr>
     </w:p>
     <w:p>
       <w:pPr>
         <w:pBdr>
-          <w:left w:val="single" w:color="2f6fb0" w:sz="18" w:space="8"/>
+          <w:left w:val="single" w:sz="18" w:space="8" w:color="2F6FB0"/>
         </w:pBdr>
-        <w:shd w:fill="eef2fb" w:color="auto" w:val="clear"/>
-        <w:spacing w:after="160" w:before="60"/>
+        <w:shd w:val="clear" w:color="auto" w:fill="EEF2FB"/>
+        <w:spacing w:before="60" w:after="160"/>
       </w:pPr>
       <w:r>
         <w:rPr>
           <w:b/>
           <w:bCs/>
-          <w:color w:val="2f6fb0"/>
-          <w:sz w:val="22"/>
-          <w:szCs w:val="22"/>
+          <w:color w:val="2F6FB0"/>
         </w:rPr>
         <w:t xml:space="preserve">Tip: </w:t>
       </w:r>
       <w:r>
-        <w:rPr>
-          <w:sz w:val="22"/>
-          <w:szCs w:val="22"/>
-        </w:rPr>
-        <w:t xml:space="preserve">The uploaded claim photos (Vehicle Overview, VIN, Damage, License Plate) appear on the claim page for reference while you decide.</w:t>
-      </w:r>
-    </w:p>
-    <w:p>
-      <w:pPr>
-        <w:spacing w:after="40" w:before="120"/>
-        <w:jc w:val="center"/>
-      </w:pPr>
-      <w:r>
+        <w:t>The uploaded claim photos (Vehicle Overview, VIN, Damage, License Plate) appear on the claim page for reference while you decide.</w:t>
+      </w:r>
+    </w:p>
+    <w:p>
+      <w:pPr>
+        <w:spacing w:before="120" w:after="40"/>
+        <w:jc w:val="center"/>
+      </w:pPr>
+    </w:p>
+    <w:p>
+      <w:pPr>
+        <w:spacing w:after="200"/>
+        <w:jc w:val="center"/>
+      </w:pPr>
+      <w:r>
+        <w:rPr>
+          <w:i/>
+          <w:iCs/>
+          <w:color w:val="555555"/>
+          <w:sz w:val="18"/>
+          <w:szCs w:val="18"/>
+        </w:rPr>
+        <w:lastRenderedPageBreak/>
+        <w:t>Claim photos on the claim page</w:t>
+      </w:r>
+    </w:p>
+    <w:p>
+      <w:pPr>
+        <w:pStyle w:val="Heading2"/>
+        <w:spacing w:before="220" w:after="100"/>
+      </w:pPr>
+      <w:r>
+        <w:rPr>
+          <w:b/>
+          <w:bCs/>
+          <w:color w:val="2F6FB0"/>
+          <w:sz w:val="24"/>
+          <w:szCs w:val="24"/>
+        </w:rPr>
+        <w:t>Step 8: Upload a quote or receipt</w:t>
+      </w:r>
+      <w:r>
+        <w:rPr>
+          <w:b/>
+          <w:bCs/>
+          <w:color w:val="2F6FB0"/>
+          <w:sz w:val="24"/>
+          <w:szCs w:val="24"/>
+        </w:rPr>
+        <w:t xml:space="preserve"> (if claim is approved)</w:t>
+      </w:r>
+    </w:p>
+    <w:p>
+      <w:pPr>
+        <w:spacing w:after="100"/>
+      </w:pPr>
+      <w:r>
+        <w:t>To attach an estimate or receipt, use Add document. Attach a Quote or Receipt (PDF, JPG, PNG, or HEIC; up to 10 MB) and fill in the fields:</w:t>
+      </w:r>
+    </w:p>
+    <w:p>
+      <w:pPr>
+        <w:pStyle w:val="ListParagraph"/>
+        <w:numPr>
+          <w:ilvl w:val="0"/>
+          <w:numId w:val="3"/>
+        </w:numPr>
+        <w:spacing w:after="60"/>
+      </w:pPr>
+      <w:r>
+        <w:t>Document Type — Quote or Receipt</w:t>
+      </w:r>
+    </w:p>
+    <w:p>
+      <w:pPr>
+        <w:pStyle w:val="ListParagraph"/>
+        <w:numPr>
+          <w:ilvl w:val="0"/>
+          <w:numId w:val="3"/>
+        </w:numPr>
+        <w:spacing w:after="60"/>
+      </w:pPr>
+      <w:r>
+        <w:t>File — tap Choose File and select the document</w:t>
+      </w:r>
+    </w:p>
+    <w:p>
+      <w:pPr>
+        <w:pStyle w:val="ListParagraph"/>
+        <w:numPr>
+          <w:ilvl w:val="0"/>
+          <w:numId w:val="3"/>
+        </w:numPr>
+        <w:spacing w:after="60"/>
+      </w:pPr>
+      <w:r>
+        <w:t>Vendor, Amount ($), Pay To (e.g. Customer or the vendor), Vendor Address, and Notes</w:t>
+      </w:r>
+    </w:p>
+    <w:p>
+      <w:pPr>
+        <w:spacing w:after="100"/>
+      </w:pPr>
+      <w:r>
+        <w:t>Important: To generate a check-request PDF later, a Quote must include an Amount and a Pay To. If paying the vendor directly, also fill in the Vendor name and Vendor Address. Tap Upload document.</w:t>
+      </w:r>
+    </w:p>
+    <w:p>
+      <w:pPr>
+        <w:spacing w:before="120" w:after="40"/>
+        <w:jc w:val="center"/>
+      </w:pPr>
+      <w:r>
+        <w:rPr>
+          <w:noProof/>
+        </w:rPr>
         <w:drawing>
-          <wp:inline distT="0" distB="0" distL="0" distR="0">
-            <wp:extent cx="2857500" cy="7258050"/>
-            <wp:effectExtent t="0" r="0" b="0" l="0"/>
-            <wp:docPr id="1" name="13claimphotos.png" descr="13claimphotos.png" title="13claimphotos.png"/>
+          <wp:inline distT="0" distB="0" distL="0" distR="0" wp14:anchorId="55523A3A" wp14:editId="4E909497">
+            <wp:extent cx="5905500" cy="2743200"/>
+            <wp:effectExtent l="0" t="0" r="0" b="0"/>
+            <wp:docPr id="1741002592" name="14uploaddoc.png" descr="14uploaddoc.png" title="14uploaddoc.png"/>
             <wp:cNvGraphicFramePr>
               <a:graphicFrameLocks xmlns:a="http://schemas.openxmlformats.org/drawingml/2006/main" noChangeAspect="1"/>
             </wp:cNvGraphicFramePr>
@@ -2330,166 +2526,13 @@
               <a:graphicData uri="http://schemas.openxmlformats.org/drawingml/2006/picture">
                 <pic:pic xmlns:pic="http://schemas.openxmlformats.org/drawingml/2006/picture">
                   <pic:nvPicPr>
-                    <pic:cNvPr id="0" name="" descr=""/>
+                    <pic:cNvPr id="0" name=""/>
                     <pic:cNvPicPr>
                       <a:picLocks noChangeAspect="1" noChangeArrowheads="1"/>
                     </pic:cNvPicPr>
                   </pic:nvPicPr>
                   <pic:blipFill>
-                    <a:blip r:embed="rId19" cstate="none"/>
-                    <a:srcRect/>
-                    <a:stretch>
-                      <a:fillRect/>
-                    </a:stretch>
-                  </pic:blipFill>
-                  <pic:spPr bwMode="auto">
-                    <a:xfrm>
-                      <a:off x="0" y="0"/>
-                      <a:ext cx="2857500" cy="7258050"/>
-                    </a:xfrm>
-                    <a:prstGeom prst="rect">
-                      <a:avLst/>
-                    </a:prstGeom>
-                  </pic:spPr>
-                </pic:pic>
-              </a:graphicData>
-            </a:graphic>
-          </wp:inline>
-        </w:drawing>
-      </w:r>
-    </w:p>
-    <w:p>
-      <w:pPr>
-        <w:spacing w:after="200"/>
-        <w:jc w:val="center"/>
-      </w:pPr>
-      <w:r>
-        <w:rPr>
-          <w:i/>
-          <w:iCs/>
-          <w:color w:val="555555"/>
-          <w:sz w:val="18"/>
-          <w:szCs w:val="18"/>
-        </w:rPr>
-        <w:t xml:space="preserve">Claim photos on the claim page</w:t>
-      </w:r>
-    </w:p>
-    <w:p>
-      <w:pPr>
-        <w:pStyle w:val="Heading2"/>
-        <w:spacing w:after="100" w:before="220"/>
-      </w:pPr>
-      <w:r>
-        <w:rPr>
-          <w:b/>
-          <w:bCs/>
-          <w:color w:val="2f6fb0"/>
-          <w:sz w:val="24"/>
-          <w:szCs w:val="24"/>
-        </w:rPr>
-        <w:t xml:space="preserve">Step 8: Upload a quote or receipt</w:t>
-      </w:r>
-    </w:p>
-    <w:p>
-      <w:pPr>
-        <w:spacing w:after="100"/>
-      </w:pPr>
-      <w:r>
-        <w:rPr>
-          <w:sz w:val="22"/>
-          <w:szCs w:val="22"/>
-        </w:rPr>
-        <w:t xml:space="preserve">To attach an estimate or receipt, use Add document. Attach a Quote or Receipt (PDF, JPG, PNG, or HEIC; up to 10 MB) and fill in the fields:</w:t>
-      </w:r>
-    </w:p>
-    <w:p>
-      <w:pPr>
-        <w:pStyle w:val="ListParagraph"/>
-        <w:numPr>
-          <w:ilvl w:val="0"/>
-          <w:numId w:val="3"/>
-        </w:numPr>
-        <w:spacing w:after="60"/>
-      </w:pPr>
-      <w:r>
-        <w:rPr>
-          <w:sz w:val="22"/>
-          <w:szCs w:val="22"/>
-        </w:rPr>
-        <w:t xml:space="preserve">Document Type — Quote or Receipt</w:t>
-      </w:r>
-    </w:p>
-    <w:p>
-      <w:pPr>
-        <w:pStyle w:val="ListParagraph"/>
-        <w:numPr>
-          <w:ilvl w:val="0"/>
-          <w:numId w:val="3"/>
-        </w:numPr>
-        <w:spacing w:after="60"/>
-      </w:pPr>
-      <w:r>
-        <w:rPr>
-          <w:sz w:val="22"/>
-          <w:szCs w:val="22"/>
-        </w:rPr>
-        <w:t xml:space="preserve">File — tap Choose File and select the document</w:t>
-      </w:r>
-    </w:p>
-    <w:p>
-      <w:pPr>
-        <w:pStyle w:val="ListParagraph"/>
-        <w:numPr>
-          <w:ilvl w:val="0"/>
-          <w:numId w:val="3"/>
-        </w:numPr>
-        <w:spacing w:after="60"/>
-      </w:pPr>
-      <w:r>
-        <w:rPr>
-          <w:sz w:val="22"/>
-          <w:szCs w:val="22"/>
-        </w:rPr>
-        <w:t xml:space="preserve">Vendor, Amount ($), Pay To (e.g. Customer or the vendor), Vendor Address, and Notes</w:t>
-      </w:r>
-    </w:p>
-    <w:p>
-      <w:pPr>
-        <w:spacing w:after="100"/>
-      </w:pPr>
-      <w:r>
-        <w:rPr>
-          <w:sz w:val="22"/>
-          <w:szCs w:val="22"/>
-        </w:rPr>
-        <w:t xml:space="preserve">Important: To generate a check-request PDF later, a Quote must include an Amount and a Pay To. If paying the vendor directly, also fill in the Vendor name and Vendor Address. Tap Upload document.</w:t>
-      </w:r>
-    </w:p>
-    <w:p>
-      <w:pPr>
-        <w:spacing w:after="40" w:before="120"/>
-        <w:jc w:val="center"/>
-      </w:pPr>
-      <w:r>
-        <w:drawing>
-          <wp:inline distT="0" distB="0" distL="0" distR="0">
-            <wp:extent cx="5905500" cy="2743200"/>
-            <wp:effectExtent t="0" r="0" b="0" l="0"/>
-            <wp:docPr id="1" name="14uploaddoc.png" descr="14uploaddoc.png" title="14uploaddoc.png"/>
-            <wp:cNvGraphicFramePr>
-              <a:graphicFrameLocks xmlns:a="http://schemas.openxmlformats.org/drawingml/2006/main" noChangeAspect="1"/>
-            </wp:cNvGraphicFramePr>
-            <a:graphic xmlns:a="http://schemas.openxmlformats.org/drawingml/2006/main">
-              <a:graphicData uri="http://schemas.openxmlformats.org/drawingml/2006/picture">
-                <pic:pic xmlns:pic="http://schemas.openxmlformats.org/drawingml/2006/picture">
-                  <pic:nvPicPr>
-                    <pic:cNvPr id="0" name="" descr=""/>
-                    <pic:cNvPicPr>
-                      <a:picLocks noChangeAspect="1" noChangeArrowheads="1"/>
-                    </pic:cNvPicPr>
-                  </pic:nvPicPr>
-                  <pic:blipFill>
-                    <a:blip r:embed="rId20" cstate="none"/>
+                    <a:blip r:embed="rId25"/>
                     <a:srcRect/>
                     <a:stretch>
                       <a:fillRect/>
@@ -2524,20 +2567,23 @@
           <w:sz w:val="18"/>
           <w:szCs w:val="18"/>
         </w:rPr>
-        <w:t xml:space="preserve">Add document form</w:t>
-      </w:r>
-    </w:p>
-    <w:p>
-      <w:pPr>
-        <w:spacing w:after="40" w:before="120"/>
-        <w:jc w:val="center"/>
-      </w:pPr>
-      <w:r>
+        <w:t>Add document form</w:t>
+      </w:r>
+    </w:p>
+    <w:p>
+      <w:pPr>
+        <w:spacing w:before="120" w:after="40"/>
+        <w:jc w:val="center"/>
+      </w:pPr>
+      <w:r>
+        <w:rPr>
+          <w:noProof/>
+        </w:rPr>
         <w:drawing>
-          <wp:inline distT="0" distB="0" distL="0" distR="0">
+          <wp:inline distT="0" distB="0" distL="0" distR="0" wp14:anchorId="1BA156AD" wp14:editId="1786DAF4">
             <wp:extent cx="5905500" cy="2733675"/>
-            <wp:effectExtent t="0" r="0" b="0" l="0"/>
-            <wp:docPr id="1" name="15uploaddocfilled.png" descr="15uploaddocfilled.png" title="15uploaddocfilled.png"/>
+            <wp:effectExtent l="0" t="0" r="0" b="0"/>
+            <wp:docPr id="908277963" name="15uploaddocfilled.png" descr="15uploaddocfilled.png" title="15uploaddocfilled.png"/>
             <wp:cNvGraphicFramePr>
               <a:graphicFrameLocks xmlns:a="http://schemas.openxmlformats.org/drawingml/2006/main" noChangeAspect="1"/>
             </wp:cNvGraphicFramePr>
@@ -2545,13 +2591,13 @@
               <a:graphicData uri="http://schemas.openxmlformats.org/drawingml/2006/picture">
                 <pic:pic xmlns:pic="http://schemas.openxmlformats.org/drawingml/2006/picture">
                   <pic:nvPicPr>
-                    <pic:cNvPr id="0" name="" descr=""/>
+                    <pic:cNvPr id="0" name=""/>
                     <pic:cNvPicPr>
                       <a:picLocks noChangeAspect="1" noChangeArrowheads="1"/>
                     </pic:cNvPicPr>
                   </pic:nvPicPr>
                   <pic:blipFill>
-                    <a:blip r:embed="rId21" cstate="none"/>
+                    <a:blip r:embed="rId26"/>
                     <a:srcRect/>
                     <a:stretch>
                       <a:fillRect/>
@@ -2586,23 +2632,36 @@
           <w:sz w:val="18"/>
           <w:szCs w:val="18"/>
         </w:rPr>
-        <w:t xml:space="preserve">Add document — filled in</w:t>
+        <w:t>Add document — filled in</w:t>
       </w:r>
     </w:p>
     <w:p>
       <w:pPr>
         <w:pStyle w:val="Heading2"/>
-        <w:spacing w:after="100" w:before="220"/>
-      </w:pPr>
-      <w:r>
+        <w:spacing w:before="220" w:after="100"/>
         <w:rPr>
           <w:b/>
           <w:bCs/>
-          <w:color w:val="2f6fb0"/>
+          <w:color w:val="2F6FB0"/>
           <w:sz w:val="24"/>
           <w:szCs w:val="24"/>
         </w:rPr>
-        <w:t xml:space="preserve">Step 9: Approve into Pending Quotes</w:t>
+      </w:pPr>
+    </w:p>
+    <w:p>
+      <w:pPr>
+        <w:pStyle w:val="Heading2"/>
+        <w:spacing w:before="220" w:after="100"/>
+      </w:pPr>
+      <w:r>
+        <w:rPr>
+          <w:b/>
+          <w:bCs/>
+          <w:color w:val="2F6FB0"/>
+          <w:sz w:val="24"/>
+          <w:szCs w:val="24"/>
+        </w:rPr>
+        <w:t>Step 9: Approve into Pending Quotes</w:t>
       </w:r>
     </w:p>
     <w:p>
@@ -2610,24 +2669,31 @@
         <w:spacing w:after="100"/>
       </w:pPr>
       <w:r>
-        <w:rPr>
-          <w:sz w:val="22"/>
-          <w:szCs w:val="22"/>
-        </w:rPr>
-        <w:t xml:space="preserve">When you approve a claim into Pending Quotes, a confirmation asks "Was this damage equipment related?" The employee's original answer is pre-filled, but you can override it. Choosing Yes creates a MaintainX work order assigned to maintenance. Tap Confirm - Approve - Pending Quotes.</w:t>
-      </w:r>
-    </w:p>
-    <w:p>
-      <w:pPr>
-        <w:spacing w:after="40" w:before="120"/>
-        <w:jc w:val="center"/>
-      </w:pPr>
-      <w:r>
+        <w:t xml:space="preserve">When you approve a claim into Pending Quotes, a confirmation asks "Was this damage equipment related?" The employee's original answer is pre-filled, but you can override it. Choosing Yes creates a </w:t>
+      </w:r>
+      <w:proofErr w:type="spellStart"/>
+      <w:r>
+        <w:t>MaintainX</w:t>
+      </w:r>
+      <w:proofErr w:type="spellEnd"/>
+      <w:r>
+        <w:t xml:space="preserve"> work order assigned to maintenance. Tap Confirm - Approve - Pending Quotes.</w:t>
+      </w:r>
+    </w:p>
+    <w:p>
+      <w:pPr>
+        <w:spacing w:before="120" w:after="40"/>
+        <w:jc w:val="center"/>
+      </w:pPr>
+      <w:r>
+        <w:rPr>
+          <w:noProof/>
+        </w:rPr>
         <w:drawing>
-          <wp:inline distT="0" distB="0" distL="0" distR="0">
+          <wp:inline distT="0" distB="0" distL="0" distR="0" wp14:anchorId="2B8A8DA5" wp14:editId="7D68C5F5">
             <wp:extent cx="4314825" cy="2647950"/>
-            <wp:effectExtent t="0" r="0" b="0" l="0"/>
-            <wp:docPr id="1" name="16ifapprovedfrombackend.png" descr="16ifapprovedfrombackend.png" title="16ifapprovedfrombackend.png"/>
+            <wp:effectExtent l="0" t="0" r="0" b="0"/>
+            <wp:docPr id="1569806180" name="16ifapprovedfrombackend.png" descr="16ifapprovedfrombackend.png" title="16ifapprovedfrombackend.png"/>
             <wp:cNvGraphicFramePr>
               <a:graphicFrameLocks xmlns:a="http://schemas.openxmlformats.org/drawingml/2006/main" noChangeAspect="1"/>
             </wp:cNvGraphicFramePr>
@@ -2635,13 +2701,13 @@
               <a:graphicData uri="http://schemas.openxmlformats.org/drawingml/2006/picture">
                 <pic:pic xmlns:pic="http://schemas.openxmlformats.org/drawingml/2006/picture">
                   <pic:nvPicPr>
-                    <pic:cNvPr id="0" name="" descr=""/>
+                    <pic:cNvPr id="0" name=""/>
                     <pic:cNvPicPr>
                       <a:picLocks noChangeAspect="1" noChangeArrowheads="1"/>
                     </pic:cNvPicPr>
                   </pic:nvPicPr>
                   <pic:blipFill>
-                    <a:blip r:embed="rId22" cstate="none"/>
+                    <a:blip r:embed="rId27"/>
                     <a:srcRect/>
                     <a:stretch>
                       <a:fillRect/>
@@ -2676,23 +2742,23 @@
           <w:sz w:val="18"/>
           <w:szCs w:val="18"/>
         </w:rPr>
-        <w:t xml:space="preserve">Equipment-related confirmation</w:t>
+        <w:t>Equipment-related confirmation</w:t>
       </w:r>
     </w:p>
     <w:p>
       <w:pPr>
         <w:pStyle w:val="Heading2"/>
-        <w:spacing w:after="100" w:before="220"/>
+        <w:spacing w:before="220" w:after="100"/>
       </w:pPr>
       <w:r>
         <w:rPr>
           <w:b/>
           <w:bCs/>
-          <w:color w:val="2f6fb0"/>
+          <w:color w:val="2F6FB0"/>
           <w:sz w:val="24"/>
           <w:szCs w:val="24"/>
         </w:rPr>
-        <w:t xml:space="preserve">Step 10: Approve the quote and submit the check request</w:t>
+        <w:t>Step 10: Approve the quote and submit the check request</w:t>
       </w:r>
     </w:p>
     <w:p>
@@ -2700,24 +2766,36 @@
         <w:spacing w:after="100"/>
       </w:pPr>
       <w:r>
-        <w:rPr>
-          <w:sz w:val="22"/>
-          <w:szCs w:val="22"/>
-        </w:rPr>
-        <w:t xml:space="preserve">After a quote is added, the Move forward section shows Approve Quote (submit Check Request). Pick the quote from the Quote to approve dropdown (each is listed as #ID - $Amount), then tap Approve Quote (submit Check Request). This submits the check request and moves the claim to Approved - Check Request Submitted.</w:t>
-      </w:r>
-    </w:p>
-    <w:p>
-      <w:pPr>
-        <w:spacing w:after="40" w:before="120"/>
-        <w:jc w:val="center"/>
-      </w:pPr>
-      <w:r>
+        <w:t>After a quote is added, the Move forward section shows Approve Quote (submit Check Request). Pick the quote from the Quote to approve dropdown (each is listed as #ID - $Amount), then tap Approve Quote (submit Check Request). This submits the check request and moves the claim to Approved - Check Request Submitted.</w:t>
+      </w:r>
+    </w:p>
+    <w:p>
+      <w:pPr>
+        <w:spacing w:after="100"/>
+      </w:pPr>
+    </w:p>
+    <w:p>
+      <w:pPr>
+        <w:spacing w:after="100"/>
+      </w:pPr>
+      <w:r>
+        <w:t xml:space="preserve">This will send the check request to Incidents to be reviewed and submitted to AP for payment. </w:t>
+      </w:r>
+    </w:p>
+    <w:p>
+      <w:pPr>
+        <w:spacing w:before="120" w:after="40"/>
+        <w:jc w:val="center"/>
+      </w:pPr>
+      <w:r>
+        <w:rPr>
+          <w:noProof/>
+        </w:rPr>
         <w:drawing>
-          <wp:inline distT="0" distB="0" distL="0" distR="0">
+          <wp:inline distT="0" distB="0" distL="0" distR="0" wp14:anchorId="377F5219" wp14:editId="2A7D59EE">
             <wp:extent cx="5905500" cy="1152525"/>
-            <wp:effectExtent t="0" r="0" b="0" l="0"/>
-            <wp:docPr id="1" name="17onceapprovedandquoteadded.png" descr="17onceapprovedandquoteadded.png" title="17onceapprovedandquoteadded.png"/>
+            <wp:effectExtent l="0" t="0" r="0" b="0"/>
+            <wp:docPr id="1625732002" name="17onceapprovedandquoteadded.png" descr="17onceapprovedandquoteadded.png" title="17onceapprovedandquoteadded.png"/>
             <wp:cNvGraphicFramePr>
               <a:graphicFrameLocks xmlns:a="http://schemas.openxmlformats.org/drawingml/2006/main" noChangeAspect="1"/>
             </wp:cNvGraphicFramePr>
@@ -2725,13 +2803,13 @@
               <a:graphicData uri="http://schemas.openxmlformats.org/drawingml/2006/picture">
                 <pic:pic xmlns:pic="http://schemas.openxmlformats.org/drawingml/2006/picture">
                   <pic:nvPicPr>
-                    <pic:cNvPr id="0" name="" descr=""/>
+                    <pic:cNvPr id="0" name=""/>
                     <pic:cNvPicPr>
                       <a:picLocks noChangeAspect="1" noChangeArrowheads="1"/>
                     </pic:cNvPicPr>
                   </pic:nvPicPr>
                   <pic:blipFill>
-                    <a:blip r:embed="rId23" cstate="none"/>
+                    <a:blip r:embed="rId28"/>
                     <a:srcRect/>
                     <a:stretch>
                       <a:fillRect/>
@@ -2766,102 +2844,80 @@
           <w:sz w:val="18"/>
           <w:szCs w:val="18"/>
         </w:rPr>
-        <w:t xml:space="preserve">Approve quote and submit check request</w:t>
+        <w:t>Approve quote and submit check request</w:t>
       </w:r>
     </w:p>
     <w:sectPr>
-      <w:pgSz w:w="12240" w:h="15840" w:orient="portrait"/>
+      <w:pgSz w:w="12240" w:h="15840"/>
       <w:pgMar w:top="1440" w:right="1440" w:bottom="1440" w:left="1440" w:header="708" w:footer="708" w:gutter="0"/>
-      <w:pgNumType/>
+      <w:cols w:space="720"/>
       <w:docGrid w:linePitch="360"/>
     </w:sectPr>
   </w:body>
 </w:document>
 </file>
 
-<file path=word/comments.xml><?xml version="1.0" encoding="utf-8"?>
-<w:comments xmlns:cx="http://schemas.microsoft.com/office/drawing/2014/chartex" xmlns:cx1="http://schemas.microsoft.com/office/drawing/2015/9/8/chartex" xmlns:cx2="http://schemas.microsoft.com/office/drawing/2015/10/21/chartex" xmlns:cx3="http://schemas.microsoft.com/office/drawing/2016/5/9/chartex" xmlns:cx4="http://schemas.microsoft.com/office/drawing/2016/5/10/chartex" xmlns:cx5="http://schemas.microsoft.com/office/drawing/2016/5/11/chartex" xmlns:cx6="http://schemas.microsoft.com/office/drawing/2016/5/12/chartex" xmlns:cx7="http://schemas.microsoft.com/office/drawing/2016/5/13/chartex" xmlns:cx8="http://schemas.microsoft.com/office/drawing/2016/5/14/chartex" xmlns:mc="http://schemas.openxmlformats.org/markup-compatibility/2006" xmlns:aink="http://schemas.microsoft.com/office/drawing/2016/ink" xmlns:am3d="http://schemas.microsoft.com/office/drawing/2017/model3d" xmlns:o="urn:schemas-microsoft-com:office:office" xmlns:r="http://schemas.openxmlformats.org/officeDocument/2006/relationships" xmlns:m="http://schemas.openxmlformats.org/officeDocument/2006/math" xmlns:v="urn:schemas-microsoft-com:vml" xmlns:wp14="http://schemas.microsoft.com/office/word/2010/wordprocessingDrawing" xmlns:wp="http://schemas.openxmlformats.org/drawingml/2006/wordprocessingDrawing" xmlns:w10="urn:schemas-microsoft-com:office:word" xmlns:w="http://schemas.openxmlformats.org/wordprocessingml/2006/main" xmlns:w14="http://schemas.microsoft.com/office/word/2010/wordml" xmlns:w15="http://schemas.microsoft.com/office/word/2012/wordml" xmlns:w16cex="http://schemas.microsoft.com/office/word/2018/wordml/cex" xmlns:w16cid="http://schemas.microsoft.com/office/word/2016/wordml/cid" xmlns:w16="http://schemas.microsoft.com/office/word/2018/wordml" xmlns:w16sdtdh="http://schemas.microsoft.com/office/word/2020/wordml/sdtdatahash" xmlns:w16se="http://schemas.microsoft.com/office/word/2015/wordml/symex" xmlns:wpg="http://schemas.microsoft.com/office/word/2010/wordprocessingGroup" xmlns:wpi="http://schemas.microsoft.com/office/word/2010/wordprocessingInk" xmlns:wne="http://schemas.microsoft.com/office/word/2006/wordml" xmlns:wps="http://schemas.microsoft.com/office/word/2010/wordprocessingShape"/>
-</file>
-
-<file path=word/endnotes.xml><?xml version="1.0" encoding="utf-8"?>
-<w:endnotes xmlns:wpc="http://schemas.microsoft.com/office/word/2010/wordprocessingCanvas" xmlns:mc="http://schemas.openxmlformats.org/markup-compatibility/2006" xmlns:o="urn:schemas-microsoft-com:office:office" xmlns:r="http://schemas.openxmlformats.org/officeDocument/2006/relationships" xmlns:m="http://schemas.openxmlformats.org/officeDocument/2006/math" xmlns:v="urn:schemas-microsoft-com:vml" xmlns:wp14="http://schemas.microsoft.com/office/word/2010/wordprocessingDrawing" xmlns:wp="http://schemas.openxmlformats.org/drawingml/2006/wordprocessingDrawing" xmlns:w10="urn:schemas-microsoft-com:office:word" xmlns:w="http://schemas.openxmlformats.org/wordprocessingml/2006/main" xmlns:w14="http://schemas.microsoft.com/office/word/2010/wordml" xmlns:w15="http://schemas.microsoft.com/office/word/2012/wordml" xmlns:wpg="http://schemas.microsoft.com/office/word/2010/wordprocessingGroup" xmlns:wpi="http://schemas.microsoft.com/office/word/2010/wordprocessingInk" xmlns:wne="http://schemas.microsoft.com/office/word/2006/wordml" xmlns:wps="http://schemas.microsoft.com/office/word/2010/wordprocessingShape" mc:Ignorable="w14 w15 wp14">
-  <w:endnote w:type="separator" w:id="-1">
-    <w:p>
-      <w:pPr>
-        <w:spacing w:after="0" w:line="240" w:lineRule="auto"/>
-      </w:pPr>
-      <w:r>
-        <w:rPr>
-          <w:rStyle w:val="EndnoteReference"/>
-        </w:rPr>
-        <w:endnoteRef/>
-      </w:r>
-      <w:r>
-        <w:separator/>
-      </w:r>
-    </w:p>
-  </w:endnote>
-  <w:endnote w:type="continuationSeparator" w:id="0">
-    <w:p>
-      <w:pPr>
-        <w:spacing w:after="0" w:line="240" w:lineRule="auto"/>
-      </w:pPr>
-      <w:r>
-        <w:rPr>
-          <w:rStyle w:val="EndnoteReference"/>
-        </w:rPr>
-        <w:endnoteRef/>
-      </w:r>
-      <w:r>
-        <w:continuationSeparator/>
-      </w:r>
-    </w:p>
-  </w:endnote>
-</w:endnotes>
-</file>
-
-<file path=word/footnotes.xml><?xml version="1.0" encoding="utf-8"?>
-<w:footnotes xmlns:wpc="http://schemas.microsoft.com/office/word/2010/wordprocessingCanvas" xmlns:mc="http://schemas.openxmlformats.org/markup-compatibility/2006" xmlns:o="urn:schemas-microsoft-com:office:office" xmlns:r="http://schemas.openxmlformats.org/officeDocument/2006/relationships" xmlns:m="http://schemas.openxmlformats.org/officeDocument/2006/math" xmlns:v="urn:schemas-microsoft-com:vml" xmlns:wp14="http://schemas.microsoft.com/office/word/2010/wordprocessingDrawing" xmlns:wp="http://schemas.openxmlformats.org/drawingml/2006/wordprocessingDrawing" xmlns:w10="urn:schemas-microsoft-com:office:word" xmlns:w="http://schemas.openxmlformats.org/wordprocessingml/2006/main" xmlns:w14="http://schemas.microsoft.com/office/word/2010/wordml" xmlns:w15="http://schemas.microsoft.com/office/word/2012/wordml" xmlns:wpg="http://schemas.microsoft.com/office/word/2010/wordprocessingGroup" xmlns:wpi="http://schemas.microsoft.com/office/word/2010/wordprocessingInk" xmlns:wne="http://schemas.microsoft.com/office/word/2006/wordml" xmlns:wps="http://schemas.microsoft.com/office/word/2010/wordprocessingShape" mc:Ignorable="w14 w15 wp14">
-  <w:footnote w:type="separator" w:id="-1">
-    <w:p>
-      <w:pPr>
-        <w:spacing w:after="0" w:line="240" w:lineRule="auto"/>
-      </w:pPr>
-      <w:r>
-        <w:rPr>
-          <w:rStyle w:val="FootnoteReference"/>
-        </w:rPr>
-        <w:footnoteRef/>
-      </w:r>
-      <w:r>
-        <w:separator/>
-      </w:r>
-    </w:p>
-  </w:footnote>
-  <w:footnote w:type="continuationSeparator" w:id="0">
-    <w:p>
-      <w:pPr>
-        <w:spacing w:after="0" w:line="240" w:lineRule="auto"/>
-      </w:pPr>
-      <w:r>
-        <w:rPr>
-          <w:rStyle w:val="FootnoteReference"/>
-        </w:rPr>
-        <w:footnoteRef/>
-      </w:r>
-      <w:r>
-        <w:continuationSeparator/>
-      </w:r>
-    </w:p>
-  </w:footnote>
-</w:footnotes>
-</file>
-
 <file path=word/numbering.xml><?xml version="1.0" encoding="utf-8"?>
-<w:numbering xmlns:wpc="http://schemas.microsoft.com/office/word/2010/wordprocessingCanvas" xmlns:mc="http://schemas.openxmlformats.org/markup-compatibility/2006" xmlns:o="urn:schemas-microsoft-com:office:office" xmlns:r="http://schemas.openxmlformats.org/officeDocument/2006/relationships" xmlns:m="http://schemas.openxmlformats.org/officeDocument/2006/math" xmlns:v="urn:schemas-microsoft-com:vml" xmlns:wp14="http://schemas.microsoft.com/office/word/2010/wordprocessingDrawing" xmlns:wp="http://schemas.openxmlformats.org/drawingml/2006/wordprocessingDrawing" xmlns:w10="urn:schemas-microsoft-com:office:word" xmlns:w="http://schemas.openxmlformats.org/wordprocessingml/2006/main" xmlns:w14="http://schemas.microsoft.com/office/word/2010/wordml" xmlns:w15="http://schemas.microsoft.com/office/word/2012/wordml" xmlns:wpg="http://schemas.microsoft.com/office/word/2010/wordprocessingGroup" xmlns:wpi="http://schemas.microsoft.com/office/word/2010/wordprocessingInk" xmlns:wne="http://schemas.microsoft.com/office/word/2006/wordml" xmlns:wps="http://schemas.microsoft.com/office/word/2010/wordprocessingShape" mc:Ignorable="w14 w15 wp14">
+<w:numbering xmlns:wpc="http://schemas.microsoft.com/office/word/2010/wordprocessingCanvas" xmlns:cx="http://schemas.microsoft.com/office/drawing/2014/chartex" xmlns:cx1="http://schemas.microsoft.com/office/drawing/2015/9/8/chartex" xmlns:cx2="http://schemas.microsoft.com/office/drawing/2015/10/21/chartex" xmlns:cx3="http://schemas.microsoft.com/office/drawing/2016/5/9/chartex" xmlns:cx4="http://schemas.microsoft.com/office/drawing/2016/5/10/chartex" xmlns:cx5="http://schemas.microsoft.com/office/drawing/2016/5/11/chartex" xmlns:cx6="http://schemas.microsoft.com/office/drawing/2016/5/12/chartex" xmlns:cx7="http://schemas.microsoft.com/office/drawing/2016/5/13/chartex" xmlns:cx8="http://schemas.microsoft.com/office/drawing/2016/5/14/chartex" xmlns:mc="http://schemas.openxmlformats.org/markup-compatibility/2006" xmlns:aink="http://schemas.microsoft.com/office/drawing/2016/ink" xmlns:am3d="http://schemas.microsoft.com/office/drawing/2017/model3d" xmlns:o="urn:schemas-microsoft-com:office:office" xmlns:oel="http://schemas.microsoft.com/office/2019/extlst" xmlns:r="http://schemas.openxmlformats.org/officeDocument/2006/relationships" xmlns:m="http://schemas.openxmlformats.org/officeDocument/2006/math" xmlns:v="urn:schemas-microsoft-com:vml" xmlns:wp14="http://schemas.microsoft.com/office/word/2010/wordprocessingDrawing" xmlns:wp="http://schemas.openxmlformats.org/drawingml/2006/wordprocessingDrawing" xmlns:w10="urn:schemas-microsoft-com:office:word" xmlns:w="http://schemas.openxmlformats.org/wordprocessingml/2006/main" xmlns:w14="http://schemas.microsoft.com/office/word/2010/wordml" xmlns:w15="http://schemas.microsoft.com/office/word/2012/wordml" xmlns:w16cex="http://schemas.microsoft.com/office/word/2018/wordml/cex" xmlns:w16cid="http://schemas.microsoft.com/office/word/2016/wordml/cid" xmlns:w16="http://schemas.microsoft.com/office/word/2018/wordml" xmlns:w16du="http://schemas.microsoft.com/office/word/2023/wordml/word16du" xmlns:w16sdtdh="http://schemas.microsoft.com/office/word/2020/wordml/sdtdatahash" xmlns:w16sdtfl="http://schemas.microsoft.com/office/word/2024/wordml/sdtformatlock" xmlns:w16se="http://schemas.microsoft.com/office/word/2015/wordml/symex" xmlns:wpg="http://schemas.microsoft.com/office/word/2010/wordprocessingGroup" xmlns:wpi="http://schemas.microsoft.com/office/word/2010/wordprocessingInk" xmlns:wne="http://schemas.microsoft.com/office/word/2006/wordml" xmlns:wps="http://schemas.microsoft.com/office/word/2010/wordprocessingShape" mc:Ignorable="w14 w15 w16se w16cid w16 w16cex w16sdtdh w16sdtfl w16du wp14">
+  <w:abstractNum w:abstractNumId="0" w15:restartNumberingAfterBreak="0">
+    <w:nsid w:val="38984F9E"/>
+    <w:multiLevelType w:val="hybridMultilevel"/>
+    <w:tmpl w:val="3CC6E5C4"/>
+    <w:lvl w:ilvl="0" w:tplc="0DCCBB0C">
+      <w:start w:val="1"/>
+      <w:numFmt w:val="bullet"/>
+      <w:lvlText w:val="•"/>
+      <w:lvlJc w:val="left"/>
+      <w:pPr>
+        <w:ind w:left="480" w:hanging="240"/>
+      </w:pPr>
+    </w:lvl>
+    <w:lvl w:ilvl="1" w:tplc="595819A0">
+      <w:numFmt w:val="decimal"/>
+      <w:lvlText w:val=""/>
+      <w:lvlJc w:val="left"/>
+    </w:lvl>
+    <w:lvl w:ilvl="2" w:tplc="95DA6828">
+      <w:numFmt w:val="decimal"/>
+      <w:lvlText w:val=""/>
+      <w:lvlJc w:val="left"/>
+    </w:lvl>
+    <w:lvl w:ilvl="3" w:tplc="4394E072">
+      <w:numFmt w:val="decimal"/>
+      <w:lvlText w:val=""/>
+      <w:lvlJc w:val="left"/>
+    </w:lvl>
+    <w:lvl w:ilvl="4" w:tplc="287C7A96">
+      <w:numFmt w:val="decimal"/>
+      <w:lvlText w:val=""/>
+      <w:lvlJc w:val="left"/>
+    </w:lvl>
+    <w:lvl w:ilvl="5" w:tplc="556A1A3E">
+      <w:numFmt w:val="decimal"/>
+      <w:lvlText w:val=""/>
+      <w:lvlJc w:val="left"/>
+    </w:lvl>
+    <w:lvl w:ilvl="6" w:tplc="2A6CFDA6">
+      <w:numFmt w:val="decimal"/>
+      <w:lvlText w:val=""/>
+      <w:lvlJc w:val="left"/>
+    </w:lvl>
+    <w:lvl w:ilvl="7" w:tplc="7186B7A0">
+      <w:numFmt w:val="decimal"/>
+      <w:lvlText w:val=""/>
+      <w:lvlJc w:val="left"/>
+    </w:lvl>
+    <w:lvl w:ilvl="8" w:tplc="1BE6CE8E">
+      <w:numFmt w:val="decimal"/>
+      <w:lvlText w:val=""/>
+      <w:lvlJc w:val="left"/>
+    </w:lvl>
+  </w:abstractNum>
   <w:abstractNum w:abstractNumId="1" w15:restartNumberingAfterBreak="0">
+    <w:nsid w:val="3C8B553F"/>
     <w:multiLevelType w:val="hybridMultilevel"/>
-    <w:lvl w:ilvl="0" w15:tentative="1">
+    <w:tmpl w:val="07D018CC"/>
+    <w:lvl w:ilvl="0" w:tplc="CD92014C">
       <w:start w:val="1"/>
       <w:numFmt w:val="bullet"/>
       <w:lvlText w:val="●"/>
@@ -2870,7 +2926,7 @@
         <w:ind w:left="720" w:hanging="360"/>
       </w:pPr>
     </w:lvl>
-    <w:lvl w:ilvl="1" w15:tentative="1">
+    <w:lvl w:ilvl="1" w:tplc="278EDE38">
       <w:start w:val="1"/>
       <w:numFmt w:val="bullet"/>
       <w:lvlText w:val="○"/>
@@ -2879,7 +2935,7 @@
         <w:ind w:left="1440" w:hanging="360"/>
       </w:pPr>
     </w:lvl>
-    <w:lvl w:ilvl="2" w15:tentative="1">
+    <w:lvl w:ilvl="2" w:tplc="BC0496EA">
       <w:start w:val="1"/>
       <w:numFmt w:val="bullet"/>
       <w:lvlText w:val="■"/>
@@ -2888,7 +2944,7 @@
         <w:ind w:left="2160" w:hanging="360"/>
       </w:pPr>
     </w:lvl>
-    <w:lvl w:ilvl="3" w15:tentative="1">
+    <w:lvl w:ilvl="3" w:tplc="0E902CB4">
       <w:start w:val="1"/>
       <w:numFmt w:val="bullet"/>
       <w:lvlText w:val="●"/>
@@ -2897,7 +2953,7 @@
         <w:ind w:left="2880" w:hanging="360"/>
       </w:pPr>
     </w:lvl>
-    <w:lvl w:ilvl="4" w15:tentative="1">
+    <w:lvl w:ilvl="4" w:tplc="3BE2DB68">
       <w:start w:val="1"/>
       <w:numFmt w:val="bullet"/>
       <w:lvlText w:val="○"/>
@@ -2906,7 +2962,7 @@
         <w:ind w:left="3600" w:hanging="360"/>
       </w:pPr>
     </w:lvl>
-    <w:lvl w:ilvl="5" w15:tentative="1">
+    <w:lvl w:ilvl="5" w:tplc="C3A28EF8">
       <w:start w:val="1"/>
       <w:numFmt w:val="bullet"/>
       <w:lvlText w:val="■"/>
@@ -2915,7 +2971,7 @@
         <w:ind w:left="4320" w:hanging="360"/>
       </w:pPr>
     </w:lvl>
-    <w:lvl w:ilvl="6" w15:tentative="1">
+    <w:lvl w:ilvl="6" w:tplc="30EE805A">
       <w:start w:val="1"/>
       <w:numFmt w:val="bullet"/>
       <w:lvlText w:val="●"/>
@@ -2924,7 +2980,7 @@
         <w:ind w:left="5040" w:hanging="360"/>
       </w:pPr>
     </w:lvl>
-    <w:lvl w:ilvl="7" w15:tentative="1">
+    <w:lvl w:ilvl="7" w:tplc="63203AE0">
       <w:start w:val="1"/>
       <w:numFmt w:val="bullet"/>
       <w:lvlText w:val="●"/>
@@ -2933,7 +2989,7 @@
         <w:ind w:left="5760" w:hanging="360"/>
       </w:pPr>
     </w:lvl>
-    <w:lvl w:ilvl="8" w15:tentative="1">
+    <w:lvl w:ilvl="8" w:tplc="25A232CA">
       <w:start w:val="1"/>
       <w:numFmt w:val="bullet"/>
       <w:lvlText w:val="●"/>
@@ -2944,43 +3000,73 @@
     </w:lvl>
   </w:abstractNum>
   <w:abstractNum w:abstractNumId="2" w15:restartNumberingAfterBreak="0">
+    <w:nsid w:val="47716DC0"/>
     <w:multiLevelType w:val="hybridMultilevel"/>
-    <w:lvl w:ilvl="0" w15:tentative="1">
+    <w:tmpl w:val="46FECDCC"/>
+    <w:lvl w:ilvl="0" w:tplc="B59A4CB2">
       <w:start w:val="1"/>
       <w:numFmt w:val="decimal"/>
       <w:lvlText w:val="%1."/>
-      <w:lvlJc w:val="start"/>
+      <w:lvlJc w:val="left"/>
       <w:pPr>
         <w:ind w:left="480" w:hanging="300"/>
       </w:pPr>
+    </w:lvl>
+    <w:lvl w:ilvl="1" w:tplc="D5AA66BA">
+      <w:numFmt w:val="decimal"/>
+      <w:lvlText w:val=""/>
+      <w:lvlJc w:val="left"/>
+    </w:lvl>
+    <w:lvl w:ilvl="2" w:tplc="750259AA">
+      <w:numFmt w:val="decimal"/>
+      <w:lvlText w:val=""/>
+      <w:lvlJc w:val="left"/>
+    </w:lvl>
+    <w:lvl w:ilvl="3" w:tplc="327AF160">
+      <w:numFmt w:val="decimal"/>
+      <w:lvlText w:val=""/>
+      <w:lvlJc w:val="left"/>
+    </w:lvl>
+    <w:lvl w:ilvl="4" w:tplc="B694FFBA">
+      <w:numFmt w:val="decimal"/>
+      <w:lvlText w:val=""/>
+      <w:lvlJc w:val="left"/>
+    </w:lvl>
+    <w:lvl w:ilvl="5" w:tplc="0BE0D652">
+      <w:numFmt w:val="decimal"/>
+      <w:lvlText w:val=""/>
+      <w:lvlJc w:val="left"/>
+    </w:lvl>
+    <w:lvl w:ilvl="6" w:tplc="A02E8DEA">
+      <w:numFmt w:val="decimal"/>
+      <w:lvlText w:val=""/>
+      <w:lvlJc w:val="left"/>
+    </w:lvl>
+    <w:lvl w:ilvl="7" w:tplc="AFD07184">
+      <w:numFmt w:val="decimal"/>
+      <w:lvlText w:val=""/>
+      <w:lvlJc w:val="left"/>
+    </w:lvl>
+    <w:lvl w:ilvl="8" w:tplc="57E8E250">
+      <w:numFmt w:val="decimal"/>
+      <w:lvlText w:val=""/>
+      <w:lvlJc w:val="left"/>
     </w:lvl>
   </w:abstractNum>
-  <w:abstractNum w:abstractNumId="3" w15:restartNumberingAfterBreak="0">
-    <w:multiLevelType w:val="hybridMultilevel"/>
-    <w:lvl w:ilvl="0" w15:tentative="1">
-      <w:start w:val="1"/>
-      <w:numFmt w:val="bullet"/>
-      <w:lvlText w:val="•"/>
-      <w:lvlJc w:val="start"/>
-      <w:pPr>
-        <w:ind w:left="480" w:hanging="240"/>
-      </w:pPr>
-    </w:lvl>
-  </w:abstractNum>
-  <w:num w:numId="1">
+  <w:num w:numId="1" w16cid:durableId="1120690397">
     <w:abstractNumId w:val="1"/>
     <w:lvlOverride w:ilvl="0">
       <w:startOverride w:val="1"/>
     </w:lvlOverride>
   </w:num>
-  <w:num w:numId="2">
+  <w:num w:numId="2" w16cid:durableId="651711585">
     <w:abstractNumId w:val="2"/>
     <w:lvlOverride w:ilvl="0">
       <w:startOverride w:val="1"/>
     </w:lvlOverride>
   </w:num>
-  <w:num w:numId="3">
-    <w:abstractNumId w:val="3"/>
+  <w:num w:numId="3" w16cid:durableId="163060137">
+    <w:abstractNumId w:val="0"/>
     <w:lvlOverride w:ilvl="0">
       <w:startOverride w:val="1"/>
     </w:lvlOverride>
@@ -2989,32 +3075,408 @@
 </file>
 
 <file path=word/styles.xml><?xml version="1.0" encoding="utf-8"?>
-<w:styles xmlns:mc="http://schemas.openxmlformats.org/markup-compatibility/2006" xmlns:r="http://schemas.openxmlformats.org/officeDocument/2006/relationships" xmlns:w="http://schemas.openxmlformats.org/wordprocessingml/2006/main" xmlns:w14="http://schemas.microsoft.com/office/word/2010/wordml" xmlns:w15="http://schemas.microsoft.com/office/word/2012/wordml" mc:Ignorable="w14 w15">
+<w:styles xmlns:mc="http://schemas.openxmlformats.org/markup-compatibility/2006" xmlns:r="http://schemas.openxmlformats.org/officeDocument/2006/relationships" xmlns:w="http://schemas.openxmlformats.org/wordprocessingml/2006/main" xmlns:w14="http://schemas.microsoft.com/office/word/2010/wordml" xmlns:w15="http://schemas.microsoft.com/office/word/2012/wordml" xmlns:w16cex="http://schemas.microsoft.com/office/word/2018/wordml/cex" xmlns:w16cid="http://schemas.microsoft.com/office/word/2016/wordml/cid" xmlns:w16="http://schemas.microsoft.com/office/word/2018/wordml" xmlns:w16du="http://schemas.microsoft.com/office/word/2023/wordml/word16du" xmlns:w16sdtdh="http://schemas.microsoft.com/office/word/2020/wordml/sdtdatahash" xmlns:w16sdtfl="http://schemas.microsoft.com/office/word/2024/wordml/sdtformatlock" xmlns:w16se="http://schemas.microsoft.com/office/word/2015/wordml/symex" mc:Ignorable="w14 w15 w16se w16cid w16 w16cex w16sdtdh w16sdtfl w16du">
   <w:docDefaults>
     <w:rPrDefault>
       <w:rPr>
-        <w:rFonts w:ascii="Calibri" w:cs="Calibri" w:eastAsia="Calibri" w:hAnsi="Calibri"/>
+        <w:rFonts w:ascii="Calibri" w:eastAsia="Calibri" w:hAnsi="Calibri" w:cs="Calibri"/>
         <w:sz w:val="22"/>
         <w:szCs w:val="22"/>
+        <w:lang w:val="en-US" w:eastAsia="en-US" w:bidi="ar-SA"/>
       </w:rPr>
     </w:rPrDefault>
     <w:pPrDefault/>
   </w:docDefaults>
-  <w:style w:type="paragraph" w:styleId="Title">
-    <w:name w:val="Title"/>
-    <w:basedOn w:val="Normal"/>
-    <w:next w:val="Normal"/>
+  <w:latentStyles w:defLockedState="0" w:defUIPriority="99" w:defSemiHidden="0" w:defUnhideWhenUsed="0" w:defQFormat="0" w:count="376">
+    <w:lsdException w:name="Normal" w:uiPriority="0" w:qFormat="1"/>
+    <w:lsdException w:name="heading 1" w:uiPriority="9" w:qFormat="1"/>
+    <w:lsdException w:name="heading 2" w:semiHidden="1" w:uiPriority="9" w:unhideWhenUsed="1" w:qFormat="1"/>
+    <w:lsdException w:name="heading 3" w:semiHidden="1" w:uiPriority="9" w:unhideWhenUsed="1" w:qFormat="1"/>
+    <w:lsdException w:name="heading 4" w:semiHidden="1" w:uiPriority="9" w:unhideWhenUsed="1" w:qFormat="1"/>
+    <w:lsdException w:name="heading 5" w:semiHidden="1" w:uiPriority="9" w:unhideWhenUsed="1" w:qFormat="1"/>
+    <w:lsdException w:name="heading 6" w:semiHidden="1" w:uiPriority="9" w:unhideWhenUsed="1" w:qFormat="1"/>
+    <w:lsdException w:name="heading 7" w:semiHidden="1" w:uiPriority="9" w:unhideWhenUsed="1" w:qFormat="1"/>
+    <w:lsdException w:name="heading 8" w:semiHidden="1" w:uiPriority="9" w:unhideWhenUsed="1" w:qFormat="1"/>
+    <w:lsdException w:name="heading 9" w:semiHidden="1" w:uiPriority="9" w:unhideWhenUsed="1" w:qFormat="1"/>
+    <w:lsdException w:name="index 1" w:semiHidden="1" w:unhideWhenUsed="1"/>
+    <w:lsdException w:name="index 2" w:semiHidden="1" w:unhideWhenUsed="1"/>
+    <w:lsdException w:name="index 3" w:semiHidden="1" w:unhideWhenUsed="1"/>
+    <w:lsdException w:name="index 4" w:semiHidden="1" w:unhideWhenUsed="1"/>
+    <w:lsdException w:name="index 5" w:semiHidden="1" w:unhideWhenUsed="1"/>
+    <w:lsdException w:name="index 6" w:semiHidden="1" w:unhideWhenUsed="1"/>
+    <w:lsdException w:name="index 7" w:semiHidden="1" w:unhideWhenUsed="1"/>
+    <w:lsdException w:name="index 8" w:semiHidden="1" w:unhideWhenUsed="1"/>
+    <w:lsdException w:name="index 9" w:semiHidden="1" w:unhideWhenUsed="1"/>
+    <w:lsdException w:name="toc 1" w:semiHidden="1" w:uiPriority="39" w:unhideWhenUsed="1"/>
+    <w:lsdException w:name="toc 2" w:semiHidden="1" w:uiPriority="39" w:unhideWhenUsed="1"/>
+    <w:lsdException w:name="toc 3" w:semiHidden="1" w:uiPriority="39" w:unhideWhenUsed="1"/>
+    <w:lsdException w:name="toc 4" w:semiHidden="1" w:uiPriority="39" w:unhideWhenUsed="1"/>
+    <w:lsdException w:name="toc 5" w:semiHidden="1" w:uiPriority="39" w:unhideWhenUsed="1"/>
+    <w:lsdException w:name="toc 6" w:semiHidden="1" w:uiPriority="39" w:unhideWhenUsed="1"/>
+    <w:lsdException w:name="toc 7" w:semiHidden="1" w:uiPriority="39" w:unhideWhenUsed="1"/>
+    <w:lsdException w:name="toc 8" w:semiHidden="1" w:uiPriority="39" w:unhideWhenUsed="1"/>
+    <w:lsdException w:name="toc 9" w:semiHidden="1" w:uiPriority="39" w:unhideWhenUsed="1"/>
+    <w:lsdException w:name="Normal Indent" w:semiHidden="1" w:unhideWhenUsed="1"/>
+    <w:lsdException w:name="footnote text" w:semiHidden="1" w:unhideWhenUsed="1"/>
+    <w:lsdException w:name="annotation text" w:semiHidden="1" w:unhideWhenUsed="1"/>
+    <w:lsdException w:name="header" w:semiHidden="1" w:unhideWhenUsed="1"/>
+    <w:lsdException w:name="footer" w:semiHidden="1" w:unhideWhenUsed="1"/>
+    <w:lsdException w:name="index heading" w:semiHidden="1" w:unhideWhenUsed="1"/>
+    <w:lsdException w:name="caption" w:semiHidden="1" w:uiPriority="35" w:unhideWhenUsed="1" w:qFormat="1"/>
+    <w:lsdException w:name="table of figures" w:semiHidden="1" w:unhideWhenUsed="1"/>
+    <w:lsdException w:name="envelope address" w:semiHidden="1" w:unhideWhenUsed="1"/>
+    <w:lsdException w:name="envelope return" w:semiHidden="1" w:unhideWhenUsed="1"/>
+    <w:lsdException w:name="footnote reference" w:semiHidden="1" w:unhideWhenUsed="1"/>
+    <w:lsdException w:name="annotation reference" w:semiHidden="1" w:unhideWhenUsed="1"/>
+    <w:lsdException w:name="line number" w:semiHidden="1" w:unhideWhenUsed="1"/>
+    <w:lsdException w:name="page number" w:semiHidden="1" w:unhideWhenUsed="1"/>
+    <w:lsdException w:name="endnote reference" w:semiHidden="1" w:unhideWhenUsed="1"/>
+    <w:lsdException w:name="endnote text" w:semiHidden="1" w:unhideWhenUsed="1"/>
+    <w:lsdException w:name="table of authorities" w:semiHidden="1" w:unhideWhenUsed="1"/>
+    <w:lsdException w:name="macro" w:semiHidden="1" w:unhideWhenUsed="1"/>
+    <w:lsdException w:name="toa heading" w:semiHidden="1" w:unhideWhenUsed="1"/>
+    <w:lsdException w:name="List" w:semiHidden="1" w:unhideWhenUsed="1"/>
+    <w:lsdException w:name="List Bullet" w:semiHidden="1" w:unhideWhenUsed="1"/>
+    <w:lsdException w:name="List Number" w:semiHidden="1" w:unhideWhenUsed="1"/>
+    <w:lsdException w:name="List 2" w:semiHidden="1" w:unhideWhenUsed="1"/>
+    <w:lsdException w:name="List 3" w:semiHidden="1" w:unhideWhenUsed="1"/>
+    <w:lsdException w:name="List 4" w:semiHidden="1" w:unhideWhenUsed="1"/>
+    <w:lsdException w:name="List 5" w:semiHidden="1" w:unhideWhenUsed="1"/>
+    <w:lsdException w:name="List Bullet 2" w:semiHidden="1" w:unhideWhenUsed="1"/>
+    <w:lsdException w:name="List Bullet 3" w:semiHidden="1" w:unhideWhenUsed="1"/>
+    <w:lsdException w:name="List Bullet 4" w:semiHidden="1" w:unhideWhenUsed="1"/>
+    <w:lsdException w:name="List Bullet 5" w:semiHidden="1" w:unhideWhenUsed="1"/>
+    <w:lsdException w:name="List Number 2" w:semiHidden="1" w:unhideWhenUsed="1"/>
+    <w:lsdException w:name="List Number 3" w:semiHidden="1" w:unhideWhenUsed="1"/>
+    <w:lsdException w:name="List Number 4" w:semiHidden="1" w:unhideWhenUsed="1"/>
+    <w:lsdException w:name="List Number 5" w:semiHidden="1" w:unhideWhenUsed="1"/>
+    <w:lsdException w:name="Title" w:uiPriority="10" w:qFormat="1"/>
+    <w:lsdException w:name="Closing" w:semiHidden="1" w:unhideWhenUsed="1"/>
+    <w:lsdException w:name="Signature" w:semiHidden="1" w:unhideWhenUsed="1"/>
+    <w:lsdException w:name="Default Paragraph Font" w:semiHidden="1" w:uiPriority="1" w:unhideWhenUsed="1"/>
+    <w:lsdException w:name="Body Text" w:semiHidden="1" w:unhideWhenUsed="1"/>
+    <w:lsdException w:name="Body Text Indent" w:semiHidden="1" w:unhideWhenUsed="1"/>
+    <w:lsdException w:name="List Continue" w:semiHidden="1" w:unhideWhenUsed="1"/>
+    <w:lsdException w:name="List Continue 2" w:semiHidden="1" w:unhideWhenUsed="1"/>
+    <w:lsdException w:name="List Continue 3" w:semiHidden="1" w:unhideWhenUsed="1"/>
+    <w:lsdException w:name="List Continue 4" w:semiHidden="1" w:unhideWhenUsed="1"/>
+    <w:lsdException w:name="List Continue 5" w:semiHidden="1" w:unhideWhenUsed="1"/>
+    <w:lsdException w:name="Message Header" w:semiHidden="1" w:unhideWhenUsed="1"/>
+    <w:lsdException w:name="Subtitle" w:uiPriority="11" w:qFormat="1"/>
+    <w:lsdException w:name="Salutation" w:semiHidden="1" w:unhideWhenUsed="1"/>
+    <w:lsdException w:name="Date" w:semiHidden="1" w:unhideWhenUsed="1"/>
+    <w:lsdException w:name="Body Text First Indent" w:semiHidden="1" w:unhideWhenUsed="1"/>
+    <w:lsdException w:name="Body Text First Indent 2" w:semiHidden="1" w:unhideWhenUsed="1"/>
+    <w:lsdException w:name="Note Heading" w:semiHidden="1" w:unhideWhenUsed="1"/>
+    <w:lsdException w:name="Body Text 2" w:semiHidden="1" w:unhideWhenUsed="1"/>
+    <w:lsdException w:name="Body Text 3" w:semiHidden="1" w:unhideWhenUsed="1"/>
+    <w:lsdException w:name="Body Text Indent 2" w:semiHidden="1" w:unhideWhenUsed="1"/>
+    <w:lsdException w:name="Body Text Indent 3" w:semiHidden="1" w:unhideWhenUsed="1"/>
+    <w:lsdException w:name="Block Text" w:semiHidden="1" w:unhideWhenUsed="1"/>
+    <w:lsdException w:name="Hyperlink" w:semiHidden="1" w:unhideWhenUsed="1"/>
+    <w:lsdException w:name="FollowedHyperlink" w:semiHidden="1" w:unhideWhenUsed="1"/>
+    <w:lsdException w:name="Strong" w:uiPriority="22" w:qFormat="1"/>
+    <w:lsdException w:name="Emphasis" w:uiPriority="20" w:qFormat="1"/>
+    <w:lsdException w:name="Document Map" w:semiHidden="1" w:unhideWhenUsed="1"/>
+    <w:lsdException w:name="Plain Text" w:semiHidden="1" w:unhideWhenUsed="1"/>
+    <w:lsdException w:name="E-mail Signature" w:semiHidden="1" w:unhideWhenUsed="1"/>
+    <w:lsdException w:name="HTML Top of Form" w:semiHidden="1" w:unhideWhenUsed="1"/>
+    <w:lsdException w:name="HTML Bottom of Form" w:semiHidden="1" w:unhideWhenUsed="1"/>
+    <w:lsdException w:name="Normal (Web)" w:semiHidden="1" w:unhideWhenUsed="1"/>
+    <w:lsdException w:name="HTML Acronym" w:semiHidden="1" w:unhideWhenUsed="1"/>
+    <w:lsdException w:name="HTML Address" w:semiHidden="1" w:unhideWhenUsed="1"/>
+    <w:lsdException w:name="HTML Cite" w:semiHidden="1" w:unhideWhenUsed="1"/>
+    <w:lsdException w:name="HTML Code" w:semiHidden="1" w:unhideWhenUsed="1"/>
+    <w:lsdException w:name="HTML Definition" w:semiHidden="1" w:unhideWhenUsed="1"/>
+    <w:lsdException w:name="HTML Keyboard" w:semiHidden="1" w:unhideWhenUsed="1"/>
+    <w:lsdException w:name="HTML Preformatted" w:semiHidden="1" w:unhideWhenUsed="1"/>
+    <w:lsdException w:name="HTML Sample" w:semiHidden="1" w:unhideWhenUsed="1"/>
+    <w:lsdException w:name="HTML Typewriter" w:semiHidden="1" w:unhideWhenUsed="1"/>
+    <w:lsdException w:name="HTML Variable" w:semiHidden="1" w:unhideWhenUsed="1"/>
+    <w:lsdException w:name="Normal Table" w:semiHidden="1" w:unhideWhenUsed="1"/>
+    <w:lsdException w:name="annotation subject" w:semiHidden="1" w:unhideWhenUsed="1"/>
+    <w:lsdException w:name="No List" w:semiHidden="1" w:unhideWhenUsed="1"/>
+    <w:lsdException w:name="Outline List 1" w:semiHidden="1" w:unhideWhenUsed="1"/>
+    <w:lsdException w:name="Outline List 2" w:semiHidden="1" w:unhideWhenUsed="1"/>
+    <w:lsdException w:name="Outline List 3" w:semiHidden="1" w:unhideWhenUsed="1"/>
+    <w:lsdException w:name="Table Simple 1" w:semiHidden="1" w:unhideWhenUsed="1"/>
+    <w:lsdException w:name="Table Simple 2" w:semiHidden="1" w:unhideWhenUsed="1"/>
+    <w:lsdException w:name="Table Simple 3" w:semiHidden="1" w:unhideWhenUsed="1"/>
+    <w:lsdException w:name="Table Classic 1" w:semiHidden="1" w:unhideWhenUsed="1"/>
+    <w:lsdException w:name="Table Classic 2" w:semiHidden="1" w:unhideWhenUsed="1"/>
+    <w:lsdException w:name="Table Classic 3" w:semiHidden="1" w:unhideWhenUsed="1"/>
+    <w:lsdException w:name="Table Classic 4" w:semiHidden="1" w:unhideWhenUsed="1"/>
+    <w:lsdException w:name="Table Colorful 1" w:semiHidden="1" w:unhideWhenUsed="1"/>
+    <w:lsdException w:name="Table Colorful 2" w:semiHidden="1" w:unhideWhenUsed="1"/>
+    <w:lsdException w:name="Table Colorful 3" w:semiHidden="1" w:unhideWhenUsed="1"/>
+    <w:lsdException w:name="Table Columns 1" w:semiHidden="1" w:unhideWhenUsed="1"/>
+    <w:lsdException w:name="Table Columns 2" w:semiHidden="1" w:unhideWhenUsed="1"/>
+    <w:lsdException w:name="Table Columns 3" w:semiHidden="1" w:unhideWhenUsed="1"/>
+    <w:lsdException w:name="Table Columns 4" w:semiHidden="1" w:unhideWhenUsed="1"/>
+    <w:lsdException w:name="Table Columns 5" w:semiHidden="1" w:unhideWhenUsed="1"/>
+    <w:lsdException w:name="Table Grid 1" w:semiHidden="1" w:unhideWhenUsed="1"/>
+    <w:lsdException w:name="Table Grid 2" w:semiHidden="1" w:unhideWhenUsed="1"/>
+    <w:lsdException w:name="Table Grid 3" w:semiHidden="1" w:unhideWhenUsed="1"/>
+    <w:lsdException w:name="Table Grid 4" w:semiHidden="1" w:unhideWhenUsed="1"/>
+    <w:lsdException w:name="Table Grid 5" w:semiHidden="1" w:unhideWhenUsed="1"/>
+    <w:lsdException w:name="Table Grid 6" w:semiHidden="1" w:unhideWhenUsed="1"/>
+    <w:lsdException w:name="Table Grid 7" w:semiHidden="1" w:unhideWhenUsed="1"/>
+    <w:lsdException w:name="Table Grid 8" w:semiHidden="1" w:unhideWhenUsed="1"/>
+    <w:lsdException w:name="Table List 1" w:semiHidden="1" w:unhideWhenUsed="1"/>
+    <w:lsdException w:name="Table List 2" w:semiHidden="1" w:unhideWhenUsed="1"/>
+    <w:lsdException w:name="Table List 3" w:semiHidden="1" w:unhideWhenUsed="1"/>
+    <w:lsdException w:name="Table List 4" w:semiHidden="1" w:unhideWhenUsed="1"/>
+    <w:lsdException w:name="Table List 5" w:semiHidden="1" w:unhideWhenUsed="1"/>
+    <w:lsdException w:name="Table List 6" w:semiHidden="1" w:unhideWhenUsed="1"/>
+    <w:lsdException w:name="Table List 7" w:semiHidden="1" w:unhideWhenUsed="1"/>
+    <w:lsdException w:name="Table List 8" w:semiHidden="1" w:unhideWhenUsed="1"/>
+    <w:lsdException w:name="Table 3D effects 1" w:semiHidden="1" w:unhideWhenUsed="1"/>
+    <w:lsdException w:name="Table 3D effects 2" w:semiHidden="1" w:unhideWhenUsed="1"/>
+    <w:lsdException w:name="Table 3D effects 3" w:semiHidden="1" w:unhideWhenUsed="1"/>
+    <w:lsdException w:name="Table Contemporary" w:semiHidden="1" w:unhideWhenUsed="1"/>
+    <w:lsdException w:name="Table Elegant" w:semiHidden="1" w:unhideWhenUsed="1"/>
+    <w:lsdException w:name="Table Professional" w:semiHidden="1" w:unhideWhenUsed="1"/>
+    <w:lsdException w:name="Table Subtle 1" w:semiHidden="1" w:unhideWhenUsed="1"/>
+    <w:lsdException w:name="Table Subtle 2" w:semiHidden="1" w:unhideWhenUsed="1"/>
+    <w:lsdException w:name="Table Web 1" w:semiHidden="1" w:unhideWhenUsed="1"/>
+    <w:lsdException w:name="Table Web 2" w:semiHidden="1" w:unhideWhenUsed="1"/>
+    <w:lsdException w:name="Table Web 3" w:semiHidden="1" w:unhideWhenUsed="1"/>
+    <w:lsdException w:name="Balloon Text" w:semiHidden="1" w:unhideWhenUsed="1"/>
+    <w:lsdException w:name="Table Grid" w:uiPriority="39"/>
+    <w:lsdException w:name="Table Theme" w:semiHidden="1" w:unhideWhenUsed="1"/>
+    <w:lsdException w:name="Placeholder Text" w:semiHidden="1"/>
+    <w:lsdException w:name="No Spacing" w:uiPriority="1" w:qFormat="1"/>
+    <w:lsdException w:name="Light Shading" w:uiPriority="60"/>
+    <w:lsdException w:name="Light List" w:uiPriority="61"/>
+    <w:lsdException w:name="Light Grid" w:uiPriority="62"/>
+    <w:lsdException w:name="Medium Shading 1" w:uiPriority="63"/>
+    <w:lsdException w:name="Medium Shading 2" w:uiPriority="64"/>
+    <w:lsdException w:name="Medium List 1" w:uiPriority="65"/>
+    <w:lsdException w:name="Medium List 2" w:uiPriority="66"/>
+    <w:lsdException w:name="Medium Grid 1" w:uiPriority="67"/>
+    <w:lsdException w:name="Medium Grid 2" w:uiPriority="68"/>
+    <w:lsdException w:name="Medium Grid 3" w:uiPriority="69"/>
+    <w:lsdException w:name="Dark List" w:uiPriority="70"/>
+    <w:lsdException w:name="Colorful Shading" w:uiPriority="71"/>
+    <w:lsdException w:name="Colorful List" w:uiPriority="72"/>
+    <w:lsdException w:name="Colorful Grid" w:uiPriority="73"/>
+    <w:lsdException w:name="Light Shading Accent 1" w:uiPriority="60"/>
+    <w:lsdException w:name="Light List Accent 1" w:uiPriority="61"/>
+    <w:lsdException w:name="Light Grid Accent 1" w:uiPriority="62"/>
+    <w:lsdException w:name="Medium Shading 1 Accent 1" w:uiPriority="63"/>
+    <w:lsdException w:name="Medium Shading 2 Accent 1" w:uiPriority="64"/>
+    <w:lsdException w:name="Medium List 1 Accent 1" w:uiPriority="65"/>
+    <w:lsdException w:name="Revision" w:semiHidden="1"/>
+    <w:lsdException w:name="List Paragraph" w:uiPriority="34" w:qFormat="1"/>
+    <w:lsdException w:name="Quote" w:uiPriority="29" w:qFormat="1"/>
+    <w:lsdException w:name="Intense Quote" w:uiPriority="30" w:qFormat="1"/>
+    <w:lsdException w:name="Medium List 2 Accent 1" w:uiPriority="66"/>
+    <w:lsdException w:name="Medium Grid 1 Accent 1" w:uiPriority="67"/>
+    <w:lsdException w:name="Medium Grid 2 Accent 1" w:uiPriority="68"/>
+    <w:lsdException w:name="Medium Grid 3 Accent 1" w:uiPriority="69"/>
+    <w:lsdException w:name="Dark List Accent 1" w:uiPriority="70"/>
+    <w:lsdException w:name="Colorful Shading Accent 1" w:uiPriority="71"/>
+    <w:lsdException w:name="Colorful List Accent 1" w:uiPriority="72"/>
+    <w:lsdException w:name="Colorful Grid Accent 1" w:uiPriority="73"/>
+    <w:lsdException w:name="Light Shading Accent 2" w:uiPriority="60"/>
+    <w:lsdException w:name="Light List Accent 2" w:uiPriority="61"/>
+    <w:lsdException w:name="Light Grid Accent 2" w:uiPriority="62"/>
+    <w:lsdException w:name="Medium Shading 1 Accent 2" w:uiPriority="63"/>
+    <w:lsdException w:name="Medium Shading 2 Accent 2" w:uiPriority="64"/>
+    <w:lsdException w:name="Medium List 1 Accent 2" w:uiPriority="65"/>
+    <w:lsdException w:name="Medium List 2 Accent 2" w:uiPriority="66"/>
+    <w:lsdException w:name="Medium Grid 1 Accent 2" w:uiPriority="67"/>
+    <w:lsdException w:name="Medium Grid 2 Accent 2" w:uiPriority="68"/>
+    <w:lsdException w:name="Medium Grid 3 Accent 2" w:uiPriority="69"/>
+    <w:lsdException w:name="Dark List Accent 2" w:uiPriority="70"/>
+    <w:lsdException w:name="Colorful Shading Accent 2" w:uiPriority="71"/>
+    <w:lsdException w:name="Colorful List Accent 2" w:uiPriority="72"/>
+    <w:lsdException w:name="Colorful Grid Accent 2" w:uiPriority="73"/>
+    <w:lsdException w:name="Light Shading Accent 3" w:uiPriority="60"/>
+    <w:lsdException w:name="Light List Accent 3" w:uiPriority="61"/>
+    <w:lsdException w:name="Light Grid Accent 3" w:uiPriority="62"/>
+    <w:lsdException w:name="Medium Shading 1 Accent 3" w:uiPriority="63"/>
+    <w:lsdException w:name="Medium Shading 2 Accent 3" w:uiPriority="64"/>
+    <w:lsdException w:name="Medium List 1 Accent 3" w:uiPriority="65"/>
+    <w:lsdException w:name="Medium List 2 Accent 3" w:uiPriority="66"/>
+    <w:lsdException w:name="Medium Grid 1 Accent 3" w:uiPriority="67"/>
+    <w:lsdException w:name="Medium Grid 2 Accent 3" w:uiPriority="68"/>
+    <w:lsdException w:name="Medium Grid 3 Accent 3" w:uiPriority="69"/>
+    <w:lsdException w:name="Dark List Accent 3" w:uiPriority="70"/>
+    <w:lsdException w:name="Colorful Shading Accent 3" w:uiPriority="71"/>
+    <w:lsdException w:name="Colorful List Accent 3" w:uiPriority="72"/>
+    <w:lsdException w:name="Colorful Grid Accent 3" w:uiPriority="73"/>
+    <w:lsdException w:name="Light Shading Accent 4" w:uiPriority="60"/>
+    <w:lsdException w:name="Light List Accent 4" w:uiPriority="61"/>
+    <w:lsdException w:name="Light Grid Accent 4" w:uiPriority="62"/>
+    <w:lsdException w:name="Medium Shading 1 Accent 4" w:uiPriority="63"/>
+    <w:lsdException w:name="Medium Shading 2 Accent 4" w:uiPriority="64"/>
+    <w:lsdException w:name="Medium List 1 Accent 4" w:uiPriority="65"/>
+    <w:lsdException w:name="Medium List 2 Accent 4" w:uiPriority="66"/>
+    <w:lsdException w:name="Medium Grid 1 Accent 4" w:uiPriority="67"/>
+    <w:lsdException w:name="Medium Grid 2 Accent 4" w:uiPriority="68"/>
+    <w:lsdException w:name="Medium Grid 3 Accent 4" w:uiPriority="69"/>
+    <w:lsdException w:name="Dark List Accent 4" w:uiPriority="70"/>
+    <w:lsdException w:name="Colorful Shading Accent 4" w:uiPriority="71"/>
+    <w:lsdException w:name="Colorful List Accent 4" w:uiPriority="72"/>
+    <w:lsdException w:name="Colorful Grid Accent 4" w:uiPriority="73"/>
+    <w:lsdException w:name="Light Shading Accent 5" w:uiPriority="60"/>
+    <w:lsdException w:name="Light List Accent 5" w:uiPriority="61"/>
+    <w:lsdException w:name="Light Grid Accent 5" w:uiPriority="62"/>
+    <w:lsdException w:name="Medium Shading 1 Accent 5" w:uiPriority="63"/>
+    <w:lsdException w:name="Medium Shading 2 Accent 5" w:uiPriority="64"/>
+    <w:lsdException w:name="Medium List 1 Accent 5" w:uiPriority="65"/>
+    <w:lsdException w:name="Medium List 2 Accent 5" w:uiPriority="66"/>
+    <w:lsdException w:name="Medium Grid 1 Accent 5" w:uiPriority="67"/>
+    <w:lsdException w:name="Medium Grid 2 Accent 5" w:uiPriority="68"/>
+    <w:lsdException w:name="Medium Grid 3 Accent 5" w:uiPriority="69"/>
+    <w:lsdException w:name="Dark List Accent 5" w:uiPriority="70"/>
+    <w:lsdException w:name="Colorful Shading Accent 5" w:uiPriority="71"/>
+    <w:lsdException w:name="Colorful List Accent 5" w:uiPriority="72"/>
+    <w:lsdException w:name="Colorful Grid Accent 5" w:uiPriority="73"/>
+    <w:lsdException w:name="Light Shading Accent 6" w:uiPriority="60"/>
+    <w:lsdException w:name="Light List Accent 6" w:uiPriority="61"/>
+    <w:lsdException w:name="Light Grid Accent 6" w:uiPriority="62"/>
+    <w:lsdException w:name="Medium Shading 1 Accent 6" w:uiPriority="63"/>
+    <w:lsdException w:name="Medium Shading 2 Accent 6" w:uiPriority="64"/>
+    <w:lsdException w:name="Medium List 1 Accent 6" w:uiPriority="65"/>
+    <w:lsdException w:name="Medium List 2 Accent 6" w:uiPriority="66"/>
+    <w:lsdException w:name="Medium Grid 1 Accent 6" w:uiPriority="67"/>
+    <w:lsdException w:name="Medium Grid 2 Accent 6" w:uiPriority="68"/>
+    <w:lsdException w:name="Medium Grid 3 Accent 6" w:uiPriority="69"/>
+    <w:lsdException w:name="Dark List Accent 6" w:uiPriority="70"/>
+    <w:lsdException w:name="Colorful Shading Accent 6" w:uiPriority="71"/>
+    <w:lsdException w:name="Colorful List Accent 6" w:uiPriority="72"/>
+    <w:lsdException w:name="Colorful Grid Accent 6" w:uiPriority="73"/>
+    <w:lsdException w:name="Subtle Emphasis" w:uiPriority="19" w:qFormat="1"/>
+    <w:lsdException w:name="Intense Emphasis" w:uiPriority="21" w:qFormat="1"/>
+    <w:lsdException w:name="Subtle Reference" w:uiPriority="31" w:qFormat="1"/>
+    <w:lsdException w:name="Intense Reference" w:uiPriority="32" w:qFormat="1"/>
+    <w:lsdException w:name="Book Title" w:uiPriority="33" w:qFormat="1"/>
+    <w:lsdException w:name="Bibliography" w:semiHidden="1" w:uiPriority="37" w:unhideWhenUsed="1"/>
+    <w:lsdException w:name="TOC Heading" w:semiHidden="1" w:uiPriority="39" w:unhideWhenUsed="1" w:qFormat="1"/>
+    <w:lsdException w:name="Plain Table 1" w:uiPriority="41"/>
+    <w:lsdException w:name="Plain Table 2" w:uiPriority="42"/>
+    <w:lsdException w:name="Plain Table 3" w:uiPriority="43"/>
+    <w:lsdException w:name="Plain Table 4" w:uiPriority="44"/>
+    <w:lsdException w:name="Plain Table 5" w:uiPriority="45"/>
+    <w:lsdException w:name="Grid Table Light" w:uiPriority="40"/>
+    <w:lsdException w:name="Grid Table 1 Light" w:uiPriority="46"/>
+    <w:lsdException w:name="Grid Table 2" w:uiPriority="47"/>
+    <w:lsdException w:name="Grid Table 3" w:uiPriority="48"/>
+    <w:lsdException w:name="Grid Table 4" w:uiPriority="49"/>
+    <w:lsdException w:name="Grid Table 5 Dark" w:uiPriority="50"/>
+    <w:lsdException w:name="Grid Table 6 Colorful" w:uiPriority="51"/>
+    <w:lsdException w:name="Grid Table 7 Colorful" w:uiPriority="52"/>
+    <w:lsdException w:name="Grid Table 1 Light Accent 1" w:uiPriority="46"/>
+    <w:lsdException w:name="Grid Table 2 Accent 1" w:uiPriority="47"/>
+    <w:lsdException w:name="Grid Table 3 Accent 1" w:uiPriority="48"/>
+    <w:lsdException w:name="Grid Table 4 Accent 1" w:uiPriority="49"/>
+    <w:lsdException w:name="Grid Table 5 Dark Accent 1" w:uiPriority="50"/>
+    <w:lsdException w:name="Grid Table 6 Colorful Accent 1" w:uiPriority="51"/>
+    <w:lsdException w:name="Grid Table 7 Colorful Accent 1" w:uiPriority="52"/>
+    <w:lsdException w:name="Grid Table 1 Light Accent 2" w:uiPriority="46"/>
+    <w:lsdException w:name="Grid Table 2 Accent 2" w:uiPriority="47"/>
+    <w:lsdException w:name="Grid Table 3 Accent 2" w:uiPriority="48"/>
+    <w:lsdException w:name="Grid Table 4 Accent 2" w:uiPriority="49"/>
+    <w:lsdException w:name="Grid Table 5 Dark Accent 2" w:uiPriority="50"/>
+    <w:lsdException w:name="Grid Table 6 Colorful Accent 2" w:uiPriority="51"/>
+    <w:lsdException w:name="Grid Table 7 Colorful Accent 2" w:uiPriority="52"/>
+    <w:lsdException w:name="Grid Table 1 Light Accent 3" w:uiPriority="46"/>
+    <w:lsdException w:name="Grid Table 2 Accent 3" w:uiPriority="47"/>
+    <w:lsdException w:name="Grid Table 3 Accent 3" w:uiPriority="48"/>
+    <w:lsdException w:name="Grid Table 4 Accent 3" w:uiPriority="49"/>
+    <w:lsdException w:name="Grid Table 5 Dark Accent 3" w:uiPriority="50"/>
+    <w:lsdException w:name="Grid Table 6 Colorful Accent 3" w:uiPriority="51"/>
+    <w:lsdException w:name="Grid Table 7 Colorful Accent 3" w:uiPriority="52"/>
+    <w:lsdException w:name="Grid Table 1 Light Accent 4" w:uiPriority="46"/>
+    <w:lsdException w:name="Grid Table 2 Accent 4" w:uiPriority="47"/>
+    <w:lsdException w:name="Grid Table 3 Accent 4" w:uiPriority="48"/>
+    <w:lsdException w:name="Grid Table 4 Accent 4" w:uiPriority="49"/>
+    <w:lsdException w:name="Grid Table 5 Dark Accent 4" w:uiPriority="50"/>
+    <w:lsdException w:name="Grid Table 6 Colorful Accent 4" w:uiPriority="51"/>
+    <w:lsdException w:name="Grid Table 7 Colorful Accent 4" w:uiPriority="52"/>
+    <w:lsdException w:name="Grid Table 1 Light Accent 5" w:uiPriority="46"/>
+    <w:lsdException w:name="Grid Table 2 Accent 5" w:uiPriority="47"/>
+    <w:lsdException w:name="Grid Table 3 Accent 5" w:uiPriority="48"/>
+    <w:lsdException w:name="Grid Table 4 Accent 5" w:uiPriority="49"/>
+    <w:lsdException w:name="Grid Table 5 Dark Accent 5" w:uiPriority="50"/>
+    <w:lsdException w:name="Grid Table 6 Colorful Accent 5" w:uiPriority="51"/>
+    <w:lsdException w:name="Grid Table 7 Colorful Accent 5" w:uiPriority="52"/>
+    <w:lsdException w:name="Grid Table 1 Light Accent 6" w:uiPriority="46"/>
+    <w:lsdException w:name="Grid Table 2 Accent 6" w:uiPriority="47"/>
+    <w:lsdException w:name="Grid Table 3 Accent 6" w:uiPriority="48"/>
+    <w:lsdException w:name="Grid Table 4 Accent 6" w:uiPriority="49"/>
+    <w:lsdException w:name="Grid Table 5 Dark Accent 6" w:uiPriority="50"/>
+    <w:lsdException w:name="Grid Table 6 Colorful Accent 6" w:uiPriority="51"/>
+    <w:lsdException w:name="Grid Table 7 Colorful Accent 6" w:uiPriority="52"/>
+    <w:lsdException w:name="List Table 1 Light" w:uiPriority="46"/>
+    <w:lsdException w:name="List Table 2" w:uiPriority="47"/>
+    <w:lsdException w:name="List Table 3" w:uiPriority="48"/>
+    <w:lsdException w:name="List Table 4" w:uiPriority="49"/>
+    <w:lsdException w:name="List Table 5 Dark" w:uiPriority="50"/>
+    <w:lsdException w:name="List Table 6 Colorful" w:uiPriority="51"/>
+    <w:lsdException w:name="List Table 7 Colorful" w:uiPriority="52"/>
+    <w:lsdException w:name="List Table 1 Light Accent 1" w:uiPriority="46"/>
+    <w:lsdException w:name="List Table 2 Accent 1" w:uiPriority="47"/>
+    <w:lsdException w:name="List Table 3 Accent 1" w:uiPriority="48"/>
+    <w:lsdException w:name="List Table 4 Accent 1" w:uiPriority="49"/>
+    <w:lsdException w:name="List Table 5 Dark Accent 1" w:uiPriority="50"/>
+    <w:lsdException w:name="List Table 6 Colorful Accent 1" w:uiPriority="51"/>
+    <w:lsdException w:name="List Table 7 Colorful Accent 1" w:uiPriority="52"/>
+    <w:lsdException w:name="List Table 1 Light Accent 2" w:uiPriority="46"/>
+    <w:lsdException w:name="List Table 2 Accent 2" w:uiPriority="47"/>
+    <w:lsdException w:name="List Table 3 Accent 2" w:uiPriority="48"/>
+    <w:lsdException w:name="List Table 4 Accent 2" w:uiPriority="49"/>
+    <w:lsdException w:name="List Table 5 Dark Accent 2" w:uiPriority="50"/>
+    <w:lsdException w:name="List Table 6 Colorful Accent 2" w:uiPriority="51"/>
+    <w:lsdException w:name="List Table 7 Colorful Accent 2" w:uiPriority="52"/>
+    <w:lsdException w:name="List Table 1 Light Accent 3" w:uiPriority="46"/>
+    <w:lsdException w:name="List Table 2 Accent 3" w:uiPriority="47"/>
+    <w:lsdException w:name="List Table 3 Accent 3" w:uiPriority="48"/>
+    <w:lsdException w:name="List Table 4 Accent 3" w:uiPriority="49"/>
+    <w:lsdException w:name="List Table 5 Dark Accent 3" w:uiPriority="50"/>
+    <w:lsdException w:name="List Table 6 Colorful Accent 3" w:uiPriority="51"/>
+    <w:lsdException w:name="List Table 7 Colorful Accent 3" w:uiPriority="52"/>
+    <w:lsdException w:name="List Table 1 Light Accent 4" w:uiPriority="46"/>
+    <w:lsdException w:name="List Table 2 Accent 4" w:uiPriority="47"/>
+    <w:lsdException w:name="List Table 3 Accent 4" w:uiPriority="48"/>
+    <w:lsdException w:name="List Table 4 Accent 4" w:uiPriority="49"/>
+    <w:lsdException w:name="List Table 5 Dark Accent 4" w:uiPriority="50"/>
+    <w:lsdException w:name="List Table 6 Colorful Accent 4" w:uiPriority="51"/>
+    <w:lsdException w:name="List Table 7 Colorful Accent 4" w:uiPriority="52"/>
+    <w:lsdException w:name="List Table 1 Light Accent 5" w:uiPriority="46"/>
+    <w:lsdException w:name="List Table 2 Accent 5" w:uiPriority="47"/>
+    <w:lsdException w:name="List Table 3 Accent 5" w:uiPriority="48"/>
+    <w:lsdException w:name="List Table 4 Accent 5" w:uiPriority="49"/>
+    <w:lsdException w:name="List Table 5 Dark Accent 5" w:uiPriority="50"/>
+    <w:lsdException w:name="List Table 6 Colorful Accent 5" w:uiPriority="51"/>
+    <w:lsdException w:name="List Table 7 Colorful Accent 5" w:uiPriority="52"/>
+    <w:lsdException w:name="List Table 1 Light Accent 6" w:uiPriority="46"/>
+    <w:lsdException w:name="List Table 2 Accent 6" w:uiPriority="47"/>
+    <w:lsdException w:name="List Table 3 Accent 6" w:uiPriority="48"/>
+    <w:lsdException w:name="List Table 4 Accent 6" w:uiPriority="49"/>
+    <w:lsdException w:name="List Table 5 Dark Accent 6" w:uiPriority="50"/>
+    <w:lsdException w:name="List Table 6 Colorful Accent 6" w:uiPriority="51"/>
+    <w:lsdException w:name="List Table 7 Colorful Accent 6" w:uiPriority="52"/>
+    <w:lsdException w:name="Mention" w:semiHidden="1" w:unhideWhenUsed="1"/>
+    <w:lsdException w:name="Smart Hyperlink" w:semiHidden="1" w:unhideWhenUsed="1"/>
+    <w:lsdException w:name="Hashtag" w:semiHidden="1" w:unhideWhenUsed="1"/>
+    <w:lsdException w:name="Unresolved Mention" w:semiHidden="1" w:unhideWhenUsed="1"/>
+    <w:lsdException w:name="Smart Link" w:semiHidden="1" w:unhideWhenUsed="1"/>
+  </w:latentStyles>
+  <w:style w:type="paragraph" w:default="1" w:styleId="Normal">
+    <w:name w:val="Normal"/>
     <w:qFormat/>
-    <w:rPr>
-      <w:sz w:val="56"/>
-      <w:szCs w:val="56"/>
-    </w:rPr>
+    <w:rsid w:val="008354BE"/>
   </w:style>
   <w:style w:type="paragraph" w:styleId="Heading1">
-    <w:name w:val="Heading 1"/>
-    <w:basedOn w:val="Normal"/>
-    <w:next w:val="Normal"/>
+    <w:name w:val="heading 1"/>
+    <w:uiPriority w:val="9"/>
     <w:qFormat/>
+    <w:pPr>
+      <w:outlineLvl w:val="0"/>
+    </w:pPr>
     <w:rPr>
       <w:color w:val="2E74B5"/>
       <w:sz w:val="32"/>
@@ -3022,10 +3484,13 @@
     </w:rPr>
   </w:style>
   <w:style w:type="paragraph" w:styleId="Heading2">
-    <w:name w:val="Heading 2"/>
-    <w:basedOn w:val="Normal"/>
-    <w:next w:val="Normal"/>
+    <w:name w:val="heading 2"/>
+    <w:uiPriority w:val="9"/>
+    <w:unhideWhenUsed/>
     <w:qFormat/>
+    <w:pPr>
+      <w:outlineLvl w:val="1"/>
+    </w:pPr>
     <w:rPr>
       <w:color w:val="2E74B5"/>
       <w:sz w:val="26"/>
@@ -3033,10 +3498,14 @@
     </w:rPr>
   </w:style>
   <w:style w:type="paragraph" w:styleId="Heading3">
-    <w:name w:val="Heading 3"/>
-    <w:basedOn w:val="Normal"/>
-    <w:next w:val="Normal"/>
+    <w:name w:val="heading 3"/>
+    <w:uiPriority w:val="9"/>
+    <w:semiHidden/>
+    <w:unhideWhenUsed/>
     <w:qFormat/>
+    <w:pPr>
+      <w:outlineLvl w:val="2"/>
+    </w:pPr>
     <w:rPr>
       <w:color w:val="1F4D78"/>
       <w:sz w:val="24"/>
@@ -3044,10 +3513,14 @@
     </w:rPr>
   </w:style>
   <w:style w:type="paragraph" w:styleId="Heading4">
-    <w:name w:val="Heading 4"/>
-    <w:basedOn w:val="Normal"/>
-    <w:next w:val="Normal"/>
+    <w:name w:val="heading 4"/>
+    <w:uiPriority w:val="9"/>
+    <w:semiHidden/>
+    <w:unhideWhenUsed/>
     <w:qFormat/>
+    <w:pPr>
+      <w:outlineLvl w:val="3"/>
+    </w:pPr>
     <w:rPr>
       <w:i/>
       <w:iCs/>
@@ -3055,27 +3528,69 @@
     </w:rPr>
   </w:style>
   <w:style w:type="paragraph" w:styleId="Heading5">
-    <w:name w:val="Heading 5"/>
-    <w:basedOn w:val="Normal"/>
-    <w:next w:val="Normal"/>
+    <w:name w:val="heading 5"/>
+    <w:uiPriority w:val="9"/>
+    <w:semiHidden/>
+    <w:unhideWhenUsed/>
     <w:qFormat/>
+    <w:pPr>
+      <w:outlineLvl w:val="4"/>
+    </w:pPr>
     <w:rPr>
       <w:color w:val="2E74B5"/>
     </w:rPr>
   </w:style>
   <w:style w:type="paragraph" w:styleId="Heading6">
-    <w:name w:val="Heading 6"/>
-    <w:basedOn w:val="Normal"/>
-    <w:next w:val="Normal"/>
+    <w:name w:val="heading 6"/>
+    <w:uiPriority w:val="9"/>
+    <w:semiHidden/>
+    <w:unhideWhenUsed/>
     <w:qFormat/>
+    <w:pPr>
+      <w:outlineLvl w:val="5"/>
+    </w:pPr>
     <w:rPr>
       <w:color w:val="1F4D78"/>
     </w:rPr>
   </w:style>
-  <w:style w:type="paragraph" w:styleId="Strong">
-    <w:name w:val="Strong"/>
-    <w:basedOn w:val="Normal"/>
-    <w:next w:val="Normal"/>
+  <w:style w:type="character" w:default="1" w:styleId="DefaultParagraphFont">
+    <w:name w:val="Default Paragraph Font"/>
+    <w:uiPriority w:val="1"/>
+    <w:semiHidden/>
+    <w:unhideWhenUsed/>
+  </w:style>
+  <w:style w:type="table" w:default="1" w:styleId="TableNormal">
+    <w:name w:val="Normal Table"/>
+    <w:uiPriority w:val="99"/>
+    <w:semiHidden/>
+    <w:unhideWhenUsed/>
+    <w:tblPr>
+      <w:tblInd w:w="0" w:type="dxa"/>
+      <w:tblCellMar>
+        <w:top w:w="0" w:type="dxa"/>
+        <w:left w:w="108" w:type="dxa"/>
+        <w:bottom w:w="0" w:type="dxa"/>
+        <w:right w:w="108" w:type="dxa"/>
+      </w:tblCellMar>
+    </w:tblPr>
+  </w:style>
+  <w:style w:type="numbering" w:default="1" w:styleId="NoList">
+    <w:name w:val="No List"/>
+    <w:uiPriority w:val="99"/>
+    <w:semiHidden/>
+    <w:unhideWhenUsed/>
+  </w:style>
+  <w:style w:type="paragraph" w:styleId="Title">
+    <w:name w:val="Title"/>
+    <w:uiPriority w:val="10"/>
+    <w:qFormat/>
+    <w:rPr>
+      <w:sz w:val="56"/>
+      <w:szCs w:val="56"/>
+    </w:rPr>
+  </w:style>
+  <w:style w:type="paragraph" w:customStyle="1" w:styleId="Strong1">
+    <w:name w:val="Strong1"/>
     <w:qFormat/>
     <w:rPr>
       <w:b/>
@@ -3084,12 +3599,10 @@
   </w:style>
   <w:style w:type="paragraph" w:styleId="ListParagraph">
     <w:name w:val="List Paragraph"/>
-    <w:basedOn w:val="Normal"/>
     <w:qFormat/>
   </w:style>
   <w:style w:type="character" w:styleId="Hyperlink">
     <w:name w:val="Hyperlink"/>
-    <w:basedOn w:val="DefaultParagraphFont"/>
     <w:uiPriority w:val="99"/>
     <w:unhideWhenUsed/>
     <w:rPr>
@@ -3099,7 +3612,6 @@
   </w:style>
   <w:style w:type="character" w:styleId="FootnoteReference">
     <w:name w:val="footnote reference"/>
-    <w:basedOn w:val="DefaultParagraphFont"/>
     <w:uiPriority w:val="99"/>
     <w:semiHidden/>
     <w:unhideWhenUsed/>
@@ -3109,22 +3621,17 @@
   </w:style>
   <w:style w:type="paragraph" w:styleId="FootnoteText">
     <w:name w:val="footnote text"/>
-    <w:basedOn w:val="Normal"/>
     <w:link w:val="FootnoteTextChar"/>
     <w:uiPriority w:val="99"/>
     <w:semiHidden/>
     <w:unhideWhenUsed/>
-    <w:pPr>
-      <w:spacing w:after="0" w:line="240" w:lineRule="auto"/>
-    </w:pPr>
     <w:rPr>
       <w:sz w:val="20"/>
       <w:szCs w:val="20"/>
     </w:rPr>
   </w:style>
-  <w:style w:type="character" w:styleId="FootnoteTextChar">
+  <w:style w:type="character" w:customStyle="1" w:styleId="FootnoteTextChar">
     <w:name w:val="Footnote Text Char"/>
-    <w:basedOn w:val="DefaultParagraphFont"/>
     <w:link w:val="FootnoteText"/>
     <w:uiPriority w:val="99"/>
     <w:semiHidden/>
@@ -3136,7 +3643,6 @@
   </w:style>
   <w:style w:type="character" w:styleId="EndnoteReference">
     <w:name w:val="endnote reference"/>
-    <w:basedOn w:val="DefaultParagraphFont"/>
     <w:uiPriority w:val="99"/>
     <w:semiHidden/>
     <w:unhideWhenUsed/>
@@ -3146,22 +3652,17 @@
   </w:style>
   <w:style w:type="paragraph" w:styleId="EndnoteText">
     <w:name w:val="endnote text"/>
-    <w:basedOn w:val="Normal"/>
     <w:link w:val="EndnoteTextChar"/>
     <w:uiPriority w:val="99"/>
     <w:semiHidden/>
     <w:unhideWhenUsed/>
-    <w:pPr>
-      <w:spacing w:after="0" w:line="240" w:lineRule="auto"/>
-    </w:pPr>
     <w:rPr>
       <w:sz w:val="20"/>
       <w:szCs w:val="20"/>
     </w:rPr>
   </w:style>
-  <w:style w:type="character" w:styleId="EndnoteTextChar">
+  <w:style w:type="character" w:customStyle="1" w:styleId="EndnoteTextChar">
     <w:name w:val="Endnote Text Char"/>
-    <w:basedOn w:val="DefaultParagraphFont"/>
     <w:link w:val="EndnoteText"/>
     <w:uiPriority w:val="99"/>
     <w:semiHidden/>
@@ -3172,4 +3673,319 @@
     </w:rPr>
   </w:style>
 </w:styles>
+</file>
+
+<file path=word/theme/theme1.xml><?xml version="1.0" encoding="utf-8"?>
+<a:theme xmlns:a="http://schemas.openxmlformats.org/drawingml/2006/main" name="Office Theme">
+  <a:themeElements>
+    <a:clrScheme name="Office">
+      <a:dk1>
+        <a:sysClr val="windowText" lastClr="000000"/>
+      </a:dk1>
+      <a:lt1>
+        <a:sysClr val="window" lastClr="FFFFFF"/>
+      </a:lt1>
+      <a:dk2>
+        <a:srgbClr val="0E2841"/>
+      </a:dk2>
+      <a:lt2>
+        <a:srgbClr val="E8E8E8"/>
+      </a:lt2>
+      <a:accent1>
+        <a:srgbClr val="156082"/>
+      </a:accent1>
+      <a:accent2>
+        <a:srgbClr val="E97132"/>
+      </a:accent2>
+      <a:accent3>
+        <a:srgbClr val="196B24"/>
+      </a:accent3>
+      <a:accent4>
+        <a:srgbClr val="0F9ED5"/>
+      </a:accent4>
+      <a:accent5>
+        <a:srgbClr val="A02B93"/>
+      </a:accent5>
+      <a:accent6>
+        <a:srgbClr val="4EA72E"/>
+      </a:accent6>
+      <a:hlink>
+        <a:srgbClr val="467886"/>
+      </a:hlink>
+      <a:folHlink>
+        <a:srgbClr val="96607D"/>
+      </a:folHlink>
+    </a:clrScheme>
+    <a:fontScheme name="Office">
+      <a:majorFont>
+        <a:latin typeface="Aptos Display" panose="02110004020202020204"/>
+        <a:ea typeface=""/>
+        <a:cs typeface=""/>
+        <a:font script="Jpan" typeface="游ゴシック Light"/>
+        <a:font script="Hang" typeface="맑은 고딕"/>
+        <a:font script="Hans" typeface="等线 Light"/>
+        <a:font script="Hant" typeface="新細明體"/>
+        <a:font script="Arab" typeface="Times New Roman"/>
+        <a:font script="Hebr" typeface="Times New Roman"/>
+        <a:font script="Thai" typeface="Angsana New"/>
+        <a:font script="Ethi" typeface="Nyala"/>
+        <a:font script="Beng" typeface="Vrinda"/>
+        <a:font script="Gujr" typeface="Shruti"/>
+        <a:font script="Khmr" typeface="MoolBoran"/>
+        <a:font script="Knda" typeface="Tunga"/>
+        <a:font script="Guru" typeface="Raavi"/>
+        <a:font script="Cans" typeface="Euphemia"/>
+        <a:font script="Cher" typeface="Plantagenet Cherokee"/>
+        <a:font script="Yiii" typeface="Microsoft Yi Baiti"/>
+        <a:font script="Tibt" typeface="Microsoft Himalaya"/>
+        <a:font script="Thaa" typeface="MV Boli"/>
+        <a:font script="Deva" typeface="Mangal"/>
+        <a:font script="Telu" typeface="Gautami"/>
+        <a:font script="Taml" typeface="Latha"/>
+        <a:font script="Syrc" typeface="Estrangelo Edessa"/>
+        <a:font script="Orya" typeface="Kalinga"/>
+        <a:font script="Mlym" typeface="Kartika"/>
+        <a:font script="Laoo" typeface="DokChampa"/>
+        <a:font script="Sinh" typeface="Iskoola Pota"/>
+        <a:font script="Mong" typeface="Mongolian Baiti"/>
+        <a:font script="Viet" typeface="Times New Roman"/>
+        <a:font script="Uigh" typeface="Microsoft Uighur"/>
+        <a:font script="Geor" typeface="Sylfaen"/>
+        <a:font script="Armn" typeface="Arial"/>
+        <a:font script="Bugi" typeface="Leelawadee UI"/>
+        <a:font script="Bopo" typeface="Microsoft JhengHei"/>
+        <a:font script="Java" typeface="Javanese Text"/>
+        <a:font script="Lisu" typeface="Segoe UI"/>
+        <a:font script="Mymr" typeface="Myanmar Text"/>
+        <a:font script="Nkoo" typeface="Ebrima"/>
+        <a:font script="Olck" typeface="Nirmala UI"/>
+        <a:font script="Osma" typeface="Ebrima"/>
+        <a:font script="Phag" typeface="Phagspa"/>
+        <a:font script="Syrn" typeface="Estrangelo Edessa"/>
+        <a:font script="Syrj" typeface="Estrangelo Edessa"/>
+        <a:font script="Syre" typeface="Estrangelo Edessa"/>
+        <a:font script="Sora" typeface="Nirmala UI"/>
+        <a:font script="Tale" typeface="Microsoft Tai Le"/>
+        <a:font script="Talu" typeface="Microsoft New Tai Lue"/>
+        <a:font script="Tfng" typeface="Ebrima"/>
+      </a:majorFont>
+      <a:minorFont>
+        <a:latin typeface="Aptos" panose="02110004020202020204"/>
+        <a:ea typeface=""/>
+        <a:cs typeface=""/>
+        <a:font script="Jpan" typeface="游明朝"/>
+        <a:font script="Hang" typeface="맑은 고딕"/>
+        <a:font script="Hans" typeface="等线"/>
+        <a:font script="Hant" typeface="新細明體"/>
+        <a:font script="Arab" typeface="Arial"/>
+        <a:font script="Hebr" typeface="Arial"/>
+        <a:font script="Thai" typeface="Cordia New"/>
+        <a:font script="Ethi" typeface="Nyala"/>
+        <a:font script="Beng" typeface="Vrinda"/>
+        <a:font script="Gujr" typeface="Shruti"/>
+        <a:font script="Khmr" typeface="DaunPenh"/>
+        <a:font script="Knda" typeface="Tunga"/>
+        <a:font script="Guru" typeface="Raavi"/>
+        <a:font script="Cans" typeface="Euphemia"/>
+        <a:font script="Cher" typeface="Plantagenet Cherokee"/>
+        <a:font script="Yiii" typeface="Microsoft Yi Baiti"/>
+        <a:font script="Tibt" typeface="Microsoft Himalaya"/>
+        <a:font script="Thaa" typeface="MV Boli"/>
+        <a:font script="Deva" typeface="Mangal"/>
+        <a:font script="Telu" typeface="Gautami"/>
+        <a:font script="Taml" typeface="Latha"/>
+        <a:font script="Syrc" typeface="Estrangelo Edessa"/>
+        <a:font script="Orya" typeface="Kalinga"/>
+        <a:font script="Mlym" typeface="Kartika"/>
+        <a:font script="Laoo" typeface="DokChampa"/>
+        <a:font script="Sinh" typeface="Iskoola Pota"/>
+        <a:font script="Mong" typeface="Mongolian Baiti"/>
+        <a:font script="Viet" typeface="Arial"/>
+        <a:font script="Uigh" typeface="Microsoft Uighur"/>
+        <a:font script="Geor" typeface="Sylfaen"/>
+        <a:font script="Armn" typeface="Arial"/>
+        <a:font script="Bugi" typeface="Leelawadee UI"/>
+        <a:font script="Bopo" typeface="Microsoft JhengHei"/>
+        <a:font script="Java" typeface="Javanese Text"/>
+        <a:font script="Lisu" typeface="Segoe UI"/>
+        <a:font script="Mymr" typeface="Myanmar Text"/>
+        <a:font script="Nkoo" typeface="Ebrima"/>
+        <a:font script="Olck" typeface="Nirmala UI"/>
+        <a:font script="Osma" typeface="Ebrima"/>
+        <a:font script="Phag" typeface="Phagspa"/>
+        <a:font script="Syrn" typeface="Estrangelo Edessa"/>
+        <a:font script="Syrj" typeface="Estrangelo Edessa"/>
+        <a:font script="Syre" typeface="Estrangelo Edessa"/>
+        <a:font script="Sora" typeface="Nirmala UI"/>
+        <a:font script="Tale" typeface="Microsoft Tai Le"/>
+        <a:font script="Talu" typeface="Microsoft New Tai Lue"/>
+        <a:font script="Tfng" typeface="Ebrima"/>
+      </a:minorFont>
+    </a:fontScheme>
+    <a:fmtScheme name="Office">
+      <a:fillStyleLst>
+        <a:solidFill>
+          <a:schemeClr val="phClr"/>
+        </a:solidFill>
+        <a:gradFill rotWithShape="1">
+          <a:gsLst>
+            <a:gs pos="0">
+              <a:schemeClr val="phClr">
+                <a:lumMod val="110000"/>
+                <a:satMod val="105000"/>
+                <a:tint val="67000"/>
+              </a:schemeClr>
+            </a:gs>
+            <a:gs pos="50000">
+              <a:schemeClr val="phClr">
+                <a:lumMod val="105000"/>
+                <a:satMod val="103000"/>
+                <a:tint val="73000"/>
+              </a:schemeClr>
+            </a:gs>
+            <a:gs pos="100000">
+              <a:schemeClr val="phClr">
+                <a:lumMod val="105000"/>
+                <a:satMod val="109000"/>
+                <a:tint val="81000"/>
+              </a:schemeClr>
+            </a:gs>
+          </a:gsLst>
+          <a:lin ang="5400000" scaled="0"/>
+        </a:gradFill>
+        <a:gradFill rotWithShape="1">
+          <a:gsLst>
+            <a:gs pos="0">
+              <a:schemeClr val="phClr">
+                <a:satMod val="103000"/>
+                <a:lumMod val="102000"/>
+                <a:tint val="94000"/>
+              </a:schemeClr>
+            </a:gs>
+            <a:gs pos="50000">
+              <a:schemeClr val="phClr">
+                <a:satMod val="110000"/>
+                <a:lumMod val="100000"/>
+                <a:shade val="100000"/>
+              </a:schemeClr>
+            </a:gs>
+            <a:gs pos="100000">
+              <a:schemeClr val="phClr">
+                <a:lumMod val="99000"/>
+                <a:satMod val="120000"/>
+                <a:shade val="78000"/>
+              </a:schemeClr>
+            </a:gs>
+          </a:gsLst>
+          <a:lin ang="5400000" scaled="0"/>
+        </a:gradFill>
+      </a:fillStyleLst>
+      <a:lnStyleLst>
+        <a:ln w="12700" cap="flat" cmpd="sng" algn="ctr">
+          <a:solidFill>
+            <a:schemeClr val="phClr"/>
+          </a:solidFill>
+          <a:prstDash val="solid"/>
+          <a:miter lim="800000"/>
+        </a:ln>
+        <a:ln w="19050" cap="flat" cmpd="sng" algn="ctr">
+          <a:solidFill>
+            <a:schemeClr val="phClr"/>
+          </a:solidFill>
+          <a:prstDash val="solid"/>
+          <a:miter lim="800000"/>
+        </a:ln>
+        <a:ln w="25400" cap="flat" cmpd="sng" algn="ctr">
+          <a:solidFill>
+            <a:schemeClr val="phClr"/>
+          </a:solidFill>
+          <a:prstDash val="solid"/>
+          <a:miter lim="800000"/>
+        </a:ln>
+      </a:lnStyleLst>
+      <a:effectStyleLst>
+        <a:effectStyle>
+          <a:effectLst/>
+        </a:effectStyle>
+        <a:effectStyle>
+          <a:effectLst/>
+        </a:effectStyle>
+        <a:effectStyle>
+          <a:effectLst>
+            <a:outerShdw blurRad="57150" dist="19050" dir="5400000" algn="ctr" rotWithShape="0">
+              <a:srgbClr val="000000">
+                <a:alpha val="63000"/>
+              </a:srgbClr>
+            </a:outerShdw>
+          </a:effectLst>
+        </a:effectStyle>
+      </a:effectStyleLst>
+      <a:bgFillStyleLst>
+        <a:solidFill>
+          <a:schemeClr val="phClr"/>
+        </a:solidFill>
+        <a:solidFill>
+          <a:schemeClr val="phClr">
+            <a:tint val="95000"/>
+            <a:satMod val="170000"/>
+          </a:schemeClr>
+        </a:solidFill>
+        <a:gradFill rotWithShape="1">
+          <a:gsLst>
+            <a:gs pos="0">
+              <a:schemeClr val="phClr">
+                <a:tint val="93000"/>
+                <a:satMod val="150000"/>
+                <a:shade val="98000"/>
+                <a:lumMod val="102000"/>
+              </a:schemeClr>
+            </a:gs>
+            <a:gs pos="50000">
+              <a:schemeClr val="phClr">
+                <a:tint val="98000"/>
+                <a:satMod val="130000"/>
+                <a:shade val="90000"/>
+                <a:lumMod val="103000"/>
+              </a:schemeClr>
+            </a:gs>
+            <a:gs pos="100000">
+              <a:schemeClr val="phClr">
+                <a:shade val="63000"/>
+                <a:satMod val="120000"/>
+              </a:schemeClr>
+            </a:gs>
+          </a:gsLst>
+          <a:lin ang="5400000" scaled="0"/>
+        </a:gradFill>
+      </a:bgFillStyleLst>
+    </a:fmtScheme>
+  </a:themeElements>
+  <a:objectDefaults>
+    <a:lnDef>
+      <a:spPr/>
+      <a:bodyPr/>
+      <a:lstStyle/>
+      <a:style>
+        <a:lnRef idx="2">
+          <a:schemeClr val="accent1"/>
+        </a:lnRef>
+        <a:fillRef idx="0">
+          <a:schemeClr val="accent1"/>
+        </a:fillRef>
+        <a:effectRef idx="1">
+          <a:schemeClr val="accent1"/>
+        </a:effectRef>
+        <a:fontRef idx="minor">
+          <a:schemeClr val="tx1"/>
+        </a:fontRef>
+      </a:style>
+    </a:lnDef>
+  </a:objectDefaults>
+  <a:extraClrSchemeLst/>
+  <a:extLst>
+    <a:ext uri="{05A4C25C-085E-4340-85A3-A5531E510DB2}">
+      <thm15:themeFamily xmlns:thm15="http://schemas.microsoft.com/office/thememl/2012/main" name="Office Theme" id="{2E142A2C-CD16-42D6-873A-C26D2A0506FA}" vid="{1BDDFF52-6CD6-40A5-AB3C-68EB2F1E4D0A}"/>
+    </a:ext>
+  </a:extLst>
+</a:theme>
 </file>
</xml_diff>